<commit_message>
Updated notebook and Report
</commit_message>
<xml_diff>
--- a/ProjectReport.docx
+++ b/ProjectReport.docx
@@ -97,7 +97,7 @@
             </w:rPr>
             <w:fldChar w:fldCharType="separate"/>
           </w:r>
-          <w:hyperlink w:anchor="_Toc242021081" w:history="1">
+          <w:hyperlink w:anchor="_Toc242025019" w:history="1">
             <w:r>
               <w:rPr>
                 <w:rStyle w:val="Hyperlink"/>
@@ -125,7 +125,7 @@
                 <w:noProof/>
                 <w:webHidden/>
               </w:rPr>
-              <w:instrText xml:space="preserve"> PAGEREF _Toc242021081 \h </w:instrText>
+              <w:instrText xml:space="preserve"> PAGEREF _Toc242025019 \h </w:instrText>
             </w:r>
             <w:r>
               <w:rPr>
@@ -172,7 +172,7 @@
               <w:lang w:eastAsia="en-GB"/>
             </w:rPr>
           </w:pPr>
-          <w:hyperlink w:anchor="_Toc242021082" w:history="1">
+          <w:hyperlink w:anchor="_Toc242025020" w:history="1">
             <w:r>
               <w:rPr>
                 <w:rStyle w:val="Hyperlink"/>
@@ -200,7 +200,7 @@
                 <w:noProof/>
                 <w:webHidden/>
               </w:rPr>
-              <w:instrText xml:space="preserve"> PAGEREF _Toc242021082 \h </w:instrText>
+              <w:instrText xml:space="preserve"> PAGEREF _Toc242025020 \h </w:instrText>
             </w:r>
             <w:r>
               <w:rPr>
@@ -247,14 +247,22 @@
               <w:lang w:eastAsia="en-GB"/>
             </w:rPr>
           </w:pPr>
-          <w:hyperlink w:anchor="_Toc242021083" w:history="1">
+          <w:hyperlink w:anchor="_Toc242025021" w:history="1">
             <w:r>
               <w:rPr>
                 <w:rStyle w:val="Hyperlink"/>
                 <w:noProof/>
                 <w:lang w:val="en-US"/>
               </w:rPr>
-              <w:t>1. Raw Data Storage</w:t>
+              <w:t>1. Raw Data Storag</w:t>
+            </w:r>
+            <w:r>
+              <w:rPr>
+                <w:rStyle w:val="Hyperlink"/>
+                <w:noProof/>
+                <w:lang w:val="en-US"/>
+              </w:rPr>
+              <w:t>e</w:t>
             </w:r>
             <w:r>
               <w:rPr>
@@ -275,7 +283,7 @@
                 <w:noProof/>
                 <w:webHidden/>
               </w:rPr>
-              <w:instrText xml:space="preserve"> PAGEREF _Toc242021083 \h </w:instrText>
+              <w:instrText xml:space="preserve"> PAGEREF _Toc242025021 \h </w:instrText>
             </w:r>
             <w:r>
               <w:rPr>
@@ -322,7 +330,7 @@
               <w:lang w:eastAsia="en-GB"/>
             </w:rPr>
           </w:pPr>
-          <w:hyperlink w:anchor="_Toc242021084" w:history="1">
+          <w:hyperlink w:anchor="_Toc242025022" w:history="1">
             <w:r>
               <w:rPr>
                 <w:rStyle w:val="Hyperlink"/>
@@ -349,7 +357,7 @@
                 <w:noProof/>
                 <w:webHidden/>
               </w:rPr>
-              <w:instrText xml:space="preserve"> PAGEREF _Toc242021084 \h </w:instrText>
+              <w:instrText xml:space="preserve"> PAGEREF _Toc242025022 \h </w:instrText>
             </w:r>
             <w:r>
               <w:rPr>
@@ -396,14 +404,14 @@
               <w:lang w:eastAsia="en-GB"/>
             </w:rPr>
           </w:pPr>
-          <w:hyperlink w:anchor="_Toc242021085" w:history="1">
+          <w:hyperlink w:anchor="_Toc242025023" w:history="1">
             <w:r>
               <w:rPr>
                 <w:rStyle w:val="Hyperlink"/>
                 <w:noProof/>
                 <w:lang w:val="en-US"/>
               </w:rPr>
-              <w:t>Reproducibility</w:t>
+              <w:t>Raw Data Storage Reproducibility</w:t>
             </w:r>
             <w:r>
               <w:rPr>
@@ -424,7 +432,7 @@
                 <w:noProof/>
                 <w:webHidden/>
               </w:rPr>
-              <w:instrText xml:space="preserve"> PAGEREF _Toc242021085 \h </w:instrText>
+              <w:instrText xml:space="preserve"> PAGEREF _Toc242025023 \h </w:instrText>
             </w:r>
             <w:r>
               <w:rPr>
@@ -471,7 +479,7 @@
               <w:lang w:eastAsia="en-GB"/>
             </w:rPr>
           </w:pPr>
-          <w:hyperlink w:anchor="_Toc242021086" w:history="1">
+          <w:hyperlink w:anchor="_Toc242025024" w:history="1">
             <w:r>
               <w:rPr>
                 <w:rStyle w:val="Hyperlink"/>
@@ -499,7 +507,7 @@
                 <w:noProof/>
                 <w:webHidden/>
               </w:rPr>
-              <w:instrText xml:space="preserve"> PAGEREF _Toc242021086 \h </w:instrText>
+              <w:instrText xml:space="preserve"> PAGEREF _Toc242025024 \h </w:instrText>
             </w:r>
             <w:r>
               <w:rPr>
@@ -546,7 +554,7 @@
               <w:lang w:eastAsia="en-GB"/>
             </w:rPr>
           </w:pPr>
-          <w:hyperlink w:anchor="_Toc242021087" w:history="1">
+          <w:hyperlink w:anchor="_Toc242025025" w:history="1">
             <w:r>
               <w:rPr>
                 <w:rStyle w:val="Hyperlink"/>
@@ -574,7 +582,7 @@
                 <w:noProof/>
                 <w:webHidden/>
               </w:rPr>
-              <w:instrText xml:space="preserve"> PAGEREF _Toc242021087 \h </w:instrText>
+              <w:instrText xml:space="preserve"> PAGEREF _Toc242025025 \h </w:instrText>
             </w:r>
             <w:r>
               <w:rPr>
@@ -621,7 +629,7 @@
               <w:lang w:eastAsia="en-GB"/>
             </w:rPr>
           </w:pPr>
-          <w:hyperlink w:anchor="_Toc242021088" w:history="1">
+          <w:hyperlink w:anchor="_Toc242025026" w:history="1">
             <w:r>
               <w:rPr>
                 <w:rStyle w:val="Hyperlink"/>
@@ -649,7 +657,7 @@
                 <w:noProof/>
                 <w:webHidden/>
               </w:rPr>
-              <w:instrText xml:space="preserve"> PAGEREF _Toc242021088 \h </w:instrText>
+              <w:instrText xml:space="preserve"> PAGEREF _Toc242025026 \h </w:instrText>
             </w:r>
             <w:r>
               <w:rPr>
@@ -696,7 +704,7 @@
               <w:lang w:eastAsia="en-GB"/>
             </w:rPr>
           </w:pPr>
-          <w:hyperlink w:anchor="_Toc242021089" w:history="1">
+          <w:hyperlink w:anchor="_Toc242025027" w:history="1">
             <w:r>
               <w:rPr>
                 <w:rStyle w:val="Hyperlink"/>
@@ -724,7 +732,7 @@
                 <w:noProof/>
                 <w:webHidden/>
               </w:rPr>
-              <w:instrText xml:space="preserve"> PAGEREF _Toc242021089 \h </w:instrText>
+              <w:instrText xml:space="preserve"> PAGEREF _Toc242025027 \h </w:instrText>
             </w:r>
             <w:r>
               <w:rPr>
@@ -771,14 +779,30 @@
               <w:lang w:eastAsia="en-GB"/>
             </w:rPr>
           </w:pPr>
-          <w:hyperlink w:anchor="_Toc242021090" w:history="1">
+          <w:hyperlink w:anchor="_Toc242025028" w:history="1">
             <w:r>
               <w:rPr>
                 <w:rStyle w:val="Hyperlink"/>
                 <w:noProof/>
                 <w:lang w:val="en-US"/>
               </w:rPr>
-              <w:t>6. Data Split / Validation Strategy</w:t>
+              <w:t>6. Data Split / Validation Strate</w:t>
+            </w:r>
+            <w:r>
+              <w:rPr>
+                <w:rStyle w:val="Hyperlink"/>
+                <w:noProof/>
+                <w:lang w:val="en-US"/>
+              </w:rPr>
+              <w:t>g</w:t>
+            </w:r>
+            <w:r>
+              <w:rPr>
+                <w:rStyle w:val="Hyperlink"/>
+                <w:noProof/>
+                <w:lang w:val="en-US"/>
+              </w:rPr>
+              <w:t>y</w:t>
             </w:r>
             <w:r>
               <w:rPr>
@@ -799,7 +823,7 @@
                 <w:noProof/>
                 <w:webHidden/>
               </w:rPr>
-              <w:instrText xml:space="preserve"> PAGEREF _Toc242021090 \h </w:instrText>
+              <w:instrText xml:space="preserve"> PAGEREF _Toc242025028 \h </w:instrText>
             </w:r>
             <w:r>
               <w:rPr>
@@ -846,7 +870,7 @@
               <w:lang w:eastAsia="en-GB"/>
             </w:rPr>
           </w:pPr>
-          <w:hyperlink w:anchor="_Toc242021091" w:history="1">
+          <w:hyperlink w:anchor="_Toc242025029" w:history="1">
             <w:r>
               <w:rPr>
                 <w:rStyle w:val="Hyperlink"/>
@@ -874,7 +898,7 @@
                 <w:noProof/>
                 <w:webHidden/>
               </w:rPr>
-              <w:instrText xml:space="preserve"> PAGEREF _Toc242021091 \h </w:instrText>
+              <w:instrText xml:space="preserve"> PAGEREF _Toc242025029 \h </w:instrText>
             </w:r>
             <w:r>
               <w:rPr>
@@ -921,7 +945,7 @@
               <w:lang w:eastAsia="en-GB"/>
             </w:rPr>
           </w:pPr>
-          <w:hyperlink w:anchor="_Toc242021092" w:history="1">
+          <w:hyperlink w:anchor="_Toc242025030" w:history="1">
             <w:r>
               <w:rPr>
                 <w:rStyle w:val="Hyperlink"/>
@@ -949,7 +973,7 @@
                 <w:noProof/>
                 <w:webHidden/>
               </w:rPr>
-              <w:instrText xml:space="preserve"> PAGEREF _Toc242021092 \h </w:instrText>
+              <w:instrText xml:space="preserve"> PAGEREF _Toc242025030 \h </w:instrText>
             </w:r>
             <w:r>
               <w:rPr>
@@ -996,7 +1020,7 @@
               <w:lang w:eastAsia="en-GB"/>
             </w:rPr>
           </w:pPr>
-          <w:hyperlink w:anchor="_Toc242021093" w:history="1">
+          <w:hyperlink w:anchor="_Toc242025031" w:history="1">
             <w:r>
               <w:rPr>
                 <w:rStyle w:val="Hyperlink"/>
@@ -1024,7 +1048,7 @@
                 <w:noProof/>
                 <w:webHidden/>
               </w:rPr>
-              <w:instrText xml:space="preserve"> PAGEREF _Toc242021093 \h </w:instrText>
+              <w:instrText xml:space="preserve"> PAGEREF _Toc242025031 \h </w:instrText>
             </w:r>
             <w:r>
               <w:rPr>
@@ -1044,14 +1068,7 @@
                 <w:noProof/>
                 <w:webHidden/>
               </w:rPr>
-              <w:t>1</w:t>
-            </w:r>
-            <w:r>
-              <w:rPr>
-                <w:noProof/>
-                <w:webHidden/>
-              </w:rPr>
-              <w:t>2</w:t>
+              <w:t>12</w:t>
             </w:r>
             <w:r>
               <w:rPr>
@@ -1078,7 +1095,7 @@
               <w:lang w:eastAsia="en-GB"/>
             </w:rPr>
           </w:pPr>
-          <w:hyperlink w:anchor="_Toc242021094" w:history="1">
+          <w:hyperlink w:anchor="_Toc242025032" w:history="1">
             <w:r>
               <w:rPr>
                 <w:rStyle w:val="Hyperlink"/>
@@ -1105,7 +1122,7 @@
                 <w:noProof/>
                 <w:webHidden/>
               </w:rPr>
-              <w:instrText xml:space="preserve"> PAGEREF _Toc242021094 \h </w:instrText>
+              <w:instrText xml:space="preserve"> PAGEREF _Toc242025032 \h </w:instrText>
             </w:r>
             <w:r>
               <w:rPr>
@@ -1126,6 +1143,155 @@
                 <w:webHidden/>
               </w:rPr>
               <w:t>13</w:t>
+            </w:r>
+            <w:r>
+              <w:rPr>
+                <w:noProof/>
+                <w:webHidden/>
+              </w:rPr>
+              <w:fldChar w:fldCharType="end"/>
+            </w:r>
+          </w:hyperlink>
+        </w:p>
+        <w:p>
+          <w:pPr>
+            <w:pStyle w:val="TOC2"/>
+            <w:tabs>
+              <w:tab w:val="right" w:leader="dot" w:pos="9016"/>
+            </w:tabs>
+            <w:rPr>
+              <w:rFonts w:eastAsiaTheme="minorEastAsia"/>
+              <w:b w:val="0"/>
+              <w:bCs w:val="0"/>
+              <w:noProof/>
+              <w:sz w:val="24"/>
+              <w:szCs w:val="24"/>
+              <w:lang w:eastAsia="en-GB"/>
+            </w:rPr>
+          </w:pPr>
+          <w:hyperlink w:anchor="_Toc242025033" w:history="1">
+            <w:r>
+              <w:rPr>
+                <w:rStyle w:val="Hyperlink"/>
+                <w:noProof/>
+              </w:rPr>
+              <w:t>Identifying Groups/Statas for Sampling</w:t>
+            </w:r>
+            <w:r>
+              <w:rPr>
+                <w:noProof/>
+                <w:webHidden/>
+              </w:rPr>
+              <w:tab/>
+            </w:r>
+            <w:r>
+              <w:rPr>
+                <w:noProof/>
+                <w:webHidden/>
+              </w:rPr>
+              <w:fldChar w:fldCharType="begin"/>
+            </w:r>
+            <w:r>
+              <w:rPr>
+                <w:noProof/>
+                <w:webHidden/>
+              </w:rPr>
+              <w:instrText xml:space="preserve"> PAGEREF _Toc242025033 \h </w:instrText>
+            </w:r>
+            <w:r>
+              <w:rPr>
+                <w:noProof/>
+                <w:webHidden/>
+              </w:rPr>
+            </w:r>
+            <w:r>
+              <w:rPr>
+                <w:noProof/>
+                <w:webHidden/>
+              </w:rPr>
+              <w:fldChar w:fldCharType="separate"/>
+            </w:r>
+            <w:r>
+              <w:rPr>
+                <w:noProof/>
+                <w:webHidden/>
+              </w:rPr>
+              <w:t>14</w:t>
+            </w:r>
+            <w:r>
+              <w:rPr>
+                <w:noProof/>
+                <w:webHidden/>
+              </w:rPr>
+              <w:fldChar w:fldCharType="end"/>
+            </w:r>
+          </w:hyperlink>
+        </w:p>
+        <w:p>
+          <w:pPr>
+            <w:pStyle w:val="TOC2"/>
+            <w:tabs>
+              <w:tab w:val="right" w:leader="dot" w:pos="9016"/>
+            </w:tabs>
+            <w:rPr>
+              <w:rFonts w:eastAsiaTheme="minorEastAsia"/>
+              <w:b w:val="0"/>
+              <w:bCs w:val="0"/>
+              <w:noProof/>
+              <w:sz w:val="24"/>
+              <w:szCs w:val="24"/>
+              <w:lang w:eastAsia="en-GB"/>
+            </w:rPr>
+          </w:pPr>
+          <w:hyperlink w:anchor="_Toc242025034" w:history="1">
+            <w:r>
+              <w:rPr>
+                <w:rStyle w:val="Hyperlink"/>
+                <w:noProof/>
+                <w:lang w:val="en-US"/>
+              </w:rPr>
+              <w:t>Pre-Processing – Analysis and Sample set creation</w:t>
+            </w:r>
+            <w:r>
+              <w:rPr>
+                <w:noProof/>
+                <w:webHidden/>
+              </w:rPr>
+              <w:tab/>
+            </w:r>
+            <w:r>
+              <w:rPr>
+                <w:noProof/>
+                <w:webHidden/>
+              </w:rPr>
+              <w:fldChar w:fldCharType="begin"/>
+            </w:r>
+            <w:r>
+              <w:rPr>
+                <w:noProof/>
+                <w:webHidden/>
+              </w:rPr>
+              <w:instrText xml:space="preserve"> PAGEREF _Toc242025034 \h </w:instrText>
+            </w:r>
+            <w:r>
+              <w:rPr>
+                <w:noProof/>
+                <w:webHidden/>
+              </w:rPr>
+            </w:r>
+            <w:r>
+              <w:rPr>
+                <w:noProof/>
+                <w:webHidden/>
+              </w:rPr>
+              <w:fldChar w:fldCharType="separate"/>
+            </w:r>
+            <w:r>
+              <w:rPr>
+                <w:noProof/>
+                <w:webHidden/>
+              </w:rPr>
+              <w:t>15</w:t>
             </w:r>
             <w:r>
               <w:rPr>
@@ -1180,7 +1346,7 @@
           <w:lang w:val="en-US"/>
         </w:rPr>
       </w:pPr>
-      <w:bookmarkStart w:id="0" w:name="_Toc242021081"/>
+      <w:bookmarkStart w:id="0" w:name="_Toc242025019"/>
       <w:r>
         <w:rPr>
           <w:rFonts w:asciiTheme="minorHAnsi" w:hAnsiTheme="minorHAnsi"/>
@@ -1272,21 +1438,7 @@
         <w:rPr>
           <w:rFonts w:asciiTheme="minorHAnsi" w:hAnsiTheme="minorHAnsi"/>
         </w:rPr>
-        <w:t xml:space="preserve">list data published by </w:t>
-      </w:r>
-      <w:proofErr w:type="spellStart"/>
-      <w:r>
-        <w:rPr>
-          <w:rFonts w:asciiTheme="minorHAnsi" w:hAnsiTheme="minorHAnsi"/>
-        </w:rPr>
-        <w:t>Eurocontrol</w:t>
-      </w:r>
-      <w:proofErr w:type="spellEnd"/>
-      <w:r>
-        <w:rPr>
-          <w:rFonts w:asciiTheme="minorHAnsi" w:hAnsiTheme="minorHAnsi"/>
-        </w:rPr>
-        <w:t>.</w:t>
+        <w:t>list data published by Eurocontrol.</w:t>
       </w:r>
     </w:p>
     <w:p>
@@ -1401,39 +1553,21 @@
           <w:rFonts w:asciiTheme="minorHAnsi" w:eastAsia="Consolas" w:hAnsiTheme="minorHAnsi"/>
           <w:sz w:val="17"/>
         </w:rPr>
-        <w:t xml:space="preserve">  </w:t>
-      </w:r>
-      <w:proofErr w:type="spellStart"/>
+        <w:t xml:space="preserve">  url    = {https://huggingface.co/datasets/345rf4gt56t4r3e3/flight-delays-europe-2023-2025}</w:t>
+      </w:r>
+      <w:r>
+        <w:rPr>
+          <w:rFonts w:asciiTheme="minorHAnsi" w:eastAsia="Consolas" w:hAnsiTheme="minorHAnsi"/>
+          <w:sz w:val="17"/>
+        </w:rPr>
+        <w:br/>
+      </w:r>
       <w:r>
         <w:rPr>
           <w:rStyle w:val="CommentTok"/>
           <w:rFonts w:asciiTheme="minorHAnsi" w:eastAsia="Consolas" w:hAnsiTheme="minorHAnsi"/>
           <w:sz w:val="17"/>
         </w:rPr>
-        <w:t>url</w:t>
-      </w:r>
-      <w:proofErr w:type="spellEnd"/>
-      <w:r>
-        <w:rPr>
-          <w:rStyle w:val="CommentTok"/>
-          <w:rFonts w:asciiTheme="minorHAnsi" w:eastAsia="Consolas" w:hAnsiTheme="minorHAnsi"/>
-          <w:sz w:val="17"/>
-        </w:rPr>
-        <w:t xml:space="preserve">    = {https://huggingface.co/datasets/345rf4gt56t4r3e3/flight-delays-europe-2023-2025}</w:t>
-      </w:r>
-      <w:r>
-        <w:rPr>
-          <w:rFonts w:asciiTheme="minorHAnsi" w:eastAsia="Consolas" w:hAnsiTheme="minorHAnsi"/>
-          <w:sz w:val="17"/>
-        </w:rPr>
-        <w:br/>
-      </w:r>
-      <w:r>
-        <w:rPr>
-          <w:rStyle w:val="CommentTok"/>
-          <w:rFonts w:asciiTheme="minorHAnsi" w:eastAsia="Consolas" w:hAnsiTheme="minorHAnsi"/>
-          <w:sz w:val="17"/>
-        </w:rPr>
         <w:t>}</w:t>
       </w:r>
     </w:p>
@@ -1445,7 +1579,7 @@
           <w:lang w:val="en-US"/>
         </w:rPr>
       </w:pPr>
-      <w:bookmarkStart w:id="1" w:name="_Toc242021082"/>
+      <w:bookmarkStart w:id="1" w:name="_Toc242025020"/>
       <w:r>
         <w:rPr>
           <w:rFonts w:asciiTheme="minorHAnsi" w:hAnsiTheme="minorHAnsi"/>
@@ -1643,7 +1777,6 @@
                 <w:lang w:val="en-US"/>
               </w:rPr>
             </w:pPr>
-            <w:proofErr w:type="spellStart"/>
             <w:r>
               <w:rPr>
                 <w:b/>
@@ -1651,9 +1784,8 @@
                 <w:color w:val="156082" w:themeColor="accent1"/>
                 <w:lang w:val="en-US"/>
               </w:rPr>
-              <w:t>Github</w:t>
-            </w:r>
-            <w:proofErr w:type="spellEnd"/>
+              <w:t>Git</w:t>
+            </w:r>
             <w:r>
               <w:rPr>
                 <w:b/>
@@ -1661,7 +1793,16 @@
                 <w:color w:val="156082" w:themeColor="accent1"/>
                 <w:lang w:val="en-US"/>
               </w:rPr>
-              <w:t xml:space="preserve"> Repo</w:t>
+              <w:t>H</w:t>
+            </w:r>
+            <w:r>
+              <w:rPr>
+                <w:b/>
+                <w:bCs/>
+                <w:color w:val="156082" w:themeColor="accent1"/>
+                <w:lang w:val="en-US"/>
+              </w:rPr>
+              <w:t>ub Repo</w:t>
             </w:r>
           </w:p>
         </w:tc>
@@ -1810,7 +1951,7 @@
           <w:lang w:val="en-US"/>
         </w:rPr>
       </w:pPr>
-      <w:bookmarkStart w:id="2" w:name="_Toc242021083"/>
+      <w:bookmarkStart w:id="2" w:name="_Toc242025021"/>
       <w:r>
         <w:rPr>
           <w:rFonts w:asciiTheme="minorHAnsi" w:hAnsiTheme="minorHAnsi"/>
@@ -1834,7 +1975,15 @@
           <w:i/>
           <w:color w:val="7F6000"/>
         </w:rPr>
-        <w:t>TODO - Clearly states where the raw data will live, including the storage system/location and why it is appropriate.</w:t>
+        <w:t>Goal</w:t>
+      </w:r>
+      <w:r>
+        <w:rPr>
+          <w:rFonts w:asciiTheme="minorHAnsi" w:hAnsiTheme="minorHAnsi"/>
+          <w:i/>
+          <w:color w:val="7F6000"/>
+        </w:rPr>
+        <w:t xml:space="preserve"> - Clearly states where the raw data will live, including the storage system/location and why it is appropriate.</w:t>
       </w:r>
     </w:p>
     <w:p>
@@ -1948,35 +2097,19 @@
         <w:rPr>
           <w:rFonts w:asciiTheme="minorHAnsi" w:hAnsiTheme="minorHAnsi"/>
         </w:rPr>
-        <w:t xml:space="preserve">Google Cloud Storage is appropriate for the raw dataset because it is a large file based dataset rather than a transactional database and we want the raw data to be retained, accessed, downloaded and processed by notebooks and machine learning flows rather than updated row by row. I also choose this storage option as it supports reproducibility and collaboration and can be easily accessed from Google </w:t>
-      </w:r>
-      <w:proofErr w:type="spellStart"/>
-      <w:r>
-        <w:rPr>
-          <w:rFonts w:asciiTheme="minorHAnsi" w:hAnsiTheme="minorHAnsi"/>
-        </w:rPr>
-        <w:t>Colab</w:t>
-      </w:r>
-      <w:proofErr w:type="spellEnd"/>
-      <w:r>
-        <w:rPr>
-          <w:rFonts w:asciiTheme="minorHAnsi" w:hAnsiTheme="minorHAnsi"/>
-        </w:rPr>
-        <w:t xml:space="preserve">, </w:t>
-      </w:r>
-      <w:proofErr w:type="spellStart"/>
-      <w:r>
-        <w:rPr>
-          <w:rFonts w:asciiTheme="minorHAnsi" w:hAnsiTheme="minorHAnsi"/>
-        </w:rPr>
-        <w:t>Jupyter</w:t>
-      </w:r>
-      <w:proofErr w:type="spellEnd"/>
-      <w:r>
-        <w:rPr>
-          <w:rFonts w:asciiTheme="minorHAnsi" w:hAnsiTheme="minorHAnsi"/>
-        </w:rPr>
-        <w:t xml:space="preserve"> notebooks and other Google Cloud services if needed. This makes it easier for the project workflow to be reproduced for review and potential future reuse.</w:t>
+        <w:t xml:space="preserve">Google Cloud Storage is appropriate for the raw dataset because it is a large file based dataset rather than a transactional database and we want the raw data to be retained, accessed, downloaded and processed by notebooks and machine learning </w:t>
+      </w:r>
+      <w:r>
+        <w:rPr>
+          <w:rFonts w:asciiTheme="minorHAnsi" w:hAnsiTheme="minorHAnsi"/>
+        </w:rPr>
+        <w:t>work</w:t>
+      </w:r>
+      <w:r>
+        <w:rPr>
+          <w:rFonts w:asciiTheme="minorHAnsi" w:hAnsiTheme="minorHAnsi"/>
+        </w:rPr>
+        <w:t>flows rather than updated row by row. I also choose this storage option as it supports reproducibility and collaboration and can be easily accessed from Google Colab, Jupyter notebooks and other Google Cloud services if needed. This makes it easier for the project workflow to be reproduced for review and potential future reuse.</w:t>
       </w:r>
     </w:p>
     <w:p>
@@ -2040,7 +2173,7 @@
           <w:rFonts w:asciiTheme="minorHAnsi" w:hAnsiTheme="minorHAnsi"/>
         </w:rPr>
       </w:pPr>
-      <w:bookmarkStart w:id="3" w:name="_Toc242021084"/>
+      <w:bookmarkStart w:id="3" w:name="_Toc242025022"/>
       <w:r>
         <w:rPr>
           <w:rFonts w:asciiTheme="minorHAnsi" w:hAnsiTheme="minorHAnsi"/>
@@ -2108,19 +2241,11 @@
                 <w:rFonts w:asciiTheme="minorHAnsi" w:hAnsiTheme="minorHAnsi"/>
               </w:rPr>
             </w:pPr>
-            <w:proofErr w:type="spellStart"/>
-            <w:r>
-              <w:rPr>
-                <w:rFonts w:asciiTheme="minorHAnsi" w:hAnsiTheme="minorHAnsi"/>
-              </w:rPr>
-              <w:t>european</w:t>
-            </w:r>
-            <w:proofErr w:type="spellEnd"/>
-            <w:r>
-              <w:rPr>
-                <w:rFonts w:asciiTheme="minorHAnsi" w:hAnsiTheme="minorHAnsi"/>
-              </w:rPr>
-              <w:t>-flight-delay-prediction/</w:t>
+            <w:r>
+              <w:rPr>
+                <w:rFonts w:asciiTheme="minorHAnsi" w:hAnsiTheme="minorHAnsi"/>
+              </w:rPr>
+              <w:t>european-flight-delay-prediction/</w:t>
             </w:r>
           </w:p>
           <w:p>
@@ -2234,21 +2359,7 @@
         <w:rPr>
           <w:rFonts w:asciiTheme="minorHAnsi" w:hAnsiTheme="minorHAnsi"/>
         </w:rPr>
-        <w:t xml:space="preserve">To support peer and lecturer review, the bucket has been configured with public read-only access. This allows reviewers to view and download the data, while preventing them from modifying or deleting any objects. This was done by granting the </w:t>
-      </w:r>
-      <w:proofErr w:type="spellStart"/>
-      <w:r>
-        <w:rPr>
-          <w:rFonts w:asciiTheme="minorHAnsi" w:hAnsiTheme="minorHAnsi"/>
-        </w:rPr>
-        <w:t>allUsers</w:t>
-      </w:r>
-      <w:proofErr w:type="spellEnd"/>
-      <w:r>
-        <w:rPr>
-          <w:rFonts w:asciiTheme="minorHAnsi" w:hAnsiTheme="minorHAnsi"/>
-        </w:rPr>
-        <w:t xml:space="preserve"> principal the following role - Cloud Storage → Storage Object Viewer</w:t>
+        <w:t>To support peer and lecturer review, the bucket has been configured with public read-only access. This allows reviewers to view and download the data, while preventing them from modifying or deleting any objects. This was done by granting the allUsers principal the following role - Cloud Storage → Storage Object Viewer</w:t>
       </w:r>
     </w:p>
     <w:p>
@@ -2266,11 +2377,10 @@
           <w:noProof/>
           <w14:ligatures w14:val="standardContextual"/>
         </w:rPr>
-        <w:lastRenderedPageBreak/>
         <w:drawing>
-          <wp:inline distT="0" distB="0" distL="0" distR="0" wp14:anchorId="7CA69B00" wp14:editId="5747CB3F">
-            <wp:extent cx="5731510" cy="3311525"/>
-            <wp:effectExtent l="0" t="0" r="0" b="3175"/>
+          <wp:inline distT="0" distB="0" distL="0" distR="0" wp14:anchorId="7CA69B00" wp14:editId="37FED647">
+            <wp:extent cx="4317577" cy="2494589"/>
+            <wp:effectExtent l="0" t="0" r="635" b="0"/>
             <wp:docPr id="1852391289" name="Picture 1" descr="A screenshot of a computer&#10;&#10;Description automatically generated"/>
             <wp:cNvGraphicFramePr>
               <a:graphicFrameLocks xmlns:a="http://schemas.openxmlformats.org/drawingml/2006/main" noChangeAspect="1"/>
@@ -2297,7 +2407,7 @@
                   <pic:spPr>
                     <a:xfrm>
                       <a:off x="0" y="0"/>
-                      <a:ext cx="5731510" cy="3311525"/>
+                      <a:ext cx="4326795" cy="2499915"/>
                     </a:xfrm>
                     <a:prstGeom prst="rect">
                       <a:avLst/>
@@ -2325,12 +2435,13 @@
           <w:lang w:val="en-US"/>
         </w:rPr>
       </w:pPr>
-      <w:bookmarkStart w:id="4" w:name="_Toc242021085"/>
+      <w:bookmarkStart w:id="4" w:name="_Toc242025023"/>
       <w:r>
         <w:rPr>
           <w:rFonts w:asciiTheme="minorHAnsi" w:hAnsiTheme="minorHAnsi"/>
           <w:lang w:val="en-US"/>
         </w:rPr>
+        <w:lastRenderedPageBreak/>
         <w:t xml:space="preserve">Raw Data Storage </w:t>
       </w:r>
       <w:r>
@@ -2353,41 +2464,25 @@
         <w:rPr>
           <w:rFonts w:asciiTheme="minorHAnsi" w:hAnsiTheme="minorHAnsi"/>
         </w:rPr>
-        <w:t xml:space="preserve">The download of the raw dataset and uploading to the GCS bucket can be reproduced using the related </w:t>
-      </w:r>
-      <w:proofErr w:type="spellStart"/>
-      <w:r>
-        <w:rPr>
-          <w:rFonts w:asciiTheme="minorHAnsi" w:hAnsiTheme="minorHAnsi"/>
-        </w:rPr>
-        <w:t>Jupyter</w:t>
-      </w:r>
-      <w:proofErr w:type="spellEnd"/>
-      <w:r>
-        <w:rPr>
-          <w:rFonts w:asciiTheme="minorHAnsi" w:hAnsiTheme="minorHAnsi"/>
-        </w:rPr>
-        <w:t xml:space="preserve"> notebook listed below which is</w:t>
-      </w:r>
-      <w:r>
-        <w:rPr>
-          <w:rFonts w:asciiTheme="minorHAnsi" w:hAnsiTheme="minorHAnsi"/>
-        </w:rPr>
-        <w:t xml:space="preserve"> maintained within the </w:t>
-      </w:r>
-      <w:proofErr w:type="spellStart"/>
-      <w:r>
-        <w:rPr>
-          <w:rFonts w:asciiTheme="minorHAnsi" w:hAnsiTheme="minorHAnsi"/>
-        </w:rPr>
-        <w:t>Github</w:t>
-      </w:r>
-      <w:proofErr w:type="spellEnd"/>
-      <w:r>
-        <w:rPr>
-          <w:rFonts w:asciiTheme="minorHAnsi" w:hAnsiTheme="minorHAnsi"/>
-        </w:rPr>
-        <w:t xml:space="preserve"> repo and</w:t>
+        <w:t>The download of the raw dataset and uploading to the GCS bucket can be reproduced using the related Jupyter notebook listed below which is</w:t>
+      </w:r>
+      <w:r>
+        <w:rPr>
+          <w:rFonts w:asciiTheme="minorHAnsi" w:hAnsiTheme="minorHAnsi"/>
+        </w:rPr>
+        <w:t xml:space="preserve"> maintained within the Git</w:t>
+      </w:r>
+      <w:r>
+        <w:rPr>
+          <w:rFonts w:asciiTheme="minorHAnsi" w:hAnsiTheme="minorHAnsi"/>
+        </w:rPr>
+        <w:t>H</w:t>
+      </w:r>
+      <w:r>
+        <w:rPr>
+          <w:rFonts w:asciiTheme="minorHAnsi" w:hAnsiTheme="minorHAnsi"/>
+        </w:rPr>
+        <w:t>ub repo and</w:t>
       </w:r>
       <w:r>
         <w:rPr>
@@ -2401,18 +2496,8 @@
           <w:b/>
           <w:bCs/>
         </w:rPr>
-        <w:t xml:space="preserve">Google </w:t>
-      </w:r>
-      <w:proofErr w:type="spellStart"/>
-      <w:r>
-        <w:rPr>
-          <w:rFonts w:asciiTheme="minorHAnsi" w:hAnsiTheme="minorHAnsi"/>
-          <w:b/>
-          <w:bCs/>
-        </w:rPr>
-        <w:t>Colab</w:t>
-      </w:r>
-      <w:proofErr w:type="spellEnd"/>
+        <w:t>Google Colab</w:t>
+      </w:r>
     </w:p>
     <w:tbl>
       <w:tblPr>
@@ -2598,9 +2683,82 @@
             <w:pPr>
               <w:pStyle w:val="BodyText"/>
               <w:rPr>
-                <w:rFonts w:asciiTheme="minorHAnsi" w:hAnsiTheme="minorHAnsi"/>
-              </w:rPr>
-            </w:pPr>
+                <w:rStyle w:val="VerbatimChar"/>
+                <w:rFonts w:asciiTheme="minorHAnsi" w:hAnsiTheme="minorHAnsi"/>
+                <w:sz w:val="21"/>
+              </w:rPr>
+            </w:pPr>
+            <w:r>
+              <w:rPr>
+                <w:rStyle w:val="VerbatimChar"/>
+                <w:rFonts w:asciiTheme="minorHAnsi" w:hAnsiTheme="minorHAnsi"/>
+                <w:sz w:val="21"/>
+              </w:rPr>
+              <w:t xml:space="preserve">Public URL - </w:t>
+            </w:r>
+            <w:hyperlink r:id="rId10" w:history="1">
+              <w:r>
+                <w:rPr>
+                  <w:rStyle w:val="Hyperlink"/>
+                  <w:rFonts w:asciiTheme="minorHAnsi" w:hAnsiTheme="minorHAnsi"/>
+                  <w:color w:val="auto"/>
+                  <w:u w:val="none"/>
+                </w:rPr>
+                <w:t>https://storage.googleapis.com/european-flight-delay-prediction/raw/merged_flights_wit</w:t>
+              </w:r>
+              <w:r>
+                <w:rPr>
+                  <w:rStyle w:val="Hyperlink"/>
+                  <w:rFonts w:asciiTheme="minorHAnsi" w:hAnsiTheme="minorHAnsi"/>
+                  <w:color w:val="auto"/>
+                  <w:u w:val="none"/>
+                </w:rPr>
+                <w:t>h</w:t>
+              </w:r>
+              <w:r>
+                <w:rPr>
+                  <w:rStyle w:val="Hyperlink"/>
+                  <w:rFonts w:asciiTheme="minorHAnsi" w:hAnsiTheme="minorHAnsi"/>
+                  <w:color w:val="auto"/>
+                  <w:u w:val="none"/>
+                </w:rPr>
+                <w:t>_delay_2023_202</w:t>
+              </w:r>
+              <w:r>
+                <w:rPr>
+                  <w:rStyle w:val="Hyperlink"/>
+                  <w:rFonts w:asciiTheme="minorHAnsi" w:hAnsiTheme="minorHAnsi"/>
+                  <w:color w:val="auto"/>
+                  <w:u w:val="none"/>
+                </w:rPr>
+                <w:t>5</w:t>
+              </w:r>
+              <w:r>
+                <w:rPr>
+                  <w:rStyle w:val="Hyperlink"/>
+                  <w:rFonts w:asciiTheme="minorHAnsi" w:hAnsiTheme="minorHAnsi"/>
+                  <w:color w:val="auto"/>
+                  <w:u w:val="none"/>
+                </w:rPr>
+                <w:t>.parquet</w:t>
+              </w:r>
+            </w:hyperlink>
+          </w:p>
+          <w:p>
+            <w:pPr>
+              <w:pStyle w:val="BodyText"/>
+              <w:rPr>
+                <w:rFonts w:asciiTheme="minorHAnsi" w:hAnsiTheme="minorHAnsi"/>
+              </w:rPr>
+            </w:pPr>
+            <w:r>
+              <w:rPr>
+                <w:rStyle w:val="VerbatimChar"/>
+                <w:rFonts w:asciiTheme="minorHAnsi" w:hAnsiTheme="minorHAnsi"/>
+                <w:sz w:val="21"/>
+              </w:rPr>
+              <w:t xml:space="preserve">Cloud Storage URI - </w:t>
+            </w:r>
             <w:r>
               <w:rPr>
                 <w:rStyle w:val="VerbatimChar"/>
@@ -2656,18 +2814,8 @@
                 <w:rFonts w:asciiTheme="minorHAnsi" w:hAnsiTheme="minorHAnsi"/>
                 <w:sz w:val="21"/>
               </w:rPr>
-              <w:t xml:space="preserve">Google </w:t>
-            </w:r>
-            <w:proofErr w:type="spellStart"/>
-            <w:r>
-              <w:rPr>
-                <w:rStyle w:val="VerbatimChar"/>
-                <w:rFonts w:asciiTheme="minorHAnsi" w:hAnsiTheme="minorHAnsi"/>
-                <w:sz w:val="21"/>
-              </w:rPr>
-              <w:t>Colab</w:t>
-            </w:r>
-            <w:proofErr w:type="spellEnd"/>
+              <w:t>Google Colab</w:t>
+            </w:r>
           </w:p>
         </w:tc>
       </w:tr>
@@ -2719,25 +2867,23 @@
                 <w:rFonts w:asciiTheme="minorHAnsi" w:hAnsiTheme="minorHAnsi"/>
                 <w:sz w:val="21"/>
               </w:rPr>
-              <w:t xml:space="preserve">Access to </w:t>
-            </w:r>
-            <w:proofErr w:type="spellStart"/>
+              <w:t>Access to Git</w:t>
+            </w:r>
             <w:r>
               <w:rPr>
                 <w:rStyle w:val="VerbatimChar"/>
                 <w:rFonts w:asciiTheme="minorHAnsi" w:hAnsiTheme="minorHAnsi"/>
                 <w:sz w:val="21"/>
               </w:rPr>
-              <w:t>Github</w:t>
-            </w:r>
-            <w:proofErr w:type="spellEnd"/>
+              <w:t>H</w:t>
+            </w:r>
             <w:r>
               <w:rPr>
                 <w:rStyle w:val="VerbatimChar"/>
                 <w:rFonts w:asciiTheme="minorHAnsi" w:hAnsiTheme="minorHAnsi"/>
                 <w:sz w:val="21"/>
               </w:rPr>
-              <w:t xml:space="preserve"> repo</w:t>
+              <w:t>ub repo</w:t>
             </w:r>
           </w:p>
           <w:p>
@@ -2759,7 +2905,7 @@
                 <w:rFonts w:asciiTheme="minorHAnsi" w:hAnsiTheme="minorHAnsi"/>
                 <w:sz w:val="21"/>
               </w:rPr>
-              <w:t>Google Collab</w:t>
+              <w:t>Google Colab</w:t>
             </w:r>
           </w:p>
           <w:p>
@@ -2803,7 +2949,7 @@
                 <w:rFonts w:asciiTheme="minorHAnsi" w:hAnsiTheme="minorHAnsi"/>
                 <w:sz w:val="21"/>
               </w:rPr>
-              <w:t>Packages listed in requiremenrts.txt if not using Google Collab</w:t>
+              <w:t>Packages listed in requirements.txt if not using Google Colab</w:t>
             </w:r>
           </w:p>
         </w:tc>
@@ -2831,13 +2977,12 @@
           <w:lang w:val="en-US"/>
         </w:rPr>
       </w:pPr>
-      <w:bookmarkStart w:id="5" w:name="_Toc242021086"/>
+      <w:bookmarkStart w:id="5" w:name="_Toc242025024"/>
       <w:r>
         <w:rPr>
           <w:rFonts w:asciiTheme="minorHAnsi" w:hAnsiTheme="minorHAnsi"/>
           <w:lang w:val="en-US"/>
         </w:rPr>
-        <w:lastRenderedPageBreak/>
         <w:t>2</w:t>
       </w:r>
       <w:r>
@@ -2877,7 +3022,15 @@
           <w:i/>
           <w:color w:val="7F6000"/>
         </w:rPr>
-        <w:t>TODO - Clearly describes where processed data will be stored and specifies appropriate file formats for raw and/or processed data, with enough detail to understand the intended representation.</w:t>
+        <w:t>Goal</w:t>
+      </w:r>
+      <w:r>
+        <w:rPr>
+          <w:rFonts w:asciiTheme="minorHAnsi" w:hAnsiTheme="minorHAnsi"/>
+          <w:i/>
+          <w:color w:val="7F6000"/>
+        </w:rPr>
+        <w:t xml:space="preserve"> - Clearly describes where processed data will be stored and specifies appropriate file formats for raw and/or processed data, with enough detail to understand the intended representation.</w:t>
       </w:r>
     </w:p>
     <w:p>
@@ -2990,7 +3143,6 @@
         </w:rPr>
         <w:t>9. Reproducibility of Pre-</w:t>
       </w:r>
-      <w:proofErr w:type="gramStart"/>
       <w:r>
         <w:rPr>
           <w:rFonts w:asciiTheme="minorHAnsi" w:hAnsiTheme="minorHAnsi"/>
@@ -3002,9 +3154,8 @@
         <w:rPr>
           <w:rFonts w:asciiTheme="minorHAnsi" w:hAnsiTheme="minorHAnsi"/>
         </w:rPr>
-        <w:t>‘</w:t>
-      </w:r>
-      <w:proofErr w:type="gramEnd"/>
+        <w:t xml:space="preserve"> ‘</w:t>
+      </w:r>
       <w:r>
         <w:rPr>
           <w:rFonts w:asciiTheme="minorHAnsi" w:hAnsiTheme="minorHAnsi"/>
@@ -3017,6 +3168,7 @@
         <w:pStyle w:val="BodyText"/>
         <w:rPr>
           <w:rFonts w:asciiTheme="minorHAnsi" w:hAnsiTheme="minorHAnsi"/>
+          <w:color w:val="000000" w:themeColor="text1"/>
         </w:rPr>
       </w:pPr>
       <w:r>
@@ -3024,6 +3176,27 @@
           <w:rFonts w:asciiTheme="minorHAnsi" w:hAnsiTheme="minorHAnsi"/>
         </w:rPr>
         <w:t>The processed dataset will be stored in the same Google Cloud Storage bucket as the raw data, but in a separate processed/ folder</w:t>
+      </w:r>
+      <w:r>
+        <w:rPr>
+          <w:rFonts w:asciiTheme="minorHAnsi" w:hAnsiTheme="minorHAnsi"/>
+          <w:color w:val="FF0000"/>
+        </w:rPr>
+        <w:t xml:space="preserve"> </w:t>
+      </w:r>
+      <w:r>
+        <w:rPr>
+          <w:rFonts w:asciiTheme="minorHAnsi" w:hAnsiTheme="minorHAnsi"/>
+          <w:color w:val="000000" w:themeColor="text1"/>
+        </w:rPr>
+        <w:t xml:space="preserve">- </w:t>
+      </w:r>
+      <w:r>
+        <w:rPr>
+          <w:rFonts w:asciiTheme="minorHAnsi" w:hAnsiTheme="minorHAnsi"/>
+          <w:color w:val="000000" w:themeColor="text1"/>
+        </w:rPr>
+        <w:t>gs://european-flight-delay-prediction/processed/flights_downsampled_100k.parquet</w:t>
       </w:r>
     </w:p>
     <w:p>
@@ -3031,15 +3204,16 @@
         <w:pStyle w:val="BodyText"/>
         <w:rPr>
           <w:rFonts w:asciiTheme="minorHAnsi" w:hAnsiTheme="minorHAnsi"/>
-          <w:color w:val="FF0000"/>
-        </w:rPr>
-      </w:pPr>
-      <w:r>
-        <w:rPr>
-          <w:rFonts w:asciiTheme="minorHAnsi" w:hAnsiTheme="minorHAnsi"/>
-          <w:color w:val="FF0000"/>
-        </w:rPr>
-        <w:t>TODO ADD LINK WHEN CREATED</w:t>
+          <w:color w:val="000000" w:themeColor="text1"/>
+        </w:rPr>
+      </w:pPr>
+      <w:r>
+        <w:rPr>
+          <w:rFonts w:asciiTheme="minorHAnsi" w:hAnsiTheme="minorHAnsi"/>
+          <w:color w:val="000000" w:themeColor="text1"/>
+        </w:rPr>
+        <w:lastRenderedPageBreak/>
+        <w:t>Storing the processed data separately ensures that the original raw source data remains unchanged. It also supports reproducibility as the processed data can be reproduced from the raw datasets using the associated notebook.</w:t>
       </w:r>
     </w:p>
     <w:p>
@@ -3047,47 +3221,31 @@
         <w:pStyle w:val="BodyText"/>
         <w:rPr>
           <w:rFonts w:asciiTheme="minorHAnsi" w:hAnsiTheme="minorHAnsi"/>
-          <w:color w:val="000000" w:themeColor="text1"/>
-        </w:rPr>
-      </w:pPr>
-      <w:r>
-        <w:rPr>
-          <w:rFonts w:asciiTheme="minorHAnsi" w:hAnsiTheme="minorHAnsi"/>
-          <w:color w:val="000000" w:themeColor="text1"/>
-        </w:rPr>
-        <w:t>Storing the processed data separately ensures that the original raw source data remains unchanged. It also supports reproducibility as the processed data can be reproduced from the raw datasets using the associated notebook.</w:t>
+        </w:rPr>
+      </w:pPr>
+      <w:r>
+        <w:rPr>
+          <w:rFonts w:asciiTheme="minorHAnsi" w:hAnsiTheme="minorHAnsi"/>
+        </w:rPr>
+        <w:t>The processed data will also be stored in Apache Parquet format for similar reasons to the raw data. Parquet reduces file size and storage cost, preserves data types and allows for specified columns to be read without having to load the whole dataset into memory. This makes it suitable for exploratory analysis, feature engineering and machine learning model development</w:t>
       </w:r>
     </w:p>
     <w:p>
       <w:pPr>
-        <w:pStyle w:val="BodyText"/>
-        <w:rPr>
-          <w:rFonts w:asciiTheme="minorHAnsi" w:hAnsiTheme="minorHAnsi"/>
-        </w:rPr>
-      </w:pPr>
-      <w:r>
-        <w:rPr>
-          <w:rFonts w:asciiTheme="minorHAnsi" w:hAnsiTheme="minorHAnsi"/>
-        </w:rPr>
-        <w:t>The processed data will also be stored in Apache Parquet format for similar reasons to the raw data. Parquet reduces file size and storage cost, preserves data types and allows for specified columns to be read without having to load the whole dataset into memory. This makes it suitable for exploratory analysis, feature engineering and machine learning model development</w:t>
-      </w:r>
+        <w:rPr>
+          <w:lang w:val="en-US"/>
+        </w:rPr>
+      </w:pPr>
     </w:p>
     <w:p>
       <w:pPr>
-        <w:rPr>
+        <w:pStyle w:val="Heading1"/>
+        <w:rPr>
+          <w:rFonts w:asciiTheme="minorHAnsi" w:hAnsiTheme="minorHAnsi"/>
           <w:lang w:val="en-US"/>
         </w:rPr>
       </w:pPr>
-    </w:p>
-    <w:p>
-      <w:pPr>
-        <w:pStyle w:val="Heading1"/>
-        <w:rPr>
-          <w:rFonts w:asciiTheme="minorHAnsi" w:hAnsiTheme="minorHAnsi"/>
-          <w:lang w:val="en-US"/>
-        </w:rPr>
-      </w:pPr>
-      <w:bookmarkStart w:id="6" w:name="_Toc242021087"/>
+      <w:bookmarkStart w:id="6" w:name="_Toc242025025"/>
       <w:r>
         <w:rPr>
           <w:rFonts w:asciiTheme="minorHAnsi" w:hAnsiTheme="minorHAnsi"/>
@@ -3146,7 +3304,15 @@
           <w:i/>
           <w:color w:val="7F6000"/>
         </w:rPr>
-        <w:t>TODO - Explicitly considers whether a database, object storage, file system, or other solution is needed. The choice is justified in relation to the project’s data and access requirements.</w:t>
+        <w:t>Goal</w:t>
+      </w:r>
+      <w:r>
+        <w:rPr>
+          <w:rFonts w:asciiTheme="minorHAnsi" w:hAnsiTheme="minorHAnsi"/>
+          <w:i/>
+          <w:color w:val="7F6000"/>
+        </w:rPr>
+        <w:t xml:space="preserve"> - Explicitly considers whether a database, object storage, file system, or other solution is needed. The choice is justified in relation to the project’s data and access requirements.</w:t>
       </w:r>
     </w:p>
     <w:p>
@@ -3208,15 +3374,13 @@
         </w:rPr>
         <w:t xml:space="preserve">The original raw data is one large Parquet </w:t>
       </w:r>
-      <w:proofErr w:type="gramStart"/>
       <w:r>
         <w:rPr>
           <w:rFonts w:asciiTheme="minorHAnsi" w:hAnsiTheme="minorHAnsi"/>
           <w:lang w:val="en-US"/>
         </w:rPr>
-        <w:t>file</w:t>
-      </w:r>
-      <w:proofErr w:type="gramEnd"/>
+        <w:t>file,</w:t>
+      </w:r>
       <w:r>
         <w:rPr>
           <w:rFonts w:asciiTheme="minorHAnsi" w:hAnsiTheme="minorHAnsi"/>
@@ -3250,23 +3414,7 @@
           <w:rFonts w:asciiTheme="minorHAnsi" w:hAnsiTheme="minorHAnsi"/>
           <w:lang w:val="en-US"/>
         </w:rPr>
-        <w:t xml:space="preserve"> by my notebooks in Google </w:t>
-      </w:r>
-      <w:proofErr w:type="spellStart"/>
-      <w:r>
-        <w:rPr>
-          <w:rFonts w:asciiTheme="minorHAnsi" w:hAnsiTheme="minorHAnsi"/>
-          <w:lang w:val="en-US"/>
-        </w:rPr>
-        <w:t>Colab</w:t>
-      </w:r>
-      <w:proofErr w:type="spellEnd"/>
-      <w:r>
-        <w:rPr>
-          <w:rFonts w:asciiTheme="minorHAnsi" w:hAnsiTheme="minorHAnsi"/>
-          <w:lang w:val="en-US"/>
-        </w:rPr>
-        <w:t>.</w:t>
+        <w:t xml:space="preserve"> by my notebooks in Google Colab.</w:t>
       </w:r>
     </w:p>
     <w:p>
@@ -3284,13 +3432,6 @@
         </w:rPr>
         <w:t xml:space="preserve">A database would be useful if I needed to update records regularly, manage lots of related tables or run a lot of SQL queries but that should not be necessary for this project. </w:t>
       </w:r>
-      <w:r>
-        <w:rPr>
-          <w:rFonts w:asciiTheme="minorHAnsi" w:hAnsiTheme="minorHAnsi"/>
-          <w:lang w:val="en-US"/>
-        </w:rPr>
-        <w:t>Local file system would make it harder to reproduce.</w:t>
-      </w:r>
     </w:p>
     <w:p>
       <w:pPr>
@@ -3305,51 +3446,36 @@
           <w:rFonts w:asciiTheme="minorHAnsi" w:hAnsiTheme="minorHAnsi"/>
           <w:lang w:val="en-US"/>
         </w:rPr>
-        <w:t xml:space="preserve">The main workflow here will be loading the dataset, </w:t>
-      </w:r>
-      <w:proofErr w:type="spellStart"/>
-      <w:r>
-        <w:rPr>
-          <w:rFonts w:asciiTheme="minorHAnsi" w:hAnsiTheme="minorHAnsi"/>
-          <w:lang w:val="en-US"/>
-        </w:rPr>
-        <w:t>analysing</w:t>
-      </w:r>
-      <w:proofErr w:type="spellEnd"/>
-      <w:r>
-        <w:rPr>
-          <w:rFonts w:asciiTheme="minorHAnsi" w:hAnsiTheme="minorHAnsi"/>
-          <w:lang w:val="en-US"/>
-        </w:rPr>
-        <w:t xml:space="preserve"> it, creating a smaller sample and then using that sample for modelling. </w:t>
+        <w:t>Local file system would make it harder to reproduce.</w:t>
       </w:r>
     </w:p>
     <w:p>
       <w:pPr>
         <w:pStyle w:val="BodyText"/>
         <w:rPr>
-          <w:rFonts w:asciiTheme="minorHAnsi" w:hAnsiTheme="minorHAnsi" w:cstheme="minorBidi"/>
-        </w:rPr>
-      </w:pPr>
-      <w:r>
-        <w:rPr>
-          <w:rFonts w:asciiTheme="minorHAnsi" w:hAnsiTheme="minorHAnsi" w:cstheme="minorBidi"/>
-        </w:rPr>
-        <w:t xml:space="preserve">By storing the files in Google Cloud Storage, the raw and processed datasets have a clear cloud location that can be accessed from Google </w:t>
+          <w:rFonts w:asciiTheme="minorHAnsi" w:hAnsiTheme="minorHAnsi"/>
+          <w:lang w:val="en-US"/>
+        </w:rPr>
+      </w:pPr>
+      <w:r>
+        <w:rPr>
+          <w:rFonts w:asciiTheme="minorHAnsi" w:hAnsiTheme="minorHAnsi"/>
+        </w:rPr>
+        <w:t xml:space="preserve">A data warehouse such as </w:t>
       </w:r>
       <w:proofErr w:type="spellStart"/>
       <w:r>
         <w:rPr>
-          <w:rFonts w:asciiTheme="minorHAnsi" w:hAnsiTheme="minorHAnsi" w:cstheme="minorBidi"/>
-        </w:rPr>
-        <w:t>Colab</w:t>
+          <w:rFonts w:asciiTheme="minorHAnsi" w:hAnsiTheme="minorHAnsi"/>
+        </w:rPr>
+        <w:t>BigQuery</w:t>
       </w:r>
       <w:proofErr w:type="spellEnd"/>
       <w:r>
         <w:rPr>
-          <w:rFonts w:asciiTheme="minorHAnsi" w:hAnsiTheme="minorHAnsi" w:cstheme="minorBidi"/>
-        </w:rPr>
-        <w:t>.</w:t>
+          <w:rFonts w:asciiTheme="minorHAnsi" w:hAnsiTheme="minorHAnsi"/>
+        </w:rPr>
+        <w:t xml:space="preserve"> could be useful later for large-scale SQL analysis, but it is not required for the current file-based notebook workflow.</w:t>
       </w:r>
     </w:p>
     <w:p>
@@ -3357,65 +3483,109 @@
         <w:pStyle w:val="BodyText"/>
         <w:rPr>
           <w:rFonts w:asciiTheme="minorHAnsi" w:hAnsiTheme="minorHAnsi"/>
-        </w:rPr>
-      </w:pPr>
-      <w:r>
-        <w:rPr>
-          <w:rFonts w:asciiTheme="minorHAnsi" w:hAnsiTheme="minorHAnsi"/>
-        </w:rPr>
-        <w:lastRenderedPageBreak/>
-        <w:t>The raw data will be stored in a raw/ folder and the processed sample will be stored in a separate processed/ folder. This keeps the original data unchanged and makes it easier to understand which file is the source data and which file is the working dataset used for analysis and modelling.</w:t>
+          <w:lang w:val="en-US"/>
+        </w:rPr>
+      </w:pPr>
+      <w:r>
+        <w:rPr>
+          <w:rFonts w:asciiTheme="minorHAnsi" w:hAnsiTheme="minorHAnsi"/>
+          <w:lang w:val="en-US"/>
+        </w:rPr>
+        <w:t xml:space="preserve">The main workflow here will be loading the dataset, </w:t>
+      </w:r>
+      <w:r>
+        <w:rPr>
+          <w:rFonts w:asciiTheme="minorHAnsi" w:hAnsiTheme="minorHAnsi"/>
+          <w:lang w:val="en-US"/>
+        </w:rPr>
+        <w:t>analy</w:t>
+      </w:r>
+      <w:r>
+        <w:rPr>
+          <w:rFonts w:asciiTheme="minorHAnsi" w:hAnsiTheme="minorHAnsi"/>
+          <w:lang w:val="en-US"/>
+        </w:rPr>
+        <w:t>s</w:t>
+      </w:r>
+      <w:r>
+        <w:rPr>
+          <w:rFonts w:asciiTheme="minorHAnsi" w:hAnsiTheme="minorHAnsi"/>
+          <w:lang w:val="en-US"/>
+        </w:rPr>
+        <w:t>ing</w:t>
+      </w:r>
+      <w:r>
+        <w:rPr>
+          <w:rFonts w:asciiTheme="minorHAnsi" w:hAnsiTheme="minorHAnsi"/>
+          <w:lang w:val="en-US"/>
+        </w:rPr>
+        <w:t xml:space="preserve"> it, creating a smaller sample and then using that sample for modelling. </w:t>
       </w:r>
     </w:p>
     <w:p>
       <w:pPr>
         <w:pStyle w:val="BodyText"/>
         <w:rPr>
-          <w:rFonts w:asciiTheme="minorHAnsi" w:hAnsiTheme="minorHAnsi"/>
-        </w:rPr>
-      </w:pPr>
-      <w:r>
-        <w:rPr>
-          <w:rFonts w:asciiTheme="minorHAnsi" w:hAnsiTheme="minorHAnsi"/>
-        </w:rPr>
-        <w:t xml:space="preserve">Overall, Google Cloud Storage is the most suitable choice for this stage of the project because it gives me a simple, cloud-based place to store large Parquet files, access them from </w:t>
-      </w:r>
-      <w:proofErr w:type="spellStart"/>
-      <w:r>
-        <w:rPr>
-          <w:rFonts w:asciiTheme="minorHAnsi" w:hAnsiTheme="minorHAnsi"/>
-        </w:rPr>
-        <w:t>Colab</w:t>
-      </w:r>
-      <w:proofErr w:type="spellEnd"/>
-      <w:r>
-        <w:rPr>
-          <w:rFonts w:asciiTheme="minorHAnsi" w:hAnsiTheme="minorHAnsi"/>
-        </w:rPr>
-        <w:t>, and keep the project reproducible.</w:t>
+          <w:rFonts w:asciiTheme="minorHAnsi" w:hAnsiTheme="minorHAnsi" w:cstheme="minorBidi"/>
+        </w:rPr>
+      </w:pPr>
+      <w:r>
+        <w:rPr>
+          <w:rFonts w:asciiTheme="minorHAnsi" w:hAnsiTheme="minorHAnsi" w:cstheme="minorBidi"/>
+        </w:rPr>
+        <w:t>By storing the files in Google Cloud Storage, the raw and processed datasets have a clear cloud location that can be accessed from Google Colab.</w:t>
       </w:r>
     </w:p>
     <w:p>
       <w:pPr>
-        <w:rPr>
-          <w:lang w:val="en-US"/>
-        </w:rPr>
-      </w:pPr>
+        <w:pStyle w:val="BodyText"/>
+        <w:rPr>
+          <w:rFonts w:asciiTheme="minorHAnsi" w:hAnsiTheme="minorHAnsi"/>
+        </w:rPr>
+      </w:pPr>
+      <w:r>
+        <w:rPr>
+          <w:rFonts w:asciiTheme="minorHAnsi" w:hAnsiTheme="minorHAnsi"/>
+        </w:rPr>
+        <w:t>The raw data will be stored in a raw/ folder and the processed sample will be stored in a separate processed/ folder. This keeps the original data unchanged and makes it easier to understand which file is the source data and which file is the working dataset used for analysis and modelling.</w:t>
+      </w:r>
     </w:p>
     <w:p>
       <w:pPr>
+        <w:pStyle w:val="BodyText"/>
+        <w:rPr>
+          <w:rFonts w:asciiTheme="minorHAnsi" w:hAnsiTheme="minorHAnsi"/>
+        </w:rPr>
+      </w:pPr>
+      <w:r>
+        <w:rPr>
+          <w:rFonts w:asciiTheme="minorHAnsi" w:hAnsiTheme="minorHAnsi"/>
+        </w:rPr>
+        <w:t>Overall, Google Cloud Storage is the most suitable choice for this stage of the project because it gives me a simple, cloud-based place to store large Parquet files, access them from Colab, and keep the project reproducible.</w:t>
+      </w:r>
+    </w:p>
+    <w:p>
+      <w:pPr>
+        <w:rPr>
+          <w:lang w:val="en-US"/>
+        </w:rPr>
+      </w:pPr>
+    </w:p>
+    <w:p>
+      <w:pPr>
         <w:pStyle w:val="Heading1"/>
         <w:rPr>
           <w:rFonts w:asciiTheme="minorHAnsi" w:hAnsiTheme="minorHAnsi"/>
           <w:lang w:val="en-US"/>
         </w:rPr>
       </w:pPr>
-      <w:bookmarkStart w:id="7" w:name="_Toc242021088"/>
+      <w:bookmarkStart w:id="7" w:name="_Toc242025026"/>
       <w:r>
         <w:rPr>
           <w:rFonts w:asciiTheme="minorHAnsi" w:hAnsiTheme="minorHAnsi"/>
           <w:lang w:val="en-US"/>
         </w:rPr>
+        <w:lastRenderedPageBreak/>
         <w:t>4</w:t>
       </w:r>
       <w:r>
@@ -3448,7 +3618,15 @@
           <w:i/>
           <w:color w:val="7F6000"/>
         </w:rPr>
-        <w:t>TODO - Explains how different versions of the data will be identified and tracked, including changes to datasets where relevant.</w:t>
+        <w:t>Goal</w:t>
+      </w:r>
+      <w:r>
+        <w:rPr>
+          <w:rFonts w:asciiTheme="minorHAnsi" w:hAnsiTheme="minorHAnsi"/>
+          <w:i/>
+          <w:color w:val="7F6000"/>
+        </w:rPr>
+        <w:t xml:space="preserve"> - Explains how different versions of the data will be identified and tracked, including changes to datasets where relevant.</w:t>
       </w:r>
     </w:p>
     <w:p>
@@ -3571,7 +3749,7 @@
                     <pic:cNvPicPr/>
                   </pic:nvPicPr>
                   <pic:blipFill>
-                    <a:blip r:embed="rId10"/>
+                    <a:blip r:embed="rId11"/>
                     <a:stretch>
                       <a:fillRect/>
                     </a:stretch>
@@ -3602,21 +3780,7 @@
         <w:rPr>
           <w:lang w:val="en-US"/>
         </w:rPr>
-        <w:t xml:space="preserve">The raw folder will contain the original source dataset while the processed folder will contain datasets created from the raw data such as the </w:t>
-      </w:r>
-      <w:proofErr w:type="gramStart"/>
-      <w:r>
-        <w:rPr>
-          <w:lang w:val="en-US"/>
-        </w:rPr>
-        <w:t>100,000 record</w:t>
-      </w:r>
-      <w:proofErr w:type="gramEnd"/>
-      <w:r>
-        <w:rPr>
-          <w:lang w:val="en-US"/>
-        </w:rPr>
-        <w:t xml:space="preserve"> sample used for analysis and modelling. If the processed dataset is regenerated the new file will replace the current object while GCS Object versioning will retain the most recent previous versions. </w:t>
+        <w:t xml:space="preserve">The raw folder will contain the original source dataset while the processed folder will contain datasets created from the raw data such as the 100,000 record sample used for analysis and modelling. If the processed dataset is regenerated the new file will replace the current object while GCS Object versioning will retain the most recent previous versions. </w:t>
       </w:r>
     </w:p>
     <w:p>
@@ -3627,13 +3791,12 @@
           <w:lang w:val="en-US"/>
         </w:rPr>
       </w:pPr>
-      <w:bookmarkStart w:id="8" w:name="_Toc242021089"/>
+      <w:bookmarkStart w:id="8" w:name="_Toc242025027"/>
       <w:r>
         <w:rPr>
           <w:rFonts w:asciiTheme="minorHAnsi" w:hAnsiTheme="minorHAnsi"/>
           <w:lang w:val="en-US"/>
         </w:rPr>
-        <w:lastRenderedPageBreak/>
         <w:t>5</w:t>
       </w:r>
       <w:r>
@@ -3666,7 +3829,15 @@
           <w:i/>
           <w:color w:val="7F6000"/>
         </w:rPr>
-        <w:t>TODO - Clearly explains how the system/code will access the data, including relevant paths, APIs, credentials/access mechanisms, or other interfaces as appropriate.</w:t>
+        <w:t>Goal</w:t>
+      </w:r>
+      <w:r>
+        <w:rPr>
+          <w:rFonts w:asciiTheme="minorHAnsi" w:hAnsiTheme="minorHAnsi"/>
+          <w:i/>
+          <w:color w:val="7F6000"/>
+        </w:rPr>
+        <w:t xml:space="preserve"> - Clearly explains how the system/code will access the data, including relevant paths, APIs, credentials/access mechanisms, or other interfaces as appropriate.</w:t>
       </w:r>
     </w:p>
     <w:p>
@@ -3678,25 +3849,16 @@
           <w:b/>
           <w:bCs/>
         </w:rPr>
-        <w:t xml:space="preserve">Google </w:t>
-      </w:r>
-      <w:proofErr w:type="spellStart"/>
+        <w:t>Google Colab</w:t>
+      </w:r>
+      <w:r>
+        <w:t xml:space="preserve">. The data is stored in a </w:t>
+      </w:r>
       <w:r>
         <w:rPr>
           <w:b/>
           <w:bCs/>
         </w:rPr>
-        <w:t>Colab</w:t>
-      </w:r>
-      <w:proofErr w:type="spellEnd"/>
-      <w:r>
-        <w:t xml:space="preserve">. The data is stored in a </w:t>
-      </w:r>
-      <w:r>
-        <w:rPr>
-          <w:b/>
-          <w:bCs/>
-        </w:rPr>
         <w:t>Google Cloud Storage</w:t>
       </w:r>
       <w:r>
@@ -3705,13 +3867,8 @@
       <w:r>
         <w:t xml:space="preserve"> </w:t>
       </w:r>
-      <w:proofErr w:type="spellStart"/>
-      <w:r>
-        <w:t>european</w:t>
-      </w:r>
-      <w:proofErr w:type="spellEnd"/>
-      <w:r>
-        <w:t>-flight-delay-prediction</w:t>
+      <w:r>
+        <w:t>european-flight-delay-prediction</w:t>
       </w:r>
       <w:r>
         <w:t>.</w:t>
@@ -3725,28 +3882,13 @@
         <w:t>such as</w:t>
       </w:r>
       <w:r>
-        <w:t xml:space="preserve"> pandas, </w:t>
-      </w:r>
-      <w:proofErr w:type="spellStart"/>
-      <w:r>
-        <w:t>pyarrow</w:t>
-      </w:r>
-      <w:proofErr w:type="spellEnd"/>
-      <w:r>
-        <w:t xml:space="preserve">, and the Google Cloud Storage client library. </w:t>
+        <w:t xml:space="preserve"> pandas, pyarrow, and the Google Cloud Storage client library. </w:t>
       </w:r>
     </w:p>
     <w:p>
       <w:r>
-        <w:t xml:space="preserve">Google </w:t>
-      </w:r>
-      <w:proofErr w:type="spellStart"/>
-      <w:r>
-        <w:t>Colab</w:t>
-      </w:r>
-      <w:proofErr w:type="spellEnd"/>
-      <w:r>
-        <w:t xml:space="preserve"> is used as the main notebook environment. Access to the Google Cloud project is authenticated in the notebooks using</w:t>
+        <w:lastRenderedPageBreak/>
+        <w:t>Google Colab is used as the main notebook environment. Access to the Google Cloud project is authenticated in the notebooks using</w:t>
       </w:r>
       <w:r>
         <w:t xml:space="preserve"> user authentication</w:t>
@@ -3772,28 +3914,15 @@
               <w:spacing w:after="160" w:line="278" w:lineRule="auto"/>
             </w:pPr>
             <w:r>
-              <w:t xml:space="preserve">from </w:t>
-            </w:r>
-            <w:proofErr w:type="spellStart"/>
-            <w:r>
-              <w:t>google.colab</w:t>
-            </w:r>
-            <w:proofErr w:type="spellEnd"/>
-            <w:r>
-              <w:t xml:space="preserve"> import auth</w:t>
+              <w:t>from google.colab import auth</w:t>
             </w:r>
           </w:p>
           <w:p>
             <w:pPr>
               <w:spacing w:after="160" w:line="278" w:lineRule="auto"/>
             </w:pPr>
-            <w:proofErr w:type="spellStart"/>
-            <w:r>
-              <w:t>auth.authenticate_user</w:t>
-            </w:r>
-            <w:proofErr w:type="spellEnd"/>
-            <w:r>
-              <w:t>()</w:t>
+            <w:r>
+              <w:t>auth.authenticate_user()</w:t>
             </w:r>
           </w:p>
         </w:tc>
@@ -3826,11 +3955,9 @@
       <w:r>
         <w:t xml:space="preserve">The </w:t>
       </w:r>
-      <w:proofErr w:type="spellStart"/>
-      <w:r>
-        <w:t>downsampling</w:t>
-      </w:r>
-      <w:proofErr w:type="spellEnd"/>
+      <w:r>
+        <w:t>analysis and downsampling</w:t>
+      </w:r>
       <w:r>
         <w:t xml:space="preserve"> notebook </w:t>
       </w:r>
@@ -3838,21 +3965,19 @@
         <w:t>‘</w:t>
       </w:r>
       <w:r>
-        <w:t>02_downsampling.ipynb</w:t>
+        <w:t>02_</w:t>
+      </w:r>
+      <w:r>
+        <w:t>analysis_and_</w:t>
+      </w:r>
+      <w:r>
+        <w:t>downsampling.ipynb</w:t>
       </w:r>
       <w:r>
         <w:t xml:space="preserve">’ </w:t>
       </w:r>
       <w:r>
-        <w:t xml:space="preserve">reads the raw Parquet file directly from its GCS path using </w:t>
-      </w:r>
-      <w:proofErr w:type="spellStart"/>
-      <w:r>
-        <w:t>pandas.read_parquet</w:t>
-      </w:r>
-      <w:proofErr w:type="spellEnd"/>
-      <w:r>
-        <w:t>. It only loads the columns required for profiling, sampling, and validation, rather than loading unnecessary columns into memory. The notebook then creates a reproducible 100,000-record sample using a fixed random seed.</w:t>
+        <w:t>reads the raw Parquet file directly from its GCS path using pandas.read_parquet. It only loads the columns required for profiling, sampling, and validation, rather than loading unnecessary columns into memory. The notebook then creates a reproducible 100,000-record sample using a fixed random seed.</w:t>
       </w:r>
     </w:p>
     <w:p>
@@ -4038,7 +4163,6 @@
               <w:rPr>
                 <w:rFonts w:asciiTheme="minorHAnsi" w:hAnsiTheme="minorHAnsi"/>
               </w:rPr>
-              <w:lastRenderedPageBreak/>
               <w:t>Raw Dataset</w:t>
             </w:r>
           </w:p>
@@ -4080,49 +4204,7 @@
               <w:rPr>
                 <w:rFonts w:asciiTheme="minorHAnsi" w:hAnsiTheme="minorHAnsi"/>
               </w:rPr>
-              <w:t xml:space="preserve">Read from Google </w:t>
-            </w:r>
-            <w:proofErr w:type="spellStart"/>
-            <w:r>
-              <w:rPr>
-                <w:rFonts w:asciiTheme="minorHAnsi" w:hAnsiTheme="minorHAnsi"/>
-              </w:rPr>
-              <w:t>Colab</w:t>
-            </w:r>
-            <w:proofErr w:type="spellEnd"/>
-            <w:r>
-              <w:rPr>
-                <w:rFonts w:asciiTheme="minorHAnsi" w:hAnsiTheme="minorHAnsi"/>
-              </w:rPr>
-              <w:t xml:space="preserve"> using `</w:t>
-            </w:r>
-            <w:proofErr w:type="spellStart"/>
-            <w:r>
-              <w:rPr>
-                <w:rFonts w:asciiTheme="minorHAnsi" w:hAnsiTheme="minorHAnsi"/>
-              </w:rPr>
-              <w:t>pandas.read_parquet</w:t>
-            </w:r>
-            <w:proofErr w:type="spellEnd"/>
-            <w:r>
-              <w:rPr>
-                <w:rFonts w:asciiTheme="minorHAnsi" w:hAnsiTheme="minorHAnsi"/>
-              </w:rPr>
-              <w:t>` / `</w:t>
-            </w:r>
-            <w:proofErr w:type="spellStart"/>
-            <w:r>
-              <w:rPr>
-                <w:rFonts w:asciiTheme="minorHAnsi" w:hAnsiTheme="minorHAnsi"/>
-              </w:rPr>
-              <w:t>pyarrow</w:t>
-            </w:r>
-            <w:proofErr w:type="spellEnd"/>
-            <w:r>
-              <w:rPr>
-                <w:rFonts w:asciiTheme="minorHAnsi" w:hAnsiTheme="minorHAnsi"/>
-              </w:rPr>
-              <w:t>`</w:t>
+              <w:t>Read from Google Colab using `pandas.read_parquet` / `pyarrow`</w:t>
             </w:r>
           </w:p>
         </w:tc>
@@ -4164,16 +4246,8 @@
               <w:rPr>
                 <w:rFonts w:asciiTheme="minorHAnsi" w:hAnsiTheme="minorHAnsi"/>
               </w:rPr>
-              <w:t>gs://european-flight-delay-prediction/processed/flights_sample_100k.parquet</w:t>
-            </w:r>
-          </w:p>
-          <w:p>
-            <w:pPr>
-              <w:pStyle w:val="BodyText"/>
-              <w:rPr>
-                <w:rFonts w:asciiTheme="minorHAnsi" w:hAnsiTheme="minorHAnsi"/>
-              </w:rPr>
-            </w:pPr>
+              <w:t>gs://european-flight-delay-prediction/processed/flights_downsampled_100k.parquet</w:t>
+            </w:r>
           </w:p>
         </w:tc>
         <w:tc>
@@ -4191,21 +4265,19 @@
               <w:rPr>
                 <w:rFonts w:asciiTheme="minorHAnsi" w:hAnsiTheme="minorHAnsi"/>
               </w:rPr>
-              <w:t xml:space="preserve">Created by the </w:t>
-            </w:r>
-            <w:proofErr w:type="spellStart"/>
-            <w:r>
-              <w:rPr>
-                <w:rFonts w:asciiTheme="minorHAnsi" w:hAnsiTheme="minorHAnsi"/>
-              </w:rPr>
-              <w:t>downsampling</w:t>
-            </w:r>
-            <w:proofErr w:type="spellEnd"/>
-            <w:r>
-              <w:rPr>
-                <w:rFonts w:asciiTheme="minorHAnsi" w:hAnsiTheme="minorHAnsi"/>
-              </w:rPr>
-              <w:t xml:space="preserve"> notebook and stored back </w:t>
+              <w:t>Created by the</w:t>
+            </w:r>
+            <w:r>
+              <w:rPr>
+                <w:rFonts w:asciiTheme="minorHAnsi" w:hAnsiTheme="minorHAnsi"/>
+              </w:rPr>
+              <w:t xml:space="preserve"> analysis and</w:t>
+            </w:r>
+            <w:r>
+              <w:rPr>
+                <w:rFonts w:asciiTheme="minorHAnsi" w:hAnsiTheme="minorHAnsi"/>
+              </w:rPr>
+              <w:t xml:space="preserve"> downsampling notebook and stored back </w:t>
             </w:r>
             <w:r>
               <w:rPr>
@@ -4246,12 +4318,13 @@
           <w:lang w:val="en-US"/>
         </w:rPr>
       </w:pPr>
-      <w:bookmarkStart w:id="9" w:name="_Toc242021090"/>
+      <w:bookmarkStart w:id="9" w:name="_Toc242025028"/>
       <w:r>
         <w:rPr>
           <w:rFonts w:asciiTheme="minorHAnsi" w:hAnsiTheme="minorHAnsi"/>
           <w:lang w:val="en-US"/>
         </w:rPr>
+        <w:lastRenderedPageBreak/>
         <w:t>6</w:t>
       </w:r>
       <w:r>
@@ -4284,7 +4357,15 @@
           <w:i/>
           <w:color w:val="7F6000"/>
         </w:rPr>
-        <w:t>TODO - Provides a clear and appropriate data-splitting strategy: either cross-validation or a train/dev/test split. The description specifies how the split/validation will be performed and avoids inappropriate data leakage.</w:t>
+        <w:t>Goal</w:t>
+      </w:r>
+      <w:r>
+        <w:rPr>
+          <w:rFonts w:asciiTheme="minorHAnsi" w:hAnsiTheme="minorHAnsi"/>
+          <w:i/>
+          <w:color w:val="7F6000"/>
+        </w:rPr>
+        <w:t xml:space="preserve"> - Provides a clear and appropriate data-splitting strategy: either cross-validation or a train/dev/test split. The description specifies how the split/validation will be performed and avoids inappropriate data leakage.</w:t>
       </w:r>
     </w:p>
     <w:p>
@@ -4300,6 +4381,28 @@
         </w:rPr>
         <w:t>The split will be carried out after the representative 100,000-record sample has been created from the raw dataset. As the sample will already include records across the different years and delay classes, a random split is appropriate for this stage of the project. A fixed random seed will be used so that the same split can be reproduced.</w:t>
       </w:r>
+    </w:p>
+    <w:p>
+      <w:pPr>
+        <w:pStyle w:val="BodyText"/>
+        <w:rPr>
+          <w:rFonts w:asciiTheme="minorHAnsi" w:hAnsiTheme="minorHAnsi"/>
+        </w:rPr>
+      </w:pPr>
+      <w:r>
+        <w:rPr>
+          <w:rFonts w:asciiTheme="minorHAnsi" w:hAnsiTheme="minorHAnsi"/>
+        </w:rPr>
+        <w:t>To avoid data leakage, fields that directly reveal the delay outcome, such as delay_min, will not be included as model input features before the train, development, and test split is used for modelling.</w:t>
+      </w:r>
+    </w:p>
+    <w:p>
+      <w:pPr>
+        <w:pStyle w:val="BodyText"/>
+        <w:rPr>
+          <w:rFonts w:asciiTheme="minorHAnsi" w:hAnsiTheme="minorHAnsi"/>
+        </w:rPr>
+      </w:pPr>
     </w:p>
     <w:p>
       <w:pPr>
@@ -4609,21 +4712,7 @@
         <w:rPr>
           <w:rFonts w:asciiTheme="minorHAnsi" w:hAnsiTheme="minorHAnsi"/>
         </w:rPr>
-        <w:t xml:space="preserve">I will split the data in a way that keeps a similar balance of delayed and </w:t>
-      </w:r>
-      <w:proofErr w:type="spellStart"/>
-      <w:r>
-        <w:rPr>
-          <w:rFonts w:asciiTheme="minorHAnsi" w:hAnsiTheme="minorHAnsi"/>
-        </w:rPr>
-        <w:t>non delayed</w:t>
-      </w:r>
-      <w:proofErr w:type="spellEnd"/>
-      <w:r>
-        <w:rPr>
-          <w:rFonts w:asciiTheme="minorHAnsi" w:hAnsiTheme="minorHAnsi"/>
-        </w:rPr>
-        <w:t xml:space="preserve"> flights in each group. As the delayed flights make up a small percentage of the overall raw data, I will need to ensure that the training development and test sets have similar percentage of delayed flights.</w:t>
+        <w:t>I will split the data in a way that keeps a similar balance of delayed and non delayed flights in each group. As the delayed flights make up a small percentage of the overall raw data, I will need to ensure that the training development and test sets have similar percentage of delayed flights.</w:t>
       </w:r>
     </w:p>
     <w:p>
@@ -4637,21 +4726,513 @@
     <w:p>
       <w:pPr>
         <w:pStyle w:val="Heading2"/>
-        <w:rPr>
-          <w:rFonts w:asciiTheme="minorHAnsi" w:hAnsiTheme="minorHAnsi"/>
-          <w:lang w:val="en-US"/>
-        </w:rPr>
-      </w:pPr>
+      </w:pPr>
+      <w:r>
+        <w:t>Data Split / Validation Strategy Reproducibility - TBC</w:t>
+      </w:r>
     </w:p>
     <w:p>
       <w:pPr>
+        <w:pStyle w:val="FirstParagraph"/>
+        <w:rPr>
+          <w:rFonts w:asciiTheme="minorHAnsi" w:hAnsiTheme="minorHAnsi"/>
+          <w:color w:val="FF0000"/>
+        </w:rPr>
+      </w:pPr>
+      <w:r>
+        <w:rPr>
+          <w:rFonts w:asciiTheme="minorHAnsi" w:hAnsiTheme="minorHAnsi"/>
+        </w:rPr>
+        <w:t xml:space="preserve">The download of the raw dataset and uploading to the GCS bucket </w:t>
+      </w:r>
+      <w:r>
+        <w:rPr>
+          <w:rFonts w:asciiTheme="minorHAnsi" w:hAnsiTheme="minorHAnsi"/>
+        </w:rPr>
+        <w:t>will</w:t>
+      </w:r>
+      <w:r>
+        <w:rPr>
+          <w:rFonts w:asciiTheme="minorHAnsi" w:hAnsiTheme="minorHAnsi"/>
+        </w:rPr>
+        <w:t xml:space="preserve"> be reproduced using the related Jupyter notebook listed below which is maintained within the Git</w:t>
+      </w:r>
+      <w:r>
+        <w:rPr>
+          <w:rFonts w:asciiTheme="minorHAnsi" w:hAnsiTheme="minorHAnsi"/>
+        </w:rPr>
+        <w:t>H</w:t>
+      </w:r>
+      <w:r>
+        <w:rPr>
+          <w:rFonts w:asciiTheme="minorHAnsi" w:hAnsiTheme="minorHAnsi"/>
+        </w:rPr>
+        <w:t xml:space="preserve">ub repo and designed to run in </w:t>
+      </w:r>
+      <w:r>
+        <w:rPr>
+          <w:rFonts w:asciiTheme="minorHAnsi" w:hAnsiTheme="minorHAnsi"/>
+          <w:b/>
+          <w:bCs/>
+        </w:rPr>
+        <w:t>Google Colab</w:t>
+      </w:r>
+      <w:r>
+        <w:rPr>
+          <w:rFonts w:asciiTheme="minorHAnsi" w:hAnsiTheme="minorHAnsi"/>
+          <w:b/>
+          <w:bCs/>
+        </w:rPr>
+        <w:t xml:space="preserve"> – </w:t>
+      </w:r>
+      <w:r>
+        <w:rPr>
+          <w:rFonts w:asciiTheme="minorHAnsi" w:hAnsiTheme="minorHAnsi"/>
+          <w:b/>
+          <w:bCs/>
+          <w:color w:val="FF0000"/>
+        </w:rPr>
+        <w:t>this notebook is yet to be created but will add in future phases</w:t>
+      </w:r>
+    </w:p>
+    <w:tbl>
+      <w:tblPr>
+        <w:tblStyle w:val="TableGrid"/>
+        <w:tblW w:w="0" w:type="auto"/>
+        <w:tblLook w:val="04A0" w:firstRow="1" w:lastRow="0" w:firstColumn="1" w:lastColumn="0" w:noHBand="0" w:noVBand="1"/>
+      </w:tblPr>
+      <w:tblGrid>
+        <w:gridCol w:w="4508"/>
+        <w:gridCol w:w="4508"/>
+      </w:tblGrid>
+      <w:tr>
+        <w:tc>
+          <w:tcPr>
+            <w:tcW w:w="4508" w:type="dxa"/>
+            <w:shd w:val="clear" w:color="auto" w:fill="E8E8E8" w:themeFill="background2"/>
+          </w:tcPr>
+          <w:p>
+            <w:pPr>
+              <w:rPr>
+                <w:b/>
+                <w:bCs/>
+                <w:color w:val="156082" w:themeColor="accent1"/>
+                <w:lang w:val="en-US"/>
+              </w:rPr>
+            </w:pPr>
+            <w:r>
+              <w:rPr>
+                <w:b/>
+                <w:bCs/>
+                <w:color w:val="156082" w:themeColor="accent1"/>
+                <w:lang w:val="en-US"/>
+              </w:rPr>
+              <w:t>Item</w:t>
+            </w:r>
+          </w:p>
+        </w:tc>
+        <w:tc>
+          <w:tcPr>
+            <w:tcW w:w="4508" w:type="dxa"/>
+            <w:shd w:val="clear" w:color="auto" w:fill="E8E8E8" w:themeFill="background2"/>
+          </w:tcPr>
+          <w:p>
+            <w:pPr>
+              <w:rPr>
+                <w:b/>
+                <w:bCs/>
+                <w:color w:val="156082" w:themeColor="accent1"/>
+                <w:lang w:val="en-US"/>
+              </w:rPr>
+            </w:pPr>
+            <w:r>
+              <w:rPr>
+                <w:b/>
+                <w:bCs/>
+                <w:color w:val="156082" w:themeColor="accent1"/>
+                <w:lang w:val="en-US"/>
+              </w:rPr>
+              <w:t>Details</w:t>
+            </w:r>
+          </w:p>
+        </w:tc>
+      </w:tr>
+      <w:tr>
+        <w:tc>
+          <w:tcPr>
+            <w:tcW w:w="4508" w:type="dxa"/>
+            <w:shd w:val="clear" w:color="auto" w:fill="auto"/>
+          </w:tcPr>
+          <w:p>
+            <w:pPr>
+              <w:pStyle w:val="BodyText"/>
+              <w:rPr>
+                <w:rFonts w:asciiTheme="minorHAnsi" w:hAnsiTheme="minorHAnsi"/>
+              </w:rPr>
+            </w:pPr>
+            <w:r>
+              <w:rPr>
+                <w:rFonts w:asciiTheme="minorHAnsi" w:hAnsiTheme="minorHAnsi"/>
+              </w:rPr>
+              <w:t>Notebook</w:t>
+            </w:r>
+          </w:p>
+        </w:tc>
+        <w:tc>
+          <w:tcPr>
+            <w:tcW w:w="4508" w:type="dxa"/>
+            <w:shd w:val="clear" w:color="auto" w:fill="auto"/>
+          </w:tcPr>
+          <w:p>
+            <w:pPr>
+              <w:pStyle w:val="BodyText"/>
+              <w:rPr>
+                <w:rFonts w:asciiTheme="minorHAnsi" w:hAnsiTheme="minorHAnsi"/>
+              </w:rPr>
+            </w:pPr>
+            <w:r>
+              <w:rPr>
+                <w:rStyle w:val="VerbatimChar"/>
+                <w:rFonts w:asciiTheme="minorHAnsi" w:hAnsiTheme="minorHAnsi"/>
+                <w:sz w:val="21"/>
+              </w:rPr>
+              <w:t>notebooks/</w:t>
+            </w:r>
+          </w:p>
+        </w:tc>
+      </w:tr>
+      <w:tr>
+        <w:trPr>
+          <w:trHeight w:val="63"/>
+        </w:trPr>
+        <w:tc>
+          <w:tcPr>
+            <w:tcW w:w="4508" w:type="dxa"/>
+            <w:shd w:val="clear" w:color="auto" w:fill="auto"/>
+          </w:tcPr>
+          <w:p>
+            <w:pPr>
+              <w:pStyle w:val="BodyText"/>
+              <w:rPr>
+                <w:rFonts w:asciiTheme="minorHAnsi" w:hAnsiTheme="minorHAnsi"/>
+              </w:rPr>
+            </w:pPr>
+            <w:r>
+              <w:rPr>
+                <w:rFonts w:asciiTheme="minorHAnsi" w:hAnsiTheme="minorHAnsi"/>
+              </w:rPr>
+              <w:t>Purpose</w:t>
+            </w:r>
+          </w:p>
+        </w:tc>
+        <w:tc>
+          <w:tcPr>
+            <w:tcW w:w="4508" w:type="dxa"/>
+            <w:shd w:val="clear" w:color="auto" w:fill="auto"/>
+          </w:tcPr>
+          <w:p>
+            <w:pPr>
+              <w:pStyle w:val="BodyText"/>
+              <w:rPr>
+                <w:rFonts w:asciiTheme="minorHAnsi" w:hAnsiTheme="minorHAnsi"/>
+              </w:rPr>
+            </w:pPr>
+          </w:p>
+        </w:tc>
+      </w:tr>
+      <w:tr>
+        <w:trPr>
+          <w:trHeight w:val="63"/>
+        </w:trPr>
+        <w:tc>
+          <w:tcPr>
+            <w:tcW w:w="4508" w:type="dxa"/>
+            <w:shd w:val="clear" w:color="auto" w:fill="auto"/>
+          </w:tcPr>
+          <w:p>
+            <w:pPr>
+              <w:pStyle w:val="BodyText"/>
+              <w:rPr>
+                <w:rFonts w:asciiTheme="minorHAnsi" w:hAnsiTheme="minorHAnsi"/>
+              </w:rPr>
+            </w:pPr>
+            <w:r>
+              <w:rPr>
+                <w:rFonts w:asciiTheme="minorHAnsi" w:hAnsiTheme="minorHAnsi"/>
+              </w:rPr>
+              <w:t>Output</w:t>
+            </w:r>
+          </w:p>
+        </w:tc>
+        <w:tc>
+          <w:tcPr>
+            <w:tcW w:w="4508" w:type="dxa"/>
+            <w:shd w:val="clear" w:color="auto" w:fill="auto"/>
+          </w:tcPr>
+          <w:p>
+            <w:pPr>
+              <w:pStyle w:val="BodyText"/>
+              <w:rPr>
+                <w:rStyle w:val="VerbatimChar"/>
+                <w:rFonts w:asciiTheme="minorHAnsi" w:hAnsiTheme="minorHAnsi"/>
+                <w:sz w:val="21"/>
+              </w:rPr>
+            </w:pPr>
+            <w:r>
+              <w:rPr>
+                <w:rStyle w:val="VerbatimChar"/>
+                <w:rFonts w:asciiTheme="minorHAnsi" w:hAnsiTheme="minorHAnsi"/>
+                <w:sz w:val="21"/>
+              </w:rPr>
+              <w:t xml:space="preserve">Public URL </w:t>
+            </w:r>
+            <w:r>
+              <w:rPr>
+                <w:rStyle w:val="VerbatimChar"/>
+                <w:rFonts w:asciiTheme="minorHAnsi" w:hAnsiTheme="minorHAnsi"/>
+                <w:sz w:val="21"/>
+              </w:rPr>
+              <w:t>-</w:t>
+            </w:r>
+          </w:p>
+          <w:p>
+            <w:pPr>
+              <w:pStyle w:val="BodyText"/>
+              <w:rPr>
+                <w:rFonts w:asciiTheme="minorHAnsi" w:hAnsiTheme="minorHAnsi"/>
+              </w:rPr>
+            </w:pPr>
+            <w:r>
+              <w:rPr>
+                <w:rStyle w:val="VerbatimChar"/>
+                <w:rFonts w:asciiTheme="minorHAnsi" w:hAnsiTheme="minorHAnsi"/>
+                <w:sz w:val="21"/>
+              </w:rPr>
+              <w:t xml:space="preserve">Cloud Storage URI - </w:t>
+            </w:r>
+          </w:p>
+        </w:tc>
+      </w:tr>
+      <w:tr>
+        <w:trPr>
+          <w:trHeight w:val="63"/>
+        </w:trPr>
+        <w:tc>
+          <w:tcPr>
+            <w:tcW w:w="4508" w:type="dxa"/>
+            <w:shd w:val="clear" w:color="auto" w:fill="auto"/>
+          </w:tcPr>
+          <w:p>
+            <w:pPr>
+              <w:pStyle w:val="BodyText"/>
+              <w:rPr>
+                <w:rFonts w:asciiTheme="minorHAnsi" w:hAnsiTheme="minorHAnsi"/>
+              </w:rPr>
+            </w:pPr>
+            <w:r>
+              <w:rPr>
+                <w:rFonts w:asciiTheme="minorHAnsi" w:hAnsiTheme="minorHAnsi"/>
+              </w:rPr>
+              <w:t>Recommended Runtime</w:t>
+            </w:r>
+          </w:p>
+        </w:tc>
+        <w:tc>
+          <w:tcPr>
+            <w:tcW w:w="4508" w:type="dxa"/>
+            <w:shd w:val="clear" w:color="auto" w:fill="auto"/>
+          </w:tcPr>
+          <w:p>
+            <w:pPr>
+              <w:pStyle w:val="BodyText"/>
+              <w:rPr>
+                <w:rStyle w:val="VerbatimChar"/>
+                <w:rFonts w:asciiTheme="minorHAnsi" w:hAnsiTheme="minorHAnsi"/>
+                <w:sz w:val="21"/>
+              </w:rPr>
+            </w:pPr>
+            <w:r>
+              <w:rPr>
+                <w:rStyle w:val="VerbatimChar"/>
+                <w:rFonts w:asciiTheme="minorHAnsi" w:hAnsiTheme="minorHAnsi"/>
+                <w:sz w:val="21"/>
+              </w:rPr>
+              <w:t>Google Colab</w:t>
+            </w:r>
+          </w:p>
+        </w:tc>
+      </w:tr>
+      <w:tr>
+        <w:trPr>
+          <w:trHeight w:val="63"/>
+        </w:trPr>
+        <w:tc>
+          <w:tcPr>
+            <w:tcW w:w="4508" w:type="dxa"/>
+            <w:shd w:val="clear" w:color="auto" w:fill="auto"/>
+          </w:tcPr>
+          <w:p>
+            <w:pPr>
+              <w:pStyle w:val="BodyText"/>
+              <w:rPr>
+                <w:rFonts w:asciiTheme="minorHAnsi" w:hAnsiTheme="minorHAnsi"/>
+              </w:rPr>
+            </w:pPr>
+            <w:r>
+              <w:rPr>
+                <w:rFonts w:asciiTheme="minorHAnsi" w:hAnsiTheme="minorHAnsi"/>
+              </w:rPr>
+              <w:lastRenderedPageBreak/>
+              <w:t>Requirements</w:t>
+            </w:r>
+          </w:p>
+        </w:tc>
+        <w:tc>
+          <w:tcPr>
+            <w:tcW w:w="4508" w:type="dxa"/>
+            <w:shd w:val="clear" w:color="auto" w:fill="auto"/>
+          </w:tcPr>
+          <w:p>
+            <w:pPr>
+              <w:pStyle w:val="BodyText"/>
+              <w:numPr>
+                <w:ilvl w:val="0"/>
+                <w:numId w:val="6"/>
+              </w:numPr>
+              <w:rPr>
+                <w:rStyle w:val="VerbatimChar"/>
+                <w:rFonts w:asciiTheme="minorHAnsi" w:hAnsiTheme="minorHAnsi"/>
+                <w:sz w:val="21"/>
+              </w:rPr>
+            </w:pPr>
+            <w:r>
+              <w:rPr>
+                <w:rStyle w:val="VerbatimChar"/>
+                <w:rFonts w:asciiTheme="minorHAnsi" w:hAnsiTheme="minorHAnsi"/>
+                <w:sz w:val="21"/>
+              </w:rPr>
+              <w:t>Access to Git</w:t>
+            </w:r>
+            <w:r>
+              <w:rPr>
+                <w:rStyle w:val="VerbatimChar"/>
+                <w:rFonts w:asciiTheme="minorHAnsi" w:hAnsiTheme="minorHAnsi"/>
+                <w:sz w:val="21"/>
+              </w:rPr>
+              <w:t>H</w:t>
+            </w:r>
+            <w:r>
+              <w:rPr>
+                <w:rStyle w:val="VerbatimChar"/>
+                <w:rFonts w:asciiTheme="minorHAnsi" w:hAnsiTheme="minorHAnsi"/>
+                <w:sz w:val="21"/>
+              </w:rPr>
+              <w:t>ub repo</w:t>
+            </w:r>
+          </w:p>
+          <w:p>
+            <w:pPr>
+              <w:pStyle w:val="BodyText"/>
+              <w:numPr>
+                <w:ilvl w:val="0"/>
+                <w:numId w:val="6"/>
+              </w:numPr>
+              <w:rPr>
+                <w:rStyle w:val="VerbatimChar"/>
+                <w:rFonts w:asciiTheme="minorHAnsi" w:hAnsiTheme="minorHAnsi"/>
+                <w:sz w:val="21"/>
+              </w:rPr>
+            </w:pPr>
+            <w:r>
+              <w:rPr>
+                <w:rStyle w:val="VerbatimChar"/>
+                <w:rFonts w:asciiTheme="minorHAnsi" w:hAnsiTheme="minorHAnsi"/>
+                <w:sz w:val="21"/>
+              </w:rPr>
+              <w:t>Google Colab</w:t>
+            </w:r>
+          </w:p>
+          <w:p>
+            <w:pPr>
+              <w:pStyle w:val="BodyText"/>
+              <w:numPr>
+                <w:ilvl w:val="0"/>
+                <w:numId w:val="6"/>
+              </w:numPr>
+              <w:rPr>
+                <w:rStyle w:val="VerbatimChar"/>
+                <w:rFonts w:asciiTheme="minorHAnsi" w:hAnsiTheme="minorHAnsi"/>
+                <w:sz w:val="21"/>
+              </w:rPr>
+            </w:pPr>
+            <w:r>
+              <w:rPr>
+                <w:rStyle w:val="VerbatimChar"/>
+                <w:rFonts w:asciiTheme="minorHAnsi" w:hAnsiTheme="minorHAnsi"/>
+                <w:sz w:val="21"/>
+              </w:rPr>
+              <w:t>Google Cloud Authentication</w:t>
+            </w:r>
+          </w:p>
+          <w:p>
+            <w:pPr>
+              <w:pStyle w:val="BodyText"/>
+              <w:numPr>
+                <w:ilvl w:val="0"/>
+                <w:numId w:val="6"/>
+              </w:numPr>
+              <w:rPr>
+                <w:rStyle w:val="VerbatimChar"/>
+                <w:rFonts w:asciiTheme="minorHAnsi" w:hAnsiTheme="minorHAnsi"/>
+                <w:sz w:val="21"/>
+              </w:rPr>
+            </w:pPr>
+            <w:r>
+              <w:rPr>
+                <w:rStyle w:val="VerbatimChar"/>
+                <w:rFonts w:asciiTheme="minorHAnsi" w:hAnsiTheme="minorHAnsi"/>
+                <w:sz w:val="21"/>
+              </w:rPr>
+              <w:t>Packages listed in requirements.txt if not using Google Colab</w:t>
+            </w:r>
+          </w:p>
+        </w:tc>
+      </w:tr>
+    </w:tbl>
+    <w:p>
+      <w:pPr>
+        <w:pStyle w:val="BodyText"/>
+        <w:rPr>
+          <w:rFonts w:asciiTheme="minorHAnsi" w:hAnsiTheme="minorHAnsi"/>
+        </w:rPr>
+      </w:pPr>
+    </w:p>
+    <w:p>
+      <w:pPr>
+        <w:pStyle w:val="BodyText"/>
+        <w:rPr>
+          <w:rFonts w:asciiTheme="minorHAnsi" w:hAnsiTheme="minorHAnsi"/>
+        </w:rPr>
+      </w:pPr>
+    </w:p>
+    <w:p>
+      <w:pPr>
+        <w:pStyle w:val="Heading2"/>
+        <w:rPr>
+          <w:rFonts w:asciiTheme="minorHAnsi" w:hAnsiTheme="minorHAnsi"/>
+          <w:lang w:val="en-US"/>
+        </w:rPr>
+      </w:pPr>
+    </w:p>
+    <w:p>
+      <w:pPr>
         <w:pStyle w:val="Heading1"/>
         <w:rPr>
           <w:rFonts w:asciiTheme="minorHAnsi" w:hAnsiTheme="minorHAnsi"/>
           <w:lang w:val="en-US"/>
         </w:rPr>
       </w:pPr>
-      <w:bookmarkStart w:id="10" w:name="_Toc242021091"/>
+      <w:bookmarkStart w:id="10" w:name="_Toc242025029"/>
       <w:r>
         <w:rPr>
           <w:rFonts w:asciiTheme="minorHAnsi" w:hAnsiTheme="minorHAnsi"/>
@@ -4689,7 +5270,15 @@
           <w:i/>
           <w:color w:val="7F6000"/>
         </w:rPr>
-        <w:t>TODO - Features used by the AI system are clearly identified and described. It is possible to understand what each feature represents and how it is obtained or constructed.</w:t>
+        <w:t>Goal</w:t>
+      </w:r>
+      <w:r>
+        <w:rPr>
+          <w:rFonts w:asciiTheme="minorHAnsi" w:hAnsiTheme="minorHAnsi"/>
+          <w:i/>
+          <w:color w:val="7F6000"/>
+        </w:rPr>
+        <w:t xml:space="preserve"> - Features used by the AI system are clearly identified and described. It is possible to understand what each feature represents and how it is obtained or constructed.</w:t>
       </w:r>
     </w:p>
     <w:p>
@@ -4703,7 +5292,6 @@
         <w:rPr>
           <w:rFonts w:asciiTheme="minorHAnsi" w:hAnsiTheme="minorHAnsi"/>
         </w:rPr>
-        <w:lastRenderedPageBreak/>
         <w:t xml:space="preserve">The model </w:t>
       </w:r>
       <w:r>
@@ -4742,63 +5330,7 @@
         <w:rPr>
           <w:rFonts w:asciiTheme="minorHAnsi" w:hAnsiTheme="minorHAnsi"/>
         </w:rPr>
-        <w:t xml:space="preserve">. Other associated fields which can be used to derive delayed_15min value such as </w:t>
-      </w:r>
-      <w:proofErr w:type="spellStart"/>
-      <w:r>
-        <w:rPr>
-          <w:rFonts w:asciiTheme="minorHAnsi" w:hAnsiTheme="minorHAnsi"/>
-        </w:rPr>
-        <w:t>delay_min</w:t>
-      </w:r>
-      <w:proofErr w:type="spellEnd"/>
-      <w:r>
-        <w:rPr>
-          <w:rFonts w:asciiTheme="minorHAnsi" w:hAnsiTheme="minorHAnsi"/>
-        </w:rPr>
-        <w:t xml:space="preserve">, </w:t>
-      </w:r>
-      <w:proofErr w:type="spellStart"/>
-      <w:r>
-        <w:rPr>
-          <w:rFonts w:asciiTheme="minorHAnsi" w:hAnsiTheme="minorHAnsi"/>
-        </w:rPr>
-        <w:t>first_seen</w:t>
-      </w:r>
-      <w:proofErr w:type="spellEnd"/>
-      <w:r>
-        <w:rPr>
-          <w:rFonts w:asciiTheme="minorHAnsi" w:hAnsiTheme="minorHAnsi"/>
-        </w:rPr>
-        <w:t xml:space="preserve">, </w:t>
-      </w:r>
-      <w:proofErr w:type="spellStart"/>
-      <w:r>
-        <w:rPr>
-          <w:rFonts w:asciiTheme="minorHAnsi" w:hAnsiTheme="minorHAnsi"/>
-        </w:rPr>
-        <w:t>last_seen</w:t>
-      </w:r>
-      <w:proofErr w:type="spellEnd"/>
-      <w:r>
-        <w:rPr>
-          <w:rFonts w:asciiTheme="minorHAnsi" w:hAnsiTheme="minorHAnsi"/>
-        </w:rPr>
-        <w:t xml:space="preserve">, </w:t>
-      </w:r>
-      <w:proofErr w:type="spellStart"/>
-      <w:r>
-        <w:rPr>
-          <w:rFonts w:asciiTheme="minorHAnsi" w:hAnsiTheme="minorHAnsi"/>
-        </w:rPr>
-        <w:t>duration_min</w:t>
-      </w:r>
-      <w:proofErr w:type="spellEnd"/>
-      <w:r>
-        <w:rPr>
-          <w:rFonts w:asciiTheme="minorHAnsi" w:hAnsiTheme="minorHAnsi"/>
-        </w:rPr>
-        <w:t xml:space="preserve"> will also be excluded from the input fields for this reason.</w:t>
+        <w:t>. Other associated fields which can be used to derive delayed_15min value such as delay_min, first_seen, last_seen, duration_min will also be excluded from the input fields for this reason.</w:t>
       </w:r>
     </w:p>
     <w:p>
@@ -4948,14 +5480,12 @@
                 <w:rFonts w:asciiTheme="minorHAnsi" w:hAnsiTheme="minorHAnsi"/>
               </w:rPr>
             </w:pPr>
-            <w:proofErr w:type="spellStart"/>
             <w:r>
               <w:rPr>
                 <w:rFonts w:asciiTheme="minorHAnsi" w:hAnsiTheme="minorHAnsi"/>
               </w:rPr>
               <w:t>Dof</w:t>
             </w:r>
-            <w:proofErr w:type="spellEnd"/>
           </w:p>
         </w:tc>
         <w:tc>
@@ -5025,14 +5555,12 @@
                 <w:rFonts w:asciiTheme="minorHAnsi" w:hAnsiTheme="minorHAnsi"/>
               </w:rPr>
             </w:pPr>
-            <w:proofErr w:type="spellStart"/>
             <w:r>
               <w:rPr>
                 <w:rFonts w:asciiTheme="minorHAnsi" w:hAnsiTheme="minorHAnsi"/>
               </w:rPr>
               <w:t>Source_year</w:t>
             </w:r>
-            <w:proofErr w:type="spellEnd"/>
           </w:p>
         </w:tc>
         <w:tc>
@@ -5088,14 +5616,12 @@
                 <w:rFonts w:asciiTheme="minorHAnsi" w:hAnsiTheme="minorHAnsi"/>
               </w:rPr>
             </w:pPr>
-            <w:proofErr w:type="spellStart"/>
             <w:r>
               <w:rPr>
                 <w:rFonts w:asciiTheme="minorHAnsi" w:hAnsiTheme="minorHAnsi"/>
               </w:rPr>
               <w:t>Source_month</w:t>
             </w:r>
-            <w:proofErr w:type="spellEnd"/>
           </w:p>
         </w:tc>
         <w:tc>
@@ -5151,14 +5677,12 @@
                 <w:rFonts w:asciiTheme="minorHAnsi" w:hAnsiTheme="minorHAnsi"/>
               </w:rPr>
             </w:pPr>
-            <w:proofErr w:type="spellStart"/>
             <w:r>
               <w:rPr>
                 <w:rFonts w:asciiTheme="minorHAnsi" w:hAnsiTheme="minorHAnsi"/>
               </w:rPr>
               <w:t>Adep</w:t>
             </w:r>
-            <w:proofErr w:type="spellEnd"/>
           </w:p>
         </w:tc>
         <w:tc>
@@ -5291,6 +5815,7 @@
               <w:rPr>
                 <w:rFonts w:asciiTheme="minorHAnsi" w:hAnsiTheme="minorHAnsi"/>
               </w:rPr>
+              <w:lastRenderedPageBreak/>
               <w:t>Route</w:t>
             </w:r>
           </w:p>
@@ -5409,14 +5934,12 @@
                 <w:rFonts w:asciiTheme="minorHAnsi" w:hAnsiTheme="minorHAnsi"/>
               </w:rPr>
             </w:pPr>
-            <w:proofErr w:type="spellStart"/>
             <w:r>
               <w:rPr>
                 <w:rFonts w:asciiTheme="minorHAnsi" w:hAnsiTheme="minorHAnsi"/>
               </w:rPr>
               <w:t>typecode</w:t>
             </w:r>
-            <w:proofErr w:type="spellEnd"/>
           </w:p>
         </w:tc>
         <w:tc>
@@ -5472,14 +5995,12 @@
                 <w:rFonts w:asciiTheme="minorHAnsi" w:hAnsiTheme="minorHAnsi"/>
               </w:rPr>
             </w:pPr>
-            <w:proofErr w:type="spellStart"/>
             <w:r>
               <w:rPr>
                 <w:rFonts w:asciiTheme="minorHAnsi" w:hAnsiTheme="minorHAnsi"/>
               </w:rPr>
               <w:t>Icao_aircraft_class</w:t>
             </w:r>
-            <w:proofErr w:type="spellEnd"/>
           </w:p>
         </w:tc>
         <w:tc>
@@ -5535,14 +6056,12 @@
                 <w:rFonts w:asciiTheme="minorHAnsi" w:hAnsiTheme="minorHAnsi"/>
               </w:rPr>
             </w:pPr>
-            <w:proofErr w:type="spellStart"/>
             <w:r>
               <w:rPr>
                 <w:rFonts w:asciiTheme="minorHAnsi" w:hAnsiTheme="minorHAnsi"/>
               </w:rPr>
               <w:t>Expected_duration_min</w:t>
             </w:r>
-            <w:proofErr w:type="spellEnd"/>
           </w:p>
         </w:tc>
         <w:tc>
@@ -5610,13 +6129,12 @@
           <w:lang w:val="en-US"/>
         </w:rPr>
       </w:pPr>
-      <w:bookmarkStart w:id="11" w:name="_Toc242021092"/>
+      <w:bookmarkStart w:id="11" w:name="_Toc242025030"/>
       <w:r>
         <w:rPr>
           <w:rFonts w:asciiTheme="minorHAnsi" w:hAnsiTheme="minorHAnsi"/>
           <w:lang w:val="en-US"/>
         </w:rPr>
-        <w:lastRenderedPageBreak/>
         <w:t>8</w:t>
       </w:r>
       <w:r>
@@ -5649,7 +6167,15 @@
           <w:i/>
           <w:color w:val="7F6000"/>
         </w:rPr>
-        <w:t>TODO - Specifies relevant data types and formats (e.g., numerical, categorical, text, image; integer, float, string; CSV, JSON, Parquet, etc.) sufficiently to understand how the data will be handled.</w:t>
+        <w:t>Goal</w:t>
+      </w:r>
+      <w:r>
+        <w:rPr>
+          <w:rFonts w:asciiTheme="minorHAnsi" w:hAnsiTheme="minorHAnsi"/>
+          <w:i/>
+          <w:color w:val="7F6000"/>
+        </w:rPr>
+        <w:t xml:space="preserve"> - Specifies relevant data types and formats (e.g., numerical, categorical, text, image; integer, float, string; CSV, JSON, Parquet, etc.) sufficiently to understand how the data will be handled.</w:t>
       </w:r>
     </w:p>
     <w:p>
@@ -5705,21 +6231,7 @@
         <w:rPr>
           <w:rFonts w:asciiTheme="minorHAnsi" w:hAnsiTheme="minorHAnsi"/>
         </w:rPr>
-        <w:t xml:space="preserve">Integer fields, such as id, </w:t>
-      </w:r>
-      <w:proofErr w:type="spellStart"/>
-      <w:r>
-        <w:rPr>
-          <w:rFonts w:asciiTheme="minorHAnsi" w:hAnsiTheme="minorHAnsi"/>
-        </w:rPr>
-        <w:t>source_year</w:t>
-      </w:r>
-      <w:proofErr w:type="spellEnd"/>
-      <w:r>
-        <w:rPr>
-          <w:rFonts w:asciiTheme="minorHAnsi" w:hAnsiTheme="minorHAnsi"/>
-        </w:rPr>
-        <w:t>, and delayed_15min</w:t>
+        <w:t>Integer fields, such as id, source_year, and delayed_15min</w:t>
       </w:r>
     </w:p>
     <w:p>
@@ -5737,30 +6249,8 @@
         <w:rPr>
           <w:rFonts w:asciiTheme="minorHAnsi" w:hAnsiTheme="minorHAnsi"/>
         </w:rPr>
-        <w:t xml:space="preserve">Float fields, such as </w:t>
-      </w:r>
-      <w:proofErr w:type="spellStart"/>
-      <w:r>
-        <w:rPr>
-          <w:rFonts w:asciiTheme="minorHAnsi" w:hAnsiTheme="minorHAnsi"/>
-        </w:rPr>
-        <w:t>expected_duration_min</w:t>
-      </w:r>
-      <w:proofErr w:type="spellEnd"/>
-      <w:r>
-        <w:rPr>
-          <w:rFonts w:asciiTheme="minorHAnsi" w:hAnsiTheme="minorHAnsi"/>
-        </w:rPr>
-        <w:t xml:space="preserve"> and </w:t>
-      </w:r>
-      <w:proofErr w:type="spellStart"/>
-      <w:r>
-        <w:rPr>
-          <w:rFonts w:asciiTheme="minorHAnsi" w:hAnsiTheme="minorHAnsi"/>
-        </w:rPr>
-        <w:t>delay_min</w:t>
-      </w:r>
-      <w:proofErr w:type="spellEnd"/>
+        <w:t>Float fields, such as expected_duration_min and delay_min</w:t>
+      </w:r>
     </w:p>
     <w:p>
       <w:pPr>
@@ -5777,63 +6267,7 @@
         <w:rPr>
           <w:rFonts w:asciiTheme="minorHAnsi" w:hAnsiTheme="minorHAnsi"/>
         </w:rPr>
-        <w:t xml:space="preserve">String fields, such as </w:t>
-      </w:r>
-      <w:proofErr w:type="spellStart"/>
-      <w:r>
-        <w:rPr>
-          <w:rFonts w:asciiTheme="minorHAnsi" w:hAnsiTheme="minorHAnsi"/>
-        </w:rPr>
-        <w:t>adep</w:t>
-      </w:r>
-      <w:proofErr w:type="spellEnd"/>
-      <w:r>
-        <w:rPr>
-          <w:rFonts w:asciiTheme="minorHAnsi" w:hAnsiTheme="minorHAnsi"/>
-        </w:rPr>
-        <w:t xml:space="preserve">, </w:t>
-      </w:r>
-      <w:proofErr w:type="spellStart"/>
-      <w:r>
-        <w:rPr>
-          <w:rFonts w:asciiTheme="minorHAnsi" w:hAnsiTheme="minorHAnsi"/>
-        </w:rPr>
-        <w:t>ades</w:t>
-      </w:r>
-      <w:proofErr w:type="spellEnd"/>
-      <w:r>
-        <w:rPr>
-          <w:rFonts w:asciiTheme="minorHAnsi" w:hAnsiTheme="minorHAnsi"/>
-        </w:rPr>
-        <w:t xml:space="preserve">, model, </w:t>
-      </w:r>
-      <w:proofErr w:type="spellStart"/>
-      <w:r>
-        <w:rPr>
-          <w:rFonts w:asciiTheme="minorHAnsi" w:hAnsiTheme="minorHAnsi"/>
-        </w:rPr>
-        <w:t>typecode</w:t>
-      </w:r>
-      <w:proofErr w:type="spellEnd"/>
-      <w:r>
-        <w:rPr>
-          <w:rFonts w:asciiTheme="minorHAnsi" w:hAnsiTheme="minorHAnsi"/>
-        </w:rPr>
-        <w:t xml:space="preserve">, </w:t>
-      </w:r>
-      <w:proofErr w:type="spellStart"/>
-      <w:r>
-        <w:rPr>
-          <w:rFonts w:asciiTheme="minorHAnsi" w:hAnsiTheme="minorHAnsi"/>
-        </w:rPr>
-        <w:t>icao_operator</w:t>
-      </w:r>
-      <w:proofErr w:type="spellEnd"/>
-      <w:r>
-        <w:rPr>
-          <w:rFonts w:asciiTheme="minorHAnsi" w:hAnsiTheme="minorHAnsi"/>
-        </w:rPr>
-        <w:t>, and route</w:t>
+        <w:t>String fields, such as adep, ades, model, typecode, icao_operator, and route</w:t>
       </w:r>
     </w:p>
     <w:p>
@@ -5851,44 +6285,8 @@
         <w:rPr>
           <w:rFonts w:asciiTheme="minorHAnsi" w:hAnsiTheme="minorHAnsi"/>
         </w:rPr>
-        <w:t xml:space="preserve">Timestamp fields, such as </w:t>
-      </w:r>
-      <w:proofErr w:type="spellStart"/>
-      <w:r>
-        <w:rPr>
-          <w:rFonts w:asciiTheme="minorHAnsi" w:hAnsiTheme="minorHAnsi"/>
-        </w:rPr>
-        <w:t>dof</w:t>
-      </w:r>
-      <w:proofErr w:type="spellEnd"/>
-      <w:r>
-        <w:rPr>
-          <w:rFonts w:asciiTheme="minorHAnsi" w:hAnsiTheme="minorHAnsi"/>
-        </w:rPr>
-        <w:t xml:space="preserve">, </w:t>
-      </w:r>
-      <w:proofErr w:type="spellStart"/>
-      <w:r>
-        <w:rPr>
-          <w:rFonts w:asciiTheme="minorHAnsi" w:hAnsiTheme="minorHAnsi"/>
-        </w:rPr>
-        <w:t>first_seen</w:t>
-      </w:r>
-      <w:proofErr w:type="spellEnd"/>
-      <w:r>
-        <w:rPr>
-          <w:rFonts w:asciiTheme="minorHAnsi" w:hAnsiTheme="minorHAnsi"/>
-        </w:rPr>
-        <w:t xml:space="preserve">, and </w:t>
-      </w:r>
-      <w:proofErr w:type="spellStart"/>
-      <w:r>
-        <w:rPr>
-          <w:rFonts w:asciiTheme="minorHAnsi" w:hAnsiTheme="minorHAnsi"/>
-        </w:rPr>
-        <w:t>last_seen</w:t>
-      </w:r>
-      <w:proofErr w:type="spellEnd"/>
+        <w:t>Timestamp fields, such as dof, first_seen, and last_seen</w:t>
+      </w:r>
     </w:p>
     <w:p>
       <w:pPr>
@@ -5901,7 +6299,31 @@
         <w:rPr>
           <w:rFonts w:asciiTheme="minorHAnsi" w:hAnsiTheme="minorHAnsi"/>
         </w:rPr>
-        <w:t>These data types will be handled differently during analysis and modelling. Numerical fields can be used directly or transformed where appropriate. Categorical string fields, such as airports, aircraft type, operator, and route, will need to be encoded before they can be used by most machine learning models. Timestamp fields may be used to create derived features, such as year, month, day of week, or seasonal patterns.</w:t>
+        <w:t>These data types will be handled differently during analysis and modelling. Numerical fields can be used directly or transformed where appropriate. Categorical string fields, such as airports, aircraft type, operator, and route, will need to be encoded before they can be used by most machine learning models. Timestamp fields may be used to create derived features</w:t>
+      </w:r>
+      <w:r>
+        <w:rPr>
+          <w:rFonts w:asciiTheme="minorHAnsi" w:hAnsiTheme="minorHAnsi"/>
+        </w:rPr>
+        <w:t xml:space="preserve"> </w:t>
+      </w:r>
+      <w:r>
+        <w:rPr>
+          <w:rFonts w:asciiTheme="minorHAnsi" w:hAnsiTheme="minorHAnsi"/>
+        </w:rPr>
+        <w:t>such as day of week</w:t>
+      </w:r>
+      <w:r>
+        <w:rPr>
+          <w:rFonts w:asciiTheme="minorHAnsi" w:hAnsiTheme="minorHAnsi"/>
+        </w:rPr>
+        <w:t xml:space="preserve"> </w:t>
+      </w:r>
+      <w:r>
+        <w:rPr>
+          <w:rFonts w:asciiTheme="minorHAnsi" w:hAnsiTheme="minorHAnsi"/>
+        </w:rPr>
+        <w:t>or seasonal patterns.</w:t>
       </w:r>
     </w:p>
     <w:p>
@@ -5916,6 +6338,12 @@
           <w:rFonts w:asciiTheme="minorHAnsi" w:hAnsiTheme="minorHAnsi"/>
         </w:rPr>
         <w:t>The main target variable is delayed_15min, which is an integer field with values of 0 or 1. A value of 1 means the flight was delayed by at least 15 minutes, while a value of 0 means it was not. This will be used as the output variable for the binary classification mode</w:t>
+      </w:r>
+      <w:r>
+        <w:rPr>
+          <w:rFonts w:asciiTheme="minorHAnsi" w:hAnsiTheme="minorHAnsi"/>
+        </w:rPr>
+        <w:t>l.</w:t>
       </w:r>
     </w:p>
     <w:p>
@@ -5983,6 +6411,7 @@
                 <w:color w:val="156082" w:themeColor="accent1"/>
                 <w:lang w:val="en-US"/>
               </w:rPr>
+              <w:lastRenderedPageBreak/>
               <w:t>Column</w:t>
             </w:r>
           </w:p>
@@ -6159,7 +6588,6 @@
                 <w:rFonts w:asciiTheme="minorHAnsi" w:hAnsiTheme="minorHAnsi"/>
               </w:rPr>
             </w:pPr>
-            <w:proofErr w:type="spellStart"/>
             <w:r>
               <w:rPr>
                 <w:rStyle w:val="VerbatimChar"/>
@@ -6168,7 +6596,6 @@
               </w:rPr>
               <w:t>dof</w:t>
             </w:r>
-            <w:proofErr w:type="spellEnd"/>
           </w:p>
         </w:tc>
         <w:tc>
@@ -6244,7 +6671,6 @@
                 <w:rFonts w:asciiTheme="minorHAnsi" w:hAnsiTheme="minorHAnsi"/>
               </w:rPr>
             </w:pPr>
-            <w:proofErr w:type="spellStart"/>
             <w:r>
               <w:rPr>
                 <w:rStyle w:val="VerbatimChar"/>
@@ -6253,7 +6679,6 @@
               </w:rPr>
               <w:t>adep</w:t>
             </w:r>
-            <w:proofErr w:type="spellEnd"/>
           </w:p>
         </w:tc>
         <w:tc>
@@ -6329,7 +6754,6 @@
                 <w:rFonts w:asciiTheme="minorHAnsi" w:hAnsiTheme="minorHAnsi"/>
               </w:rPr>
             </w:pPr>
-            <w:proofErr w:type="spellStart"/>
             <w:r>
               <w:rPr>
                 <w:rStyle w:val="VerbatimChar"/>
@@ -6338,7 +6762,6 @@
               </w:rPr>
               <w:t>ades</w:t>
             </w:r>
-            <w:proofErr w:type="spellEnd"/>
           </w:p>
         </w:tc>
         <w:tc>
@@ -6414,7 +6837,6 @@
                 <w:rFonts w:asciiTheme="minorHAnsi" w:hAnsiTheme="minorHAnsi"/>
               </w:rPr>
             </w:pPr>
-            <w:proofErr w:type="spellStart"/>
             <w:r>
               <w:rPr>
                 <w:rStyle w:val="VerbatimChar"/>
@@ -6423,7 +6845,6 @@
               </w:rPr>
               <w:t>typecode</w:t>
             </w:r>
-            <w:proofErr w:type="spellEnd"/>
           </w:p>
         </w:tc>
         <w:tc>
@@ -6582,17 +7003,14 @@
                 <w:rFonts w:asciiTheme="minorHAnsi" w:hAnsiTheme="minorHAnsi"/>
               </w:rPr>
             </w:pPr>
-            <w:proofErr w:type="spellStart"/>
             <w:r>
               <w:rPr>
                 <w:rStyle w:val="VerbatimChar"/>
                 <w:rFonts w:asciiTheme="minorHAnsi" w:hAnsiTheme="minorHAnsi"/>
                 <w:sz w:val="21"/>
               </w:rPr>
-              <w:lastRenderedPageBreak/>
               <w:t>source_month</w:t>
             </w:r>
-            <w:proofErr w:type="spellEnd"/>
           </w:p>
         </w:tc>
         <w:tc>
@@ -6668,7 +7086,6 @@
                 <w:rFonts w:asciiTheme="minorHAnsi" w:hAnsiTheme="minorHAnsi"/>
               </w:rPr>
             </w:pPr>
-            <w:proofErr w:type="spellStart"/>
             <w:r>
               <w:rPr>
                 <w:rStyle w:val="VerbatimChar"/>
@@ -6677,7 +7094,6 @@
               </w:rPr>
               <w:t>source_year</w:t>
             </w:r>
-            <w:proofErr w:type="spellEnd"/>
           </w:p>
         </w:tc>
         <w:tc>
@@ -6753,7 +7169,6 @@
                 <w:rFonts w:asciiTheme="minorHAnsi" w:hAnsiTheme="minorHAnsi"/>
               </w:rPr>
             </w:pPr>
-            <w:proofErr w:type="spellStart"/>
             <w:r>
               <w:rPr>
                 <w:rStyle w:val="VerbatimChar"/>
@@ -6762,7 +7177,6 @@
               </w:rPr>
               <w:t>expected_duration_min</w:t>
             </w:r>
-            <w:proofErr w:type="spellEnd"/>
           </w:p>
         </w:tc>
         <w:tc>
@@ -6838,7 +7252,6 @@
                 <w:rFonts w:asciiTheme="minorHAnsi" w:hAnsiTheme="minorHAnsi"/>
               </w:rPr>
             </w:pPr>
-            <w:proofErr w:type="spellStart"/>
             <w:r>
               <w:rPr>
                 <w:rStyle w:val="VerbatimChar"/>
@@ -6847,7 +7260,6 @@
               </w:rPr>
               <w:t>delay_min</w:t>
             </w:r>
-            <w:proofErr w:type="spellEnd"/>
           </w:p>
         </w:tc>
         <w:tc>
@@ -7248,6 +7660,7 @@
                 <w:rFonts w:asciiTheme="minorHAnsi" w:hAnsiTheme="minorHAnsi"/>
                 <w:sz w:val="21"/>
               </w:rPr>
+              <w:lastRenderedPageBreak/>
               <w:t>icao24</w:t>
             </w:r>
           </w:p>
@@ -7326,7 +7739,6 @@
                 <w:sz w:val="21"/>
               </w:rPr>
             </w:pPr>
-            <w:proofErr w:type="spellStart"/>
             <w:r>
               <w:rPr>
                 <w:rStyle w:val="VerbatimChar"/>
@@ -7335,7 +7747,6 @@
               </w:rPr>
               <w:t>Icao_operator</w:t>
             </w:r>
-            <w:proofErr w:type="spellEnd"/>
           </w:p>
         </w:tc>
         <w:tc>
@@ -7514,7 +7925,6 @@
                 <w:sz w:val="21"/>
               </w:rPr>
             </w:pPr>
-            <w:proofErr w:type="spellStart"/>
             <w:r>
               <w:rPr>
                 <w:rStyle w:val="VerbatimChar"/>
@@ -7523,7 +7933,6 @@
               </w:rPr>
               <w:t>icao_aircraft_class</w:t>
             </w:r>
-            <w:proofErr w:type="spellEnd"/>
           </w:p>
         </w:tc>
         <w:tc>
@@ -7605,7 +8014,6 @@
                 <w:rFonts w:asciiTheme="minorHAnsi" w:hAnsiTheme="minorHAnsi"/>
               </w:rPr>
             </w:pPr>
-            <w:proofErr w:type="spellStart"/>
             <w:r>
               <w:rPr>
                 <w:rStyle w:val="VerbatimChar"/>
@@ -7614,7 +8022,6 @@
               </w:rPr>
               <w:t>flt_id</w:t>
             </w:r>
-            <w:proofErr w:type="spellEnd"/>
           </w:p>
         </w:tc>
         <w:tc>
@@ -7690,7 +8097,6 @@
                 <w:rFonts w:asciiTheme="minorHAnsi" w:hAnsiTheme="minorHAnsi"/>
               </w:rPr>
             </w:pPr>
-            <w:proofErr w:type="spellStart"/>
             <w:r>
               <w:rPr>
                 <w:rStyle w:val="VerbatimChar"/>
@@ -7699,7 +8105,6 @@
               </w:rPr>
               <w:t>adep_p</w:t>
             </w:r>
-            <w:proofErr w:type="spellEnd"/>
           </w:p>
         </w:tc>
         <w:tc>
@@ -7775,17 +8180,14 @@
                 <w:rFonts w:asciiTheme="minorHAnsi" w:hAnsiTheme="minorHAnsi"/>
               </w:rPr>
             </w:pPr>
-            <w:proofErr w:type="spellStart"/>
             <w:r>
               <w:rPr>
                 <w:rStyle w:val="VerbatimChar"/>
                 <w:rFonts w:asciiTheme="minorHAnsi" w:hAnsiTheme="minorHAnsi"/>
                 <w:sz w:val="21"/>
               </w:rPr>
-              <w:lastRenderedPageBreak/>
               <w:t>ades_p</w:t>
             </w:r>
-            <w:proofErr w:type="spellEnd"/>
           </w:p>
         </w:tc>
         <w:tc>
@@ -7944,7 +8346,6 @@
                 <w:rFonts w:asciiTheme="minorHAnsi" w:hAnsiTheme="minorHAnsi"/>
               </w:rPr>
             </w:pPr>
-            <w:proofErr w:type="spellStart"/>
             <w:r>
               <w:rPr>
                 <w:rStyle w:val="VerbatimChar"/>
@@ -7953,7 +8354,6 @@
               </w:rPr>
               <w:t>first_seen</w:t>
             </w:r>
-            <w:proofErr w:type="spellEnd"/>
           </w:p>
         </w:tc>
         <w:tc>
@@ -8029,7 +8429,6 @@
                 <w:rFonts w:asciiTheme="minorHAnsi" w:hAnsiTheme="minorHAnsi"/>
               </w:rPr>
             </w:pPr>
-            <w:proofErr w:type="spellStart"/>
             <w:r>
               <w:rPr>
                 <w:rStyle w:val="VerbatimChar"/>
@@ -8038,7 +8437,6 @@
               </w:rPr>
               <w:t>last_seen</w:t>
             </w:r>
-            <w:proofErr w:type="spellEnd"/>
           </w:p>
         </w:tc>
         <w:tc>
@@ -8114,7 +8512,6 @@
                 <w:rFonts w:asciiTheme="minorHAnsi" w:hAnsiTheme="minorHAnsi"/>
               </w:rPr>
             </w:pPr>
-            <w:proofErr w:type="spellStart"/>
             <w:r>
               <w:rPr>
                 <w:rStyle w:val="VerbatimChar"/>
@@ -8123,7 +8520,6 @@
               </w:rPr>
               <w:t>unix_time</w:t>
             </w:r>
-            <w:proofErr w:type="spellEnd"/>
           </w:p>
         </w:tc>
         <w:tc>
@@ -8199,7 +8595,6 @@
                 <w:rFonts w:asciiTheme="minorHAnsi" w:hAnsiTheme="minorHAnsi"/>
               </w:rPr>
             </w:pPr>
-            <w:proofErr w:type="spellStart"/>
             <w:r>
               <w:rPr>
                 <w:rStyle w:val="VerbatimChar"/>
@@ -8208,7 +8603,6 @@
               </w:rPr>
               <w:t>duration_min</w:t>
             </w:r>
-            <w:proofErr w:type="spellEnd"/>
           </w:p>
         </w:tc>
         <w:tc>
@@ -8308,7 +8702,7 @@
           <w:lang w:val="en-US"/>
         </w:rPr>
       </w:pPr>
-      <w:bookmarkStart w:id="12" w:name="_Toc242021093"/>
+      <w:bookmarkStart w:id="12" w:name="_Toc242025031"/>
       <w:r>
         <w:rPr>
           <w:rFonts w:asciiTheme="minorHAnsi" w:hAnsiTheme="minorHAnsi"/>
@@ -8346,7 +8740,15 @@
           <w:i/>
           <w:color w:val="7F6000"/>
         </w:rPr>
-        <w:t>TODO - Describes how the data collection process can be reproduced, including data sources, collection procedures, relevant parameters/settings, and/or code where appropriate.</w:t>
+        <w:t>Goal</w:t>
+      </w:r>
+      <w:r>
+        <w:rPr>
+          <w:rFonts w:asciiTheme="minorHAnsi" w:hAnsiTheme="minorHAnsi"/>
+          <w:i/>
+          <w:color w:val="7F6000"/>
+        </w:rPr>
+        <w:t xml:space="preserve"> - Describes how the data collection process can be reproduced, including data sources, collection procedures, relevant parameters/settings, and/or code where appropriate.</w:t>
       </w:r>
     </w:p>
     <w:p>
@@ -8354,6 +8756,7 @@
         <w:pStyle w:val="BodyText"/>
       </w:pPr>
       <w:r>
+        <w:lastRenderedPageBreak/>
         <w:t xml:space="preserve">As previously mentioned a decision was made to include a </w:t>
       </w:r>
       <w:r>
@@ -8542,7 +8945,6 @@
                 <w:rFonts w:asciiTheme="minorHAnsi" w:hAnsiTheme="minorHAnsi"/>
               </w:rPr>
             </w:pPr>
-            <w:proofErr w:type="spellStart"/>
             <w:r>
               <w:rPr>
                 <w:rStyle w:val="VerbatimChar"/>
@@ -8557,30 +8959,37 @@
                 <w:rFonts w:asciiTheme="minorHAnsi" w:hAnsiTheme="minorHAnsi"/>
                 <w:sz w:val="21"/>
               </w:rPr>
-              <w:t>month</w:t>
-            </w:r>
-            <w:proofErr w:type="spellEnd"/>
+              <w:t xml:space="preserve">month </w:t>
+            </w:r>
+            <w:r>
+              <w:rPr>
+                <w:rFonts w:asciiTheme="minorHAnsi" w:hAnsiTheme="minorHAnsi"/>
+              </w:rPr>
+              <w:t xml:space="preserve">and </w:t>
+            </w:r>
             <w:r>
               <w:rPr>
                 <w:rStyle w:val="VerbatimChar"/>
                 <w:rFonts w:asciiTheme="minorHAnsi" w:hAnsiTheme="minorHAnsi"/>
                 <w:sz w:val="21"/>
               </w:rPr>
+              <w:t>delayed_15min</w:t>
+            </w:r>
+            <w:r>
+              <w:rPr>
+                <w:rStyle w:val="VerbatimChar"/>
+                <w:rFonts w:asciiTheme="minorHAnsi" w:hAnsiTheme="minorHAnsi"/>
+                <w:sz w:val="21"/>
+              </w:rPr>
               <w:t xml:space="preserve"> </w:t>
             </w:r>
             <w:r>
               <w:rPr>
-                <w:rFonts w:asciiTheme="minorHAnsi" w:hAnsiTheme="minorHAnsi"/>
-              </w:rPr>
-              <w:t xml:space="preserve">and </w:t>
-            </w:r>
-            <w:r>
-              <w:rPr>
                 <w:rStyle w:val="VerbatimChar"/>
                 <w:rFonts w:asciiTheme="minorHAnsi" w:hAnsiTheme="minorHAnsi"/>
                 <w:sz w:val="21"/>
               </w:rPr>
-              <w:t>delayed_15min</w:t>
+              <w:t>preserving both monthly/time distribution and delay/non delay balance</w:t>
             </w:r>
           </w:p>
         </w:tc>
@@ -8649,7 +9058,6 @@
         <w:rPr>
           <w:rFonts w:asciiTheme="minorHAnsi" w:hAnsiTheme="minorHAnsi"/>
         </w:rPr>
-        <w:lastRenderedPageBreak/>
         <w:t xml:space="preserve">See </w:t>
       </w:r>
       <w:r>
@@ -8698,7 +9106,7 @@
       <w:pPr>
         <w:pStyle w:val="Heading2"/>
       </w:pPr>
-      <w:bookmarkStart w:id="13" w:name="_Toc242021094"/>
+      <w:bookmarkStart w:id="13" w:name="_Toc242025032"/>
       <w:r>
         <w:t>Profiling/Raw data Analysis</w:t>
       </w:r>
@@ -8730,13 +9138,13 @@
         <w:tblLook w:val="04A0" w:firstRow="1" w:lastRow="0" w:firstColumn="1" w:lastColumn="0" w:noHBand="0" w:noVBand="1"/>
       </w:tblPr>
       <w:tblGrid>
-        <w:gridCol w:w="2122"/>
-        <w:gridCol w:w="6894"/>
+        <w:gridCol w:w="2547"/>
+        <w:gridCol w:w="6469"/>
       </w:tblGrid>
       <w:tr>
         <w:tc>
           <w:tcPr>
-            <w:tcW w:w="2122" w:type="dxa"/>
+            <w:tcW w:w="2547" w:type="dxa"/>
             <w:shd w:val="clear" w:color="auto" w:fill="E8E8E8" w:themeFill="background2"/>
           </w:tcPr>
           <w:p>
@@ -8761,7 +9169,7 @@
         </w:tc>
         <w:tc>
           <w:tcPr>
-            <w:tcW w:w="6894" w:type="dxa"/>
+            <w:tcW w:w="6469" w:type="dxa"/>
             <w:shd w:val="clear" w:color="auto" w:fill="auto"/>
           </w:tcPr>
           <w:p>
@@ -8783,24 +9191,13 @@
               </w:rPr>
               <w:t xml:space="preserve"> - There are no duplicate or missing Id’s</w:t>
             </w:r>
-          </w:p>
-          <w:p>
-            <w:pPr>
-              <w:pStyle w:val="BodyText"/>
-              <w:rPr>
-                <w:rFonts w:asciiTheme="minorHAnsi" w:hAnsiTheme="minorHAnsi"/>
-                <w:b/>
-                <w:bCs/>
-                <w:lang w:val="en-US"/>
-              </w:rPr>
-            </w:pPr>
           </w:p>
         </w:tc>
       </w:tr>
       <w:tr>
         <w:tc>
           <w:tcPr>
-            <w:tcW w:w="2122" w:type="dxa"/>
+            <w:tcW w:w="2547" w:type="dxa"/>
             <w:shd w:val="clear" w:color="auto" w:fill="E8E8E8" w:themeFill="background2"/>
           </w:tcPr>
           <w:p>
@@ -8825,7 +9222,7 @@
         </w:tc>
         <w:tc>
           <w:tcPr>
-            <w:tcW w:w="6894" w:type="dxa"/>
+            <w:tcW w:w="6469" w:type="dxa"/>
             <w:shd w:val="clear" w:color="auto" w:fill="auto"/>
           </w:tcPr>
           <w:p>
@@ -8847,7 +9244,7 @@
       <w:tr>
         <w:tc>
           <w:tcPr>
-            <w:tcW w:w="2122" w:type="dxa"/>
+            <w:tcW w:w="2547" w:type="dxa"/>
             <w:shd w:val="clear" w:color="auto" w:fill="E8E8E8" w:themeFill="background2"/>
           </w:tcPr>
           <w:p>
@@ -8872,7 +9269,7 @@
         </w:tc>
         <w:tc>
           <w:tcPr>
-            <w:tcW w:w="6894" w:type="dxa"/>
+            <w:tcW w:w="6469" w:type="dxa"/>
             <w:shd w:val="clear" w:color="auto" w:fill="auto"/>
           </w:tcPr>
           <w:p>
@@ -8898,7 +9295,7 @@
         </w:trPr>
         <w:tc>
           <w:tcPr>
-            <w:tcW w:w="2122" w:type="dxa"/>
+            <w:tcW w:w="2547" w:type="dxa"/>
             <w:shd w:val="clear" w:color="auto" w:fill="E8E8E8" w:themeFill="background2"/>
           </w:tcPr>
           <w:p>
@@ -8923,7 +9320,7 @@
         </w:tc>
         <w:tc>
           <w:tcPr>
-            <w:tcW w:w="6894" w:type="dxa"/>
+            <w:tcW w:w="6469" w:type="dxa"/>
             <w:shd w:val="clear" w:color="auto" w:fill="auto"/>
           </w:tcPr>
           <w:p>
@@ -8950,7 +9347,7 @@
         </w:trPr>
         <w:tc>
           <w:tcPr>
-            <w:tcW w:w="2122" w:type="dxa"/>
+            <w:tcW w:w="2547" w:type="dxa"/>
             <w:shd w:val="clear" w:color="auto" w:fill="E8E8E8" w:themeFill="background2"/>
           </w:tcPr>
           <w:p>
@@ -8975,7 +9372,7 @@
         </w:tc>
         <w:tc>
           <w:tcPr>
-            <w:tcW w:w="6894" w:type="dxa"/>
+            <w:tcW w:w="6469" w:type="dxa"/>
             <w:shd w:val="clear" w:color="auto" w:fill="auto"/>
           </w:tcPr>
           <w:p>
@@ -9002,7 +9399,7 @@
         </w:trPr>
         <w:tc>
           <w:tcPr>
-            <w:tcW w:w="2122" w:type="dxa"/>
+            <w:tcW w:w="2547" w:type="dxa"/>
             <w:shd w:val="clear" w:color="auto" w:fill="E8E8E8" w:themeFill="background2"/>
           </w:tcPr>
           <w:p>
@@ -9027,7 +9424,7 @@
         </w:tc>
         <w:tc>
           <w:tcPr>
-            <w:tcW w:w="6894" w:type="dxa"/>
+            <w:tcW w:w="6469" w:type="dxa"/>
             <w:shd w:val="clear" w:color="auto" w:fill="auto"/>
           </w:tcPr>
           <w:p>
@@ -9054,7 +9451,7 @@
         </w:trPr>
         <w:tc>
           <w:tcPr>
-            <w:tcW w:w="2122" w:type="dxa"/>
+            <w:tcW w:w="2547" w:type="dxa"/>
             <w:shd w:val="clear" w:color="auto" w:fill="E8E8E8" w:themeFill="background2"/>
           </w:tcPr>
           <w:p>
@@ -9079,7 +9476,7 @@
         </w:tc>
         <w:tc>
           <w:tcPr>
-            <w:tcW w:w="6894" w:type="dxa"/>
+            <w:tcW w:w="6469" w:type="dxa"/>
             <w:shd w:val="clear" w:color="auto" w:fill="auto"/>
           </w:tcPr>
           <w:p>
@@ -9136,6 +9533,7 @@
               <w:rPr>
                 <w:rFonts w:asciiTheme="minorHAnsi" w:hAnsiTheme="minorHAnsi"/>
               </w:rPr>
+              <w:lastRenderedPageBreak/>
               <w:t>2025 – 36.36</w:t>
             </w:r>
           </w:p>
@@ -9156,7 +9554,7 @@
         </w:trPr>
         <w:tc>
           <w:tcPr>
-            <w:tcW w:w="2122" w:type="dxa"/>
+            <w:tcW w:w="2547" w:type="dxa"/>
             <w:shd w:val="clear" w:color="auto" w:fill="E8E8E8" w:themeFill="background2"/>
           </w:tcPr>
           <w:p>
@@ -9175,13 +9573,14 @@
                 <w:color w:val="156082" w:themeColor="accent1"/>
                 <w:lang w:val="en-US"/>
               </w:rPr>
+              <w:lastRenderedPageBreak/>
               <w:t>Delayed 15 min</w:t>
             </w:r>
           </w:p>
         </w:tc>
         <w:tc>
           <w:tcPr>
-            <w:tcW w:w="6894" w:type="dxa"/>
+            <w:tcW w:w="6469" w:type="dxa"/>
             <w:shd w:val="clear" w:color="auto" w:fill="auto"/>
           </w:tcPr>
           <w:p>
@@ -9256,7 +9655,7 @@
         </w:trPr>
         <w:tc>
           <w:tcPr>
-            <w:tcW w:w="2122" w:type="dxa"/>
+            <w:tcW w:w="2547" w:type="dxa"/>
             <w:shd w:val="clear" w:color="auto" w:fill="E8E8E8" w:themeFill="background2"/>
           </w:tcPr>
           <w:p>
@@ -9281,7 +9680,7 @@
         </w:tc>
         <w:tc>
           <w:tcPr>
-            <w:tcW w:w="6894" w:type="dxa"/>
+            <w:tcW w:w="6469" w:type="dxa"/>
             <w:shd w:val="clear" w:color="auto" w:fill="auto"/>
           </w:tcPr>
           <w:p>
@@ -9363,7 +9762,6 @@
               <w:rPr>
                 <w:rFonts w:asciiTheme="minorHAnsi" w:hAnsiTheme="minorHAnsi"/>
               </w:rPr>
-              <w:lastRenderedPageBreak/>
               <w:t>Delayed by at least 15 minutes – 7.43</w:t>
             </w:r>
           </w:p>
@@ -9443,7 +9841,7 @@
         </w:trPr>
         <w:tc>
           <w:tcPr>
-            <w:tcW w:w="2122" w:type="dxa"/>
+            <w:tcW w:w="2547" w:type="dxa"/>
             <w:shd w:val="clear" w:color="auto" w:fill="E8E8E8" w:themeFill="background2"/>
           </w:tcPr>
           <w:p>
@@ -9462,14 +9860,13 @@
                 <w:color w:val="156082" w:themeColor="accent1"/>
                 <w:lang w:val="en-US"/>
               </w:rPr>
-              <w:lastRenderedPageBreak/>
               <w:t>Missing Data</w:t>
             </w:r>
           </w:p>
         </w:tc>
         <w:tc>
           <w:tcPr>
-            <w:tcW w:w="6894" w:type="dxa"/>
+            <w:tcW w:w="6469" w:type="dxa"/>
             <w:shd w:val="clear" w:color="auto" w:fill="auto"/>
           </w:tcPr>
           <w:p>
@@ -9483,21 +9880,7 @@
               <w:rPr>
                 <w:rFonts w:asciiTheme="minorHAnsi" w:hAnsiTheme="minorHAnsi"/>
               </w:rPr>
-              <w:t xml:space="preserve">There is missing data for these columns – decided not to remove rows with this missing data because this would substantially change the population we are trying to represent for example if we dropped rows with missing </w:t>
-            </w:r>
-            <w:proofErr w:type="spellStart"/>
-            <w:r>
-              <w:rPr>
-                <w:rFonts w:asciiTheme="minorHAnsi" w:hAnsiTheme="minorHAnsi"/>
-              </w:rPr>
-              <w:t>icao_operator</w:t>
-            </w:r>
-            <w:proofErr w:type="spellEnd"/>
-            <w:r>
-              <w:rPr>
-                <w:rFonts w:asciiTheme="minorHAnsi" w:hAnsiTheme="minorHAnsi"/>
-              </w:rPr>
-              <w:t xml:space="preserve"> we would be removing almost 6 million flights</w:t>
+              <w:t>There is missing data for these columns – decided not to remove rows with this missing data because this would substantially change the population we are trying to represent for example if we dropped rows with missing icao_operator we would be removing almost 6 million flights</w:t>
             </w:r>
           </w:p>
           <w:p>
@@ -9511,19 +9894,11 @@
                 <w:rFonts w:asciiTheme="minorHAnsi" w:hAnsiTheme="minorHAnsi"/>
               </w:rPr>
             </w:pPr>
-            <w:proofErr w:type="spellStart"/>
-            <w:r>
-              <w:rPr>
-                <w:rFonts w:asciiTheme="minorHAnsi" w:hAnsiTheme="minorHAnsi"/>
-              </w:rPr>
-              <w:t>Icao_operator</w:t>
-            </w:r>
-            <w:proofErr w:type="spellEnd"/>
-            <w:r>
-              <w:rPr>
-                <w:rFonts w:asciiTheme="minorHAnsi" w:hAnsiTheme="minorHAnsi"/>
-              </w:rPr>
-              <w:t xml:space="preserve"> – 38.97%</w:t>
+            <w:r>
+              <w:rPr>
+                <w:rFonts w:asciiTheme="minorHAnsi" w:hAnsiTheme="minorHAnsi"/>
+              </w:rPr>
+              <w:t>Icao_operator – 38.97%</w:t>
             </w:r>
           </w:p>
           <w:p>
@@ -9555,19 +9930,11 @@
                 <w:rFonts w:asciiTheme="minorHAnsi" w:hAnsiTheme="minorHAnsi"/>
               </w:rPr>
             </w:pPr>
-            <w:proofErr w:type="spellStart"/>
-            <w:r>
-              <w:rPr>
-                <w:rFonts w:asciiTheme="minorHAnsi" w:hAnsiTheme="minorHAnsi"/>
-              </w:rPr>
-              <w:t>Icao_aicraft_class</w:t>
-            </w:r>
-            <w:proofErr w:type="spellEnd"/>
-            <w:r>
-              <w:rPr>
-                <w:rFonts w:asciiTheme="minorHAnsi" w:hAnsiTheme="minorHAnsi"/>
-              </w:rPr>
-              <w:t xml:space="preserve"> – 14.77%</w:t>
+            <w:r>
+              <w:rPr>
+                <w:rFonts w:asciiTheme="minorHAnsi" w:hAnsiTheme="minorHAnsi"/>
+              </w:rPr>
+              <w:t>Icao_aicraft_class – 14.77%</w:t>
             </w:r>
           </w:p>
           <w:p>
@@ -9581,19 +9948,11 @@
                 <w:rFonts w:asciiTheme="minorHAnsi" w:hAnsiTheme="minorHAnsi"/>
               </w:rPr>
             </w:pPr>
-            <w:proofErr w:type="spellStart"/>
-            <w:r>
-              <w:rPr>
-                <w:rFonts w:asciiTheme="minorHAnsi" w:hAnsiTheme="minorHAnsi"/>
-              </w:rPr>
-              <w:t>Typecode</w:t>
-            </w:r>
-            <w:proofErr w:type="spellEnd"/>
-            <w:r>
-              <w:rPr>
-                <w:rFonts w:asciiTheme="minorHAnsi" w:hAnsiTheme="minorHAnsi"/>
-              </w:rPr>
-              <w:t xml:space="preserve"> – 3.87%</w:t>
+            <w:r>
+              <w:rPr>
+                <w:rFonts w:asciiTheme="minorHAnsi" w:hAnsiTheme="minorHAnsi"/>
+              </w:rPr>
+              <w:t>Typecode – 3.87%</w:t>
             </w:r>
           </w:p>
         </w:tc>
@@ -9609,9 +9968,11 @@
       <w:pPr>
         <w:pStyle w:val="Heading2"/>
       </w:pPr>
+      <w:bookmarkStart w:id="14" w:name="_Toc242025033"/>
       <w:r>
         <w:t>Identifying Groups/Statas for Sampling</w:t>
       </w:r>
+      <w:bookmarkEnd w:id="14"/>
     </w:p>
     <w:p>
       <w:pPr>
@@ -9638,7 +9999,20 @@
         <w:rPr>
           <w:rFonts w:asciiTheme="minorHAnsi" w:hAnsiTheme="minorHAnsi"/>
         </w:rPr>
-        <w:t xml:space="preserve">As we seen from the analysis above </w:t>
+        <w:lastRenderedPageBreak/>
+        <w:t xml:space="preserve">As </w:t>
+      </w:r>
+      <w:r>
+        <w:rPr>
+          <w:rFonts w:asciiTheme="minorHAnsi" w:hAnsiTheme="minorHAnsi"/>
+        </w:rPr>
+        <w:t xml:space="preserve">shown </w:t>
+      </w:r>
+      <w:r>
+        <w:rPr>
+          <w:rFonts w:asciiTheme="minorHAnsi" w:hAnsiTheme="minorHAnsi"/>
+        </w:rPr>
+        <w:t xml:space="preserve">from the analysis above </w:t>
       </w:r>
       <w:r>
         <w:rPr>
@@ -9792,21 +10166,7 @@
         <w:rPr>
           <w:rFonts w:asciiTheme="minorHAnsi" w:hAnsiTheme="minorHAnsi"/>
         </w:rPr>
-        <w:t xml:space="preserve">Proposed sampling design - 100,000 records, proportionally stratified by </w:t>
-      </w:r>
-      <w:proofErr w:type="spellStart"/>
-      <w:r>
-        <w:rPr>
-          <w:rFonts w:asciiTheme="minorHAnsi" w:hAnsiTheme="minorHAnsi"/>
-        </w:rPr>
-        <w:t>source_month</w:t>
-      </w:r>
-      <w:proofErr w:type="spellEnd"/>
-      <w:r>
-        <w:rPr>
-          <w:rFonts w:asciiTheme="minorHAnsi" w:hAnsiTheme="minorHAnsi"/>
-        </w:rPr>
-        <w:t xml:space="preserve"> (YYYYMM) and delayed_15min, using random seed 42.</w:t>
+        <w:t>Proposed sampling design - 100,000 records, proportionally stratified by source_month (YYYYMM) and delayed_15min, using random seed 42.</w:t>
       </w:r>
     </w:p>
     <w:p>
@@ -9820,7 +10180,19 @@
         <w:rPr>
           <w:rFonts w:asciiTheme="minorHAnsi" w:hAnsiTheme="minorHAnsi"/>
         </w:rPr>
-        <w:t>This results in a sample set of 100,000 records with the 72 strata’s/groups and the following distribution where the sample set distribution is very close to the raw data</w:t>
+        <w:t xml:space="preserve">This results in a sample set of 100,000 records with the 72 </w:t>
+      </w:r>
+      <w:r>
+        <w:rPr>
+          <w:rFonts w:asciiTheme="minorHAnsi" w:hAnsiTheme="minorHAnsi"/>
+        </w:rPr>
+        <w:t>strata/</w:t>
+      </w:r>
+      <w:r>
+        <w:rPr>
+          <w:rFonts w:asciiTheme="minorHAnsi" w:hAnsiTheme="minorHAnsi"/>
+        </w:rPr>
+        <w:t>groups and the following distribution where the sample set distribution is very close to the raw data</w:t>
       </w:r>
     </w:p>
     <w:tbl>
@@ -9940,7 +10312,6 @@
                 <w:color w:val="156082" w:themeColor="accent1"/>
                 <w:lang w:val="en-US"/>
               </w:rPr>
-              <w:lastRenderedPageBreak/>
               <w:t>Year Distribution</w:t>
             </w:r>
           </w:p>
@@ -10218,19 +10589,43 @@
         <w:rPr>
           <w:rFonts w:asciiTheme="minorHAnsi" w:hAnsiTheme="minorHAnsi"/>
         </w:rPr>
-        <w:t xml:space="preserve">The stratified sampling process identified the records to include in the 100,000-flight sample using their unique IDs. </w:t>
-      </w:r>
-      <w:r>
-        <w:rPr>
-          <w:rFonts w:asciiTheme="minorHAnsi" w:hAnsiTheme="minorHAnsi"/>
-        </w:rPr>
-        <w:t xml:space="preserve"> </w:t>
-      </w:r>
-      <w:r>
-        <w:rPr>
-          <w:rFonts w:asciiTheme="minorHAnsi" w:hAnsiTheme="minorHAnsi"/>
-        </w:rPr>
-        <w:t>The complete records for those flights were then retrieved from the original raw Parquet dataset.</w:t>
+        <w:t xml:space="preserve">For more details on these </w:t>
+      </w:r>
+      <w:r>
+        <w:rPr>
+          <w:rFonts w:asciiTheme="minorHAnsi" w:hAnsiTheme="minorHAnsi"/>
+        </w:rPr>
+        <w:t>Strata</w:t>
+      </w:r>
+      <w:r>
+        <w:rPr>
+          <w:rFonts w:asciiTheme="minorHAnsi" w:hAnsiTheme="minorHAnsi"/>
+        </w:rPr>
+        <w:t xml:space="preserve"> see </w:t>
+      </w:r>
+      <w:r>
+        <w:rPr>
+          <w:rFonts w:asciiTheme="minorHAnsi" w:hAnsiTheme="minorHAnsi"/>
+        </w:rPr>
+        <w:t>SamplingAllocation.csv</w:t>
+      </w:r>
+      <w:r>
+        <w:rPr>
+          <w:rFonts w:asciiTheme="minorHAnsi" w:hAnsiTheme="minorHAnsi"/>
+        </w:rPr>
+        <w:t xml:space="preserve"> in the Git</w:t>
+      </w:r>
+      <w:r>
+        <w:rPr>
+          <w:rFonts w:asciiTheme="minorHAnsi" w:hAnsiTheme="minorHAnsi"/>
+        </w:rPr>
+        <w:t>H</w:t>
+      </w:r>
+      <w:r>
+        <w:rPr>
+          <w:rFonts w:asciiTheme="minorHAnsi" w:hAnsiTheme="minorHAnsi"/>
+        </w:rPr>
+        <w:t>ub repo</w:t>
       </w:r>
     </w:p>
     <w:p>
@@ -10244,7 +10639,19 @@
         <w:rPr>
           <w:rFonts w:asciiTheme="minorHAnsi" w:hAnsiTheme="minorHAnsi"/>
         </w:rPr>
-        <w:t>Any additional/unexpected class imbalance can be addressed later during modelling through appropriate algorithms, class weights, resampling of the training data only, threshold selection, and appropriate evaluation metrics.</w:t>
+        <w:t xml:space="preserve">The stratified sampling process identified the records to include in the 100,000-flight sample using their unique IDs. </w:t>
+      </w:r>
+      <w:r>
+        <w:rPr>
+          <w:rFonts w:asciiTheme="minorHAnsi" w:hAnsiTheme="minorHAnsi"/>
+        </w:rPr>
+        <w:t xml:space="preserve"> </w:t>
+      </w:r>
+      <w:r>
+        <w:rPr>
+          <w:rFonts w:asciiTheme="minorHAnsi" w:hAnsiTheme="minorHAnsi"/>
+        </w:rPr>
+        <w:t>The complete records for those flights were then retrieved from the original raw Parquet dataset.</w:t>
       </w:r>
     </w:p>
     <w:p>
@@ -10254,34 +10661,49 @@
           <w:rFonts w:asciiTheme="minorHAnsi" w:hAnsiTheme="minorHAnsi"/>
         </w:rPr>
       </w:pPr>
+      <w:r>
+        <w:rPr>
+          <w:rFonts w:asciiTheme="minorHAnsi" w:hAnsiTheme="minorHAnsi"/>
+        </w:rPr>
+        <w:t>Any additional/unexpected class imbalance can be addressed later during modelling through appropriate algorithms, class weights, resampling of the training data only, threshold selection, and appropriate evaluation metrics.</w:t>
+      </w:r>
     </w:p>
     <w:p>
       <w:pPr>
-        <w:pStyle w:val="Heading2"/>
-        <w:rPr>
-          <w:rFonts w:asciiTheme="minorHAnsi" w:hAnsiTheme="minorHAnsi"/>
-          <w:lang w:val="en-US"/>
-        </w:rPr>
-      </w:pPr>
-      <w:proofErr w:type="gramStart"/>
-      <w:r>
-        <w:rPr>
-          <w:rFonts w:asciiTheme="minorHAnsi" w:hAnsiTheme="minorHAnsi"/>
-          <w:lang w:val="en-US"/>
-        </w:rPr>
-        <w:t>Pre Processing</w:t>
-      </w:r>
-      <w:proofErr w:type="gramEnd"/>
-      <w:r>
-        <w:rPr>
-          <w:rFonts w:asciiTheme="minorHAnsi" w:hAnsiTheme="minorHAnsi"/>
-          <w:lang w:val="en-US"/>
-        </w:rPr>
-        <w:t xml:space="preserve"> – Analysis and Sample set creation</w:t>
-      </w:r>
+        <w:pStyle w:val="BodyText"/>
+        <w:rPr>
+          <w:rFonts w:asciiTheme="minorHAnsi" w:hAnsiTheme="minorHAnsi"/>
+        </w:rPr>
+      </w:pPr>
     </w:p>
     <w:p>
       <w:pPr>
+        <w:pStyle w:val="Heading2"/>
+        <w:rPr>
+          <w:rFonts w:asciiTheme="minorHAnsi" w:hAnsiTheme="minorHAnsi"/>
+          <w:lang w:val="en-US"/>
+        </w:rPr>
+      </w:pPr>
+      <w:bookmarkStart w:id="15" w:name="_Toc242025034"/>
+      <w:r>
+        <w:rPr>
+          <w:rFonts w:asciiTheme="minorHAnsi" w:hAnsiTheme="minorHAnsi"/>
+          <w:lang w:val="en-US"/>
+        </w:rPr>
+        <w:lastRenderedPageBreak/>
+        <w:t>Pre-Processing</w:t>
+      </w:r>
+      <w:r>
+        <w:rPr>
+          <w:rFonts w:asciiTheme="minorHAnsi" w:hAnsiTheme="minorHAnsi"/>
+          <w:lang w:val="en-US"/>
+        </w:rPr>
+        <w:t xml:space="preserve"> – Analysis and Sample set creation</w:t>
+      </w:r>
+      <w:bookmarkEnd w:id="15"/>
+    </w:p>
+    <w:p>
+      <w:pPr>
         <w:pStyle w:val="FirstParagraph"/>
         <w:rPr>
           <w:rFonts w:asciiTheme="minorHAnsi" w:hAnsiTheme="minorHAnsi"/>
@@ -10299,14 +10721,12 @@
         </w:rPr>
         <w:t xml:space="preserve">initial </w:t>
       </w:r>
-      <w:proofErr w:type="spellStart"/>
-      <w:r>
-        <w:rPr>
-          <w:rFonts w:asciiTheme="minorHAnsi" w:hAnsiTheme="minorHAnsi"/>
-        </w:rPr>
-        <w:t>anlaysis</w:t>
-      </w:r>
-      <w:proofErr w:type="spellEnd"/>
+      <w:r>
+        <w:rPr>
+          <w:rFonts w:asciiTheme="minorHAnsi" w:hAnsiTheme="minorHAnsi"/>
+        </w:rPr>
+        <w:t>analysis</w:t>
+      </w:r>
       <w:r>
         <w:rPr>
           <w:rFonts w:asciiTheme="minorHAnsi" w:hAnsiTheme="minorHAnsi"/>
@@ -10329,35 +10749,19 @@
         <w:rPr>
           <w:rFonts w:asciiTheme="minorHAnsi" w:hAnsiTheme="minorHAnsi"/>
         </w:rPr>
-        <w:t xml:space="preserve"> to the GCS bucket can be reproduced using the related </w:t>
-      </w:r>
-      <w:proofErr w:type="spellStart"/>
-      <w:r>
-        <w:rPr>
-          <w:rFonts w:asciiTheme="minorHAnsi" w:hAnsiTheme="minorHAnsi"/>
-        </w:rPr>
-        <w:t>Jupyter</w:t>
-      </w:r>
-      <w:proofErr w:type="spellEnd"/>
-      <w:r>
-        <w:rPr>
-          <w:rFonts w:asciiTheme="minorHAnsi" w:hAnsiTheme="minorHAnsi"/>
-        </w:rPr>
-        <w:t xml:space="preserve"> notebook listed below which is maintained within the </w:t>
-      </w:r>
-      <w:proofErr w:type="spellStart"/>
-      <w:r>
-        <w:rPr>
-          <w:rFonts w:asciiTheme="minorHAnsi" w:hAnsiTheme="minorHAnsi"/>
-        </w:rPr>
-        <w:t>Github</w:t>
-      </w:r>
-      <w:proofErr w:type="spellEnd"/>
-      <w:r>
-        <w:rPr>
-          <w:rFonts w:asciiTheme="minorHAnsi" w:hAnsiTheme="minorHAnsi"/>
-        </w:rPr>
-        <w:t xml:space="preserve"> repo and designed to run in </w:t>
+        <w:t xml:space="preserve"> to the GCS bucket can be reproduced using the related Jupyter notebook listed below which is maintained within the Git</w:t>
+      </w:r>
+      <w:r>
+        <w:rPr>
+          <w:rFonts w:asciiTheme="minorHAnsi" w:hAnsiTheme="minorHAnsi"/>
+        </w:rPr>
+        <w:t>H</w:t>
+      </w:r>
+      <w:r>
+        <w:rPr>
+          <w:rFonts w:asciiTheme="minorHAnsi" w:hAnsiTheme="minorHAnsi"/>
+        </w:rPr>
+        <w:t xml:space="preserve">ub repo and designed to run in </w:t>
       </w:r>
       <w:r>
         <w:rPr>
@@ -10365,18 +10769,8 @@
           <w:b/>
           <w:bCs/>
         </w:rPr>
-        <w:t xml:space="preserve">Google </w:t>
-      </w:r>
-      <w:proofErr w:type="spellStart"/>
-      <w:r>
-        <w:rPr>
-          <w:rFonts w:asciiTheme="minorHAnsi" w:hAnsiTheme="minorHAnsi"/>
-          <w:b/>
-          <w:bCs/>
-        </w:rPr>
-        <w:t>Colab</w:t>
-      </w:r>
-      <w:proofErr w:type="spellEnd"/>
+        <w:t>Google Colab</w:t>
+      </w:r>
     </w:p>
     <w:tbl>
       <w:tblPr>
@@ -10385,13 +10779,13 @@
         <w:tblLook w:val="04A0" w:firstRow="1" w:lastRow="0" w:firstColumn="1" w:lastColumn="0" w:noHBand="0" w:noVBand="1"/>
       </w:tblPr>
       <w:tblGrid>
-        <w:gridCol w:w="3124"/>
-        <w:gridCol w:w="5892"/>
+        <w:gridCol w:w="2547"/>
+        <w:gridCol w:w="6469"/>
       </w:tblGrid>
       <w:tr>
         <w:tc>
           <w:tcPr>
-            <w:tcW w:w="4508" w:type="dxa"/>
+            <w:tcW w:w="2547" w:type="dxa"/>
             <w:shd w:val="clear" w:color="auto" w:fill="E8E8E8" w:themeFill="background2"/>
           </w:tcPr>
           <w:p>
@@ -10416,7 +10810,7 @@
         </w:tc>
         <w:tc>
           <w:tcPr>
-            <w:tcW w:w="4508" w:type="dxa"/>
+            <w:tcW w:w="6469" w:type="dxa"/>
             <w:shd w:val="clear" w:color="auto" w:fill="E8E8E8" w:themeFill="background2"/>
           </w:tcPr>
           <w:p>
@@ -10443,7 +10837,7 @@
       <w:tr>
         <w:tc>
           <w:tcPr>
-            <w:tcW w:w="4508" w:type="dxa"/>
+            <w:tcW w:w="2547" w:type="dxa"/>
             <w:shd w:val="clear" w:color="auto" w:fill="auto"/>
           </w:tcPr>
           <w:p>
@@ -10463,7 +10857,7 @@
         </w:tc>
         <w:tc>
           <w:tcPr>
-            <w:tcW w:w="4508" w:type="dxa"/>
+            <w:tcW w:w="6469" w:type="dxa"/>
             <w:shd w:val="clear" w:color="auto" w:fill="auto"/>
           </w:tcPr>
           <w:p>
@@ -10487,7 +10881,23 @@
                 <w:rFonts w:asciiTheme="minorHAnsi" w:hAnsiTheme="minorHAnsi"/>
                 <w:sz w:val="21"/>
               </w:rPr>
-              <w:t>2_downsampling.ipynb</w:t>
+              <w:t>2_</w:t>
+            </w:r>
+            <w:r>
+              <w:rPr>
+                <w:rStyle w:val="VerbatimChar"/>
+                <w:rFonts w:asciiTheme="minorHAnsi" w:hAnsiTheme="minorHAnsi"/>
+                <w:sz w:val="21"/>
+              </w:rPr>
+              <w:t>analysis_and_</w:t>
+            </w:r>
+            <w:r>
+              <w:rPr>
+                <w:rStyle w:val="VerbatimChar"/>
+                <w:rFonts w:asciiTheme="minorHAnsi" w:hAnsiTheme="minorHAnsi"/>
+                <w:sz w:val="21"/>
+              </w:rPr>
+              <w:t>downsampling.ipynb</w:t>
             </w:r>
           </w:p>
         </w:tc>
@@ -10498,7 +10908,7 @@
         </w:trPr>
         <w:tc>
           <w:tcPr>
-            <w:tcW w:w="4508" w:type="dxa"/>
+            <w:tcW w:w="2547" w:type="dxa"/>
             <w:shd w:val="clear" w:color="auto" w:fill="auto"/>
           </w:tcPr>
           <w:p>
@@ -10518,7 +10928,7 @@
         </w:tc>
         <w:tc>
           <w:tcPr>
-            <w:tcW w:w="4508" w:type="dxa"/>
+            <w:tcW w:w="6469" w:type="dxa"/>
             <w:shd w:val="clear" w:color="auto" w:fill="auto"/>
           </w:tcPr>
           <w:p>
@@ -10546,7 +10956,7 @@
         </w:trPr>
         <w:tc>
           <w:tcPr>
-            <w:tcW w:w="4508" w:type="dxa"/>
+            <w:tcW w:w="2547" w:type="dxa"/>
             <w:shd w:val="clear" w:color="auto" w:fill="auto"/>
           </w:tcPr>
           <w:p>
@@ -10566,7 +10976,7 @@
         </w:tc>
         <w:tc>
           <w:tcPr>
-            <w:tcW w:w="4508" w:type="dxa"/>
+            <w:tcW w:w="6469" w:type="dxa"/>
             <w:shd w:val="clear" w:color="auto" w:fill="auto"/>
           </w:tcPr>
           <w:p>
@@ -10578,28 +10988,38 @@
             </w:pPr>
             <w:r>
               <w:rPr>
-                <w:rStyle w:val="VerbatimChar"/>
-                <w:rFonts w:asciiTheme="minorHAnsi" w:hAnsiTheme="minorHAnsi"/>
-                <w:sz w:val="21"/>
-              </w:rPr>
-              <w:t>gs://european-flight-delay-prediction/raw/merged_flights_with_delay_2023_2025.parquet</w:t>
-            </w:r>
-            <w:r>
-              <w:rPr>
-                <w:rStyle w:val="VerbatimChar"/>
-                <w:rFonts w:asciiTheme="minorHAnsi" w:hAnsiTheme="minorHAnsi"/>
-                <w:sz w:val="21"/>
-              </w:rPr>
-              <w:t xml:space="preserve"> - </w:t>
-            </w:r>
-            <w:r>
-              <w:rPr>
-                <w:rStyle w:val="VerbatimChar"/>
-                <w:rFonts w:asciiTheme="minorHAnsi" w:hAnsiTheme="minorHAnsi"/>
-                <w:color w:val="FF0000"/>
-                <w:sz w:val="21"/>
-              </w:rPr>
-              <w:t>TBC</w:t>
+                <w:rFonts w:asciiTheme="minorHAnsi" w:hAnsiTheme="minorHAnsi"/>
+              </w:rPr>
+              <w:t xml:space="preserve">Public URL - </w:t>
+            </w:r>
+            <w:hyperlink r:id="rId12" w:history="1">
+              <w:r>
+                <w:rPr>
+                  <w:rStyle w:val="Hyperlink"/>
+                  <w:rFonts w:asciiTheme="minorHAnsi" w:hAnsiTheme="minorHAnsi"/>
+                </w:rPr>
+                <w:t>https://storage.googleapis.com/european-flight-delay-prediction/processed/flights_downsampled_100k.parquet</w:t>
+              </w:r>
+            </w:hyperlink>
+          </w:p>
+          <w:p>
+            <w:pPr>
+              <w:pStyle w:val="BodyText"/>
+              <w:rPr>
+                <w:rFonts w:asciiTheme="minorHAnsi" w:hAnsiTheme="minorHAnsi"/>
+              </w:rPr>
+            </w:pPr>
+            <w:r>
+              <w:rPr>
+                <w:rFonts w:asciiTheme="minorHAnsi" w:hAnsiTheme="minorHAnsi"/>
+              </w:rPr>
+              <w:t xml:space="preserve">Cloud Storage URI - </w:t>
+            </w:r>
+            <w:r>
+              <w:rPr>
+                <w:rFonts w:asciiTheme="minorHAnsi" w:hAnsiTheme="minorHAnsi"/>
+              </w:rPr>
+              <w:t>gs://european-flight-delay-prediction/processed/flights_downsampled_100k.parquet</w:t>
             </w:r>
           </w:p>
         </w:tc>
@@ -10610,7 +11030,7 @@
         </w:trPr>
         <w:tc>
           <w:tcPr>
-            <w:tcW w:w="4508" w:type="dxa"/>
+            <w:tcW w:w="2547" w:type="dxa"/>
             <w:shd w:val="clear" w:color="auto" w:fill="auto"/>
           </w:tcPr>
           <w:p>
@@ -10630,7 +11050,7 @@
         </w:tc>
         <w:tc>
           <w:tcPr>
-            <w:tcW w:w="4508" w:type="dxa"/>
+            <w:tcW w:w="6469" w:type="dxa"/>
             <w:shd w:val="clear" w:color="auto" w:fill="auto"/>
           </w:tcPr>
           <w:p>
@@ -10648,18 +11068,8 @@
                 <w:rFonts w:asciiTheme="minorHAnsi" w:hAnsiTheme="minorHAnsi"/>
                 <w:sz w:val="21"/>
               </w:rPr>
-              <w:t xml:space="preserve">Google </w:t>
-            </w:r>
-            <w:proofErr w:type="spellStart"/>
-            <w:r>
-              <w:rPr>
-                <w:rStyle w:val="VerbatimChar"/>
-                <w:rFonts w:asciiTheme="minorHAnsi" w:hAnsiTheme="minorHAnsi"/>
-                <w:sz w:val="21"/>
-              </w:rPr>
-              <w:t>Colab</w:t>
-            </w:r>
-            <w:proofErr w:type="spellEnd"/>
+              <w:t>Google Colab</w:t>
+            </w:r>
           </w:p>
         </w:tc>
       </w:tr>
@@ -10669,7 +11079,7 @@
         </w:trPr>
         <w:tc>
           <w:tcPr>
-            <w:tcW w:w="4508" w:type="dxa"/>
+            <w:tcW w:w="2547" w:type="dxa"/>
             <w:shd w:val="clear" w:color="auto" w:fill="auto"/>
           </w:tcPr>
           <w:p>
@@ -10689,7 +11099,7 @@
         </w:tc>
         <w:tc>
           <w:tcPr>
-            <w:tcW w:w="4508" w:type="dxa"/>
+            <w:tcW w:w="6469" w:type="dxa"/>
             <w:shd w:val="clear" w:color="auto" w:fill="auto"/>
           </w:tcPr>
           <w:p>
@@ -10711,25 +11121,23 @@
                 <w:rFonts w:asciiTheme="minorHAnsi" w:hAnsiTheme="minorHAnsi"/>
                 <w:sz w:val="21"/>
               </w:rPr>
-              <w:t xml:space="preserve">Access to </w:t>
-            </w:r>
-            <w:proofErr w:type="spellStart"/>
+              <w:t>Access to Git</w:t>
+            </w:r>
             <w:r>
               <w:rPr>
                 <w:rStyle w:val="VerbatimChar"/>
                 <w:rFonts w:asciiTheme="minorHAnsi" w:hAnsiTheme="minorHAnsi"/>
                 <w:sz w:val="21"/>
               </w:rPr>
-              <w:t>Github</w:t>
-            </w:r>
-            <w:proofErr w:type="spellEnd"/>
+              <w:t>H</w:t>
+            </w:r>
             <w:r>
               <w:rPr>
                 <w:rStyle w:val="VerbatimChar"/>
                 <w:rFonts w:asciiTheme="minorHAnsi" w:hAnsiTheme="minorHAnsi"/>
                 <w:sz w:val="21"/>
               </w:rPr>
-              <w:t xml:space="preserve"> repo</w:t>
+              <w:t>ub repo</w:t>
             </w:r>
           </w:p>
           <w:p>
@@ -10751,7 +11159,7 @@
                 <w:rFonts w:asciiTheme="minorHAnsi" w:hAnsiTheme="minorHAnsi"/>
                 <w:sz w:val="21"/>
               </w:rPr>
-              <w:t>Google Collab</w:t>
+              <w:t>Google Colab</w:t>
             </w:r>
           </w:p>
           <w:p>
@@ -10795,8 +11203,7 @@
                 <w:rFonts w:asciiTheme="minorHAnsi" w:hAnsiTheme="minorHAnsi"/>
                 <w:sz w:val="21"/>
               </w:rPr>
-              <w:lastRenderedPageBreak/>
-              <w:t>Packages listed in requiremenrts.txt if not using Google Collab</w:t>
+              <w:t>Packages listed in requirements.txt if not using Google Colab</w:t>
             </w:r>
           </w:p>
         </w:tc>
@@ -15101,7 +15508,7 @@
 </file>
 
 <file path=customXml/itemProps1.xml><?xml version="1.0" encoding="utf-8"?>
-<ds:datastoreItem xmlns:ds="http://schemas.openxmlformats.org/officeDocument/2006/customXml" ds:itemID="{C2AB0C5A-75AD-2049-81BB-D3F4310ADE12}">
+<ds:datastoreItem xmlns:ds="http://schemas.openxmlformats.org/officeDocument/2006/customXml" ds:itemID="{A8D05D7E-7E5B-B749-B363-5F70549FC4BD}">
   <ds:schemaRefs>
     <ds:schemaRef ds:uri="http://schemas.openxmlformats.org/officeDocument/2006/bibliography"/>
   </ds:schemaRefs>

</xml_diff>

<commit_message>
Tidy up before submitting
</commit_message>
<xml_diff>
--- a/ProjectReport.docx
+++ b/ProjectReport.docx
@@ -97,7 +97,7 @@
             </w:rPr>
             <w:fldChar w:fldCharType="separate"/>
           </w:r>
-          <w:hyperlink w:anchor="_Toc242025019" w:history="1">
+          <w:hyperlink w:anchor="_Toc242036542" w:history="1">
             <w:r>
               <w:rPr>
                 <w:rStyle w:val="Hyperlink"/>
@@ -125,7 +125,7 @@
                 <w:noProof/>
                 <w:webHidden/>
               </w:rPr>
-              <w:instrText xml:space="preserve"> PAGEREF _Toc242025019 \h </w:instrText>
+              <w:instrText xml:space="preserve"> PAGEREF _Toc242036542 \h </w:instrText>
             </w:r>
             <w:r>
               <w:rPr>
@@ -172,7 +172,7 @@
               <w:lang w:eastAsia="en-GB"/>
             </w:rPr>
           </w:pPr>
-          <w:hyperlink w:anchor="_Toc242025020" w:history="1">
+          <w:hyperlink w:anchor="_Toc242036543" w:history="1">
             <w:r>
               <w:rPr>
                 <w:rStyle w:val="Hyperlink"/>
@@ -200,7 +200,7 @@
                 <w:noProof/>
                 <w:webHidden/>
               </w:rPr>
-              <w:instrText xml:space="preserve"> PAGEREF _Toc242025020 \h </w:instrText>
+              <w:instrText xml:space="preserve"> PAGEREF _Toc242036543 \h </w:instrText>
             </w:r>
             <w:r>
               <w:rPr>
@@ -247,22 +247,14 @@
               <w:lang w:eastAsia="en-GB"/>
             </w:rPr>
           </w:pPr>
-          <w:hyperlink w:anchor="_Toc242025021" w:history="1">
+          <w:hyperlink w:anchor="_Toc242036544" w:history="1">
             <w:r>
               <w:rPr>
                 <w:rStyle w:val="Hyperlink"/>
                 <w:noProof/>
                 <w:lang w:val="en-US"/>
               </w:rPr>
-              <w:t>1. Raw Data Storag</w:t>
-            </w:r>
-            <w:r>
-              <w:rPr>
-                <w:rStyle w:val="Hyperlink"/>
-                <w:noProof/>
-                <w:lang w:val="en-US"/>
-              </w:rPr>
-              <w:t>e</w:t>
+              <w:t>1. Raw Data Storage</w:t>
             </w:r>
             <w:r>
               <w:rPr>
@@ -283,7 +275,7 @@
                 <w:noProof/>
                 <w:webHidden/>
               </w:rPr>
-              <w:instrText xml:space="preserve"> PAGEREF _Toc242025021 \h </w:instrText>
+              <w:instrText xml:space="preserve"> PAGEREF _Toc242036544 \h </w:instrText>
             </w:r>
             <w:r>
               <w:rPr>
@@ -330,7 +322,7 @@
               <w:lang w:eastAsia="en-GB"/>
             </w:rPr>
           </w:pPr>
-          <w:hyperlink w:anchor="_Toc242025022" w:history="1">
+          <w:hyperlink w:anchor="_Toc242036545" w:history="1">
             <w:r>
               <w:rPr>
                 <w:rStyle w:val="Hyperlink"/>
@@ -357,7 +349,7 @@
                 <w:noProof/>
                 <w:webHidden/>
               </w:rPr>
-              <w:instrText xml:space="preserve"> PAGEREF _Toc242025022 \h </w:instrText>
+              <w:instrText xml:space="preserve"> PAGEREF _Toc242036545 \h </w:instrText>
             </w:r>
             <w:r>
               <w:rPr>
@@ -404,7 +396,7 @@
               <w:lang w:eastAsia="en-GB"/>
             </w:rPr>
           </w:pPr>
-          <w:hyperlink w:anchor="_Toc242025023" w:history="1">
+          <w:hyperlink w:anchor="_Toc242036546" w:history="1">
             <w:r>
               <w:rPr>
                 <w:rStyle w:val="Hyperlink"/>
@@ -432,7 +424,7 @@
                 <w:noProof/>
                 <w:webHidden/>
               </w:rPr>
-              <w:instrText xml:space="preserve"> PAGEREF _Toc242025023 \h </w:instrText>
+              <w:instrText xml:space="preserve"> PAGEREF _Toc242036546 \h </w:instrText>
             </w:r>
             <w:r>
               <w:rPr>
@@ -479,7 +471,7 @@
               <w:lang w:eastAsia="en-GB"/>
             </w:rPr>
           </w:pPr>
-          <w:hyperlink w:anchor="_Toc242025024" w:history="1">
+          <w:hyperlink w:anchor="_Toc242036547" w:history="1">
             <w:r>
               <w:rPr>
                 <w:rStyle w:val="Hyperlink"/>
@@ -507,7 +499,7 @@
                 <w:noProof/>
                 <w:webHidden/>
               </w:rPr>
-              <w:instrText xml:space="preserve"> PAGEREF _Toc242025024 \h </w:instrText>
+              <w:instrText xml:space="preserve"> PAGEREF _Toc242036547 \h </w:instrText>
             </w:r>
             <w:r>
               <w:rPr>
@@ -527,7 +519,7 @@
                 <w:noProof/>
                 <w:webHidden/>
               </w:rPr>
-              <w:t>5</w:t>
+              <w:t>4</w:t>
             </w:r>
             <w:r>
               <w:rPr>
@@ -554,7 +546,7 @@
               <w:lang w:eastAsia="en-GB"/>
             </w:rPr>
           </w:pPr>
-          <w:hyperlink w:anchor="_Toc242025025" w:history="1">
+          <w:hyperlink w:anchor="_Toc242036548" w:history="1">
             <w:r>
               <w:rPr>
                 <w:rStyle w:val="Hyperlink"/>
@@ -582,7 +574,7 @@
                 <w:noProof/>
                 <w:webHidden/>
               </w:rPr>
-              <w:instrText xml:space="preserve"> PAGEREF _Toc242025025 \h </w:instrText>
+              <w:instrText xml:space="preserve"> PAGEREF _Toc242036548 \h </w:instrText>
             </w:r>
             <w:r>
               <w:rPr>
@@ -629,7 +621,7 @@
               <w:lang w:eastAsia="en-GB"/>
             </w:rPr>
           </w:pPr>
-          <w:hyperlink w:anchor="_Toc242025026" w:history="1">
+          <w:hyperlink w:anchor="_Toc242036549" w:history="1">
             <w:r>
               <w:rPr>
                 <w:rStyle w:val="Hyperlink"/>
@@ -657,7 +649,7 @@
                 <w:noProof/>
                 <w:webHidden/>
               </w:rPr>
-              <w:instrText xml:space="preserve"> PAGEREF _Toc242025026 \h </w:instrText>
+              <w:instrText xml:space="preserve"> PAGEREF _Toc242036549 \h </w:instrText>
             </w:r>
             <w:r>
               <w:rPr>
@@ -704,7 +696,7 @@
               <w:lang w:eastAsia="en-GB"/>
             </w:rPr>
           </w:pPr>
-          <w:hyperlink w:anchor="_Toc242025027" w:history="1">
+          <w:hyperlink w:anchor="_Toc242036550" w:history="1">
             <w:r>
               <w:rPr>
                 <w:rStyle w:val="Hyperlink"/>
@@ -732,7 +724,7 @@
                 <w:noProof/>
                 <w:webHidden/>
               </w:rPr>
-              <w:instrText xml:space="preserve"> PAGEREF _Toc242025027 \h </w:instrText>
+              <w:instrText xml:space="preserve"> PAGEREF _Toc242036550 \h </w:instrText>
             </w:r>
             <w:r>
               <w:rPr>
@@ -752,7 +744,7 @@
                 <w:noProof/>
                 <w:webHidden/>
               </w:rPr>
-              <w:t>7</w:t>
+              <w:t>6</w:t>
             </w:r>
             <w:r>
               <w:rPr>
@@ -779,30 +771,102 @@
               <w:lang w:eastAsia="en-GB"/>
             </w:rPr>
           </w:pPr>
-          <w:hyperlink w:anchor="_Toc242025028" w:history="1">
+          <w:hyperlink w:anchor="_Toc242036551" w:history="1">
             <w:r>
               <w:rPr>
                 <w:rStyle w:val="Hyperlink"/>
                 <w:noProof/>
                 <w:lang w:val="en-US"/>
               </w:rPr>
-              <w:t>6. Data Split / Validation Strate</w:t>
-            </w:r>
+              <w:t>6. Data Split / Validation Strategy</w:t>
+            </w:r>
+            <w:r>
+              <w:rPr>
+                <w:noProof/>
+                <w:webHidden/>
+              </w:rPr>
+              <w:tab/>
+            </w:r>
+            <w:r>
+              <w:rPr>
+                <w:noProof/>
+                <w:webHidden/>
+              </w:rPr>
+              <w:fldChar w:fldCharType="begin"/>
+            </w:r>
+            <w:r>
+              <w:rPr>
+                <w:noProof/>
+                <w:webHidden/>
+              </w:rPr>
+              <w:instrText xml:space="preserve"> PAGEREF _Toc242036551 \h </w:instrText>
+            </w:r>
+            <w:r>
+              <w:rPr>
+                <w:noProof/>
+                <w:webHidden/>
+              </w:rPr>
+            </w:r>
+            <w:r>
+              <w:rPr>
+                <w:noProof/>
+                <w:webHidden/>
+              </w:rPr>
+              <w:fldChar w:fldCharType="separate"/>
+            </w:r>
+            <w:r>
+              <w:rPr>
+                <w:noProof/>
+                <w:webHidden/>
+              </w:rPr>
+              <w:t>8</w:t>
+            </w:r>
+            <w:r>
+              <w:rPr>
+                <w:noProof/>
+                <w:webHidden/>
+              </w:rPr>
+              <w:fldChar w:fldCharType="end"/>
+            </w:r>
+          </w:hyperlink>
+        </w:p>
+        <w:p>
+          <w:pPr>
+            <w:pStyle w:val="TOC2"/>
+            <w:tabs>
+              <w:tab w:val="right" w:leader="dot" w:pos="9016"/>
+            </w:tabs>
+            <w:rPr>
+              <w:rFonts w:eastAsiaTheme="minorEastAsia"/>
+              <w:b w:val="0"/>
+              <w:bCs w:val="0"/>
+              <w:noProof/>
+              <w:sz w:val="24"/>
+              <w:szCs w:val="24"/>
+              <w:lang w:eastAsia="en-GB"/>
+            </w:rPr>
+          </w:pPr>
+          <w:hyperlink w:anchor="_Toc242036552" w:history="1">
             <w:r>
               <w:rPr>
                 <w:rStyle w:val="Hyperlink"/>
                 <w:noProof/>
-                <w:lang w:val="en-US"/>
-              </w:rPr>
-              <w:t>g</w:t>
+              </w:rPr>
+              <w:t>Data Split / Validation Strategy Repro</w:t>
             </w:r>
             <w:r>
               <w:rPr>
                 <w:rStyle w:val="Hyperlink"/>
                 <w:noProof/>
-                <w:lang w:val="en-US"/>
-              </w:rPr>
-              <w:t>y</w:t>
+              </w:rPr>
+              <w:t>d</w:t>
+            </w:r>
+            <w:r>
+              <w:rPr>
+                <w:rStyle w:val="Hyperlink"/>
+                <w:noProof/>
+              </w:rPr>
+              <w:t>ucibility - TBC</w:t>
             </w:r>
             <w:r>
               <w:rPr>
@@ -823,7 +887,7 @@
                 <w:noProof/>
                 <w:webHidden/>
               </w:rPr>
-              <w:instrText xml:space="preserve"> PAGEREF _Toc242025028 \h </w:instrText>
+              <w:instrText xml:space="preserve"> PAGEREF _Toc242036552 \h </w:instrText>
             </w:r>
             <w:r>
               <w:rPr>
@@ -870,7 +934,7 @@
               <w:lang w:eastAsia="en-GB"/>
             </w:rPr>
           </w:pPr>
-          <w:hyperlink w:anchor="_Toc242025029" w:history="1">
+          <w:hyperlink w:anchor="_Toc242036553" w:history="1">
             <w:r>
               <w:rPr>
                 <w:rStyle w:val="Hyperlink"/>
@@ -898,7 +962,7 @@
                 <w:noProof/>
                 <w:webHidden/>
               </w:rPr>
-              <w:instrText xml:space="preserve"> PAGEREF _Toc242025029 \h </w:instrText>
+              <w:instrText xml:space="preserve"> PAGEREF _Toc242036553 \h </w:instrText>
             </w:r>
             <w:r>
               <w:rPr>
@@ -918,7 +982,7 @@
                 <w:noProof/>
                 <w:webHidden/>
               </w:rPr>
-              <w:t>8</w:t>
+              <w:t>9</w:t>
             </w:r>
             <w:r>
               <w:rPr>
@@ -945,7 +1009,7 @@
               <w:lang w:eastAsia="en-GB"/>
             </w:rPr>
           </w:pPr>
-          <w:hyperlink w:anchor="_Toc242025030" w:history="1">
+          <w:hyperlink w:anchor="_Toc242036554" w:history="1">
             <w:r>
               <w:rPr>
                 <w:rStyle w:val="Hyperlink"/>
@@ -973,7 +1037,7 @@
                 <w:noProof/>
                 <w:webHidden/>
               </w:rPr>
-              <w:instrText xml:space="preserve"> PAGEREF _Toc242025030 \h </w:instrText>
+              <w:instrText xml:space="preserve"> PAGEREF _Toc242036554 \h </w:instrText>
             </w:r>
             <w:r>
               <w:rPr>
@@ -1020,7 +1084,7 @@
               <w:lang w:eastAsia="en-GB"/>
             </w:rPr>
           </w:pPr>
-          <w:hyperlink w:anchor="_Toc242025031" w:history="1">
+          <w:hyperlink w:anchor="_Toc242036555" w:history="1">
             <w:r>
               <w:rPr>
                 <w:rStyle w:val="Hyperlink"/>
@@ -1048,7 +1112,7 @@
                 <w:noProof/>
                 <w:webHidden/>
               </w:rPr>
-              <w:instrText xml:space="preserve"> PAGEREF _Toc242025031 \h </w:instrText>
+              <w:instrText xml:space="preserve"> PAGEREF _Toc242036555 \h </w:instrText>
             </w:r>
             <w:r>
               <w:rPr>
@@ -1095,7 +1159,7 @@
               <w:lang w:eastAsia="en-GB"/>
             </w:rPr>
           </w:pPr>
-          <w:hyperlink w:anchor="_Toc242025032" w:history="1">
+          <w:hyperlink w:anchor="_Toc242036556" w:history="1">
             <w:r>
               <w:rPr>
                 <w:rStyle w:val="Hyperlink"/>
@@ -1122,7 +1186,7 @@
                 <w:noProof/>
                 <w:webHidden/>
               </w:rPr>
-              <w:instrText xml:space="preserve"> PAGEREF _Toc242025032 \h </w:instrText>
+              <w:instrText xml:space="preserve"> PAGEREF _Toc242036556 \h </w:instrText>
             </w:r>
             <w:r>
               <w:rPr>
@@ -1169,7 +1233,7 @@
               <w:lang w:eastAsia="en-GB"/>
             </w:rPr>
           </w:pPr>
-          <w:hyperlink w:anchor="_Toc242025033" w:history="1">
+          <w:hyperlink w:anchor="_Toc242036557" w:history="1">
             <w:r>
               <w:rPr>
                 <w:rStyle w:val="Hyperlink"/>
@@ -1196,7 +1260,7 @@
                 <w:noProof/>
                 <w:webHidden/>
               </w:rPr>
-              <w:instrText xml:space="preserve"> PAGEREF _Toc242025033 \h </w:instrText>
+              <w:instrText xml:space="preserve"> PAGEREF _Toc242036557 \h </w:instrText>
             </w:r>
             <w:r>
               <w:rPr>
@@ -1243,14 +1307,14 @@
               <w:lang w:eastAsia="en-GB"/>
             </w:rPr>
           </w:pPr>
-          <w:hyperlink w:anchor="_Toc242025034" w:history="1">
+          <w:hyperlink w:anchor="_Toc242036558" w:history="1">
             <w:r>
               <w:rPr>
                 <w:rStyle w:val="Hyperlink"/>
                 <w:noProof/>
                 <w:lang w:val="en-US"/>
               </w:rPr>
-              <w:t>Pre-Processing – Analysis and Sample set creation</w:t>
+              <w:t>Analysis and Sample set creation Reproducibility</w:t>
             </w:r>
             <w:r>
               <w:rPr>
@@ -1271,7 +1335,7 @@
                 <w:noProof/>
                 <w:webHidden/>
               </w:rPr>
-              <w:instrText xml:space="preserve"> PAGEREF _Toc242025034 \h </w:instrText>
+              <w:instrText xml:space="preserve"> PAGEREF _Toc242036558 \h </w:instrText>
             </w:r>
             <w:r>
               <w:rPr>
@@ -1291,7 +1355,7 @@
                 <w:noProof/>
                 <w:webHidden/>
               </w:rPr>
-              <w:t>15</w:t>
+              <w:t>16</w:t>
             </w:r>
             <w:r>
               <w:rPr>
@@ -1346,7 +1410,7 @@
           <w:lang w:val="en-US"/>
         </w:rPr>
       </w:pPr>
-      <w:bookmarkStart w:id="0" w:name="_Toc242025019"/>
+      <w:bookmarkStart w:id="0" w:name="_Toc242036542"/>
       <w:r>
         <w:rPr>
           <w:rFonts w:asciiTheme="minorHAnsi" w:hAnsiTheme="minorHAnsi"/>
@@ -1579,7 +1643,7 @@
           <w:lang w:val="en-US"/>
         </w:rPr>
       </w:pPr>
-      <w:bookmarkStart w:id="1" w:name="_Toc242025020"/>
+      <w:bookmarkStart w:id="1" w:name="_Toc242036543"/>
       <w:r>
         <w:rPr>
           <w:rFonts w:asciiTheme="minorHAnsi" w:hAnsiTheme="minorHAnsi"/>
@@ -1951,7 +2015,7 @@
           <w:lang w:val="en-US"/>
         </w:rPr>
       </w:pPr>
-      <w:bookmarkStart w:id="2" w:name="_Toc242025021"/>
+      <w:bookmarkStart w:id="2" w:name="_Toc242036544"/>
       <w:r>
         <w:rPr>
           <w:rFonts w:asciiTheme="minorHAnsi" w:hAnsiTheme="minorHAnsi"/>
@@ -1963,17 +2027,18 @@
     </w:p>
     <w:p>
       <w:pPr>
-        <w:pStyle w:val="FirstParagraph"/>
-        <w:shd w:val="clear" w:color="auto" w:fill="FFF2CC"/>
-        <w:rPr>
-          <w:rFonts w:asciiTheme="minorHAnsi" w:hAnsiTheme="minorHAnsi"/>
-        </w:rPr>
-      </w:pPr>
-      <w:r>
+        <w:pStyle w:val="BodyText"/>
         <w:rPr>
           <w:rFonts w:asciiTheme="minorHAnsi" w:hAnsiTheme="minorHAnsi"/>
           <w:i/>
-          <w:color w:val="7F6000"/>
+          <w:iCs/>
+        </w:rPr>
+      </w:pPr>
+      <w:r>
+        <w:rPr>
+          <w:rFonts w:asciiTheme="minorHAnsi" w:hAnsiTheme="minorHAnsi"/>
+          <w:i/>
+          <w:iCs/>
         </w:rPr>
         <w:t>Goal</w:t>
       </w:r>
@@ -1981,7 +2046,7 @@
         <w:rPr>
           <w:rFonts w:asciiTheme="minorHAnsi" w:hAnsiTheme="minorHAnsi"/>
           <w:i/>
-          <w:color w:val="7F6000"/>
+          <w:iCs/>
         </w:rPr>
         <w:t xml:space="preserve"> - Clearly states where the raw data will live, including the storage system/location and why it is appropriate.</w:t>
       </w:r>
@@ -2173,7 +2238,7 @@
           <w:rFonts w:asciiTheme="minorHAnsi" w:hAnsiTheme="minorHAnsi"/>
         </w:rPr>
       </w:pPr>
-      <w:bookmarkStart w:id="3" w:name="_Toc242025022"/>
+      <w:bookmarkStart w:id="3" w:name="_Toc242036545"/>
       <w:r>
         <w:rPr>
           <w:rFonts w:asciiTheme="minorHAnsi" w:hAnsiTheme="minorHAnsi"/>
@@ -2378,9 +2443,9 @@
           <w14:ligatures w14:val="standardContextual"/>
         </w:rPr>
         <w:drawing>
-          <wp:inline distT="0" distB="0" distL="0" distR="0" wp14:anchorId="7CA69B00" wp14:editId="37FED647">
-            <wp:extent cx="4317577" cy="2494589"/>
-            <wp:effectExtent l="0" t="0" r="635" b="0"/>
+          <wp:inline distT="0" distB="0" distL="0" distR="0" wp14:anchorId="7CA69B00" wp14:editId="025D9229">
+            <wp:extent cx="3191933" cy="1844220"/>
+            <wp:effectExtent l="0" t="0" r="0" b="0"/>
             <wp:docPr id="1852391289" name="Picture 1" descr="A screenshot of a computer&#10;&#10;Description automatically generated"/>
             <wp:cNvGraphicFramePr>
               <a:graphicFrameLocks xmlns:a="http://schemas.openxmlformats.org/drawingml/2006/main" noChangeAspect="1"/>
@@ -2407,7 +2472,7 @@
                   <pic:spPr>
                     <a:xfrm>
                       <a:off x="0" y="0"/>
-                      <a:ext cx="4326795" cy="2499915"/>
+                      <a:ext cx="3205511" cy="1852065"/>
                     </a:xfrm>
                     <a:prstGeom prst="rect">
                       <a:avLst/>
@@ -2435,7 +2500,7 @@
           <w:lang w:val="en-US"/>
         </w:rPr>
       </w:pPr>
-      <w:bookmarkStart w:id="4" w:name="_Toc242025023"/>
+      <w:bookmarkStart w:id="4" w:name="_Toc242036546"/>
       <w:r>
         <w:rPr>
           <w:rFonts w:asciiTheme="minorHAnsi" w:hAnsiTheme="minorHAnsi"/>
@@ -2458,46 +2523,151 @@
         <w:pStyle w:val="FirstParagraph"/>
         <w:rPr>
           <w:rFonts w:asciiTheme="minorHAnsi" w:hAnsiTheme="minorHAnsi"/>
-        </w:rPr>
-      </w:pPr>
-      <w:r>
-        <w:rPr>
-          <w:rFonts w:asciiTheme="minorHAnsi" w:hAnsiTheme="minorHAnsi"/>
-        </w:rPr>
-        <w:t>The download of the raw dataset and uploading to the GCS bucket can be reproduced using the related Jupyter notebook listed below which is</w:t>
-      </w:r>
-      <w:r>
-        <w:rPr>
-          <w:rFonts w:asciiTheme="minorHAnsi" w:hAnsiTheme="minorHAnsi"/>
-        </w:rPr>
-        <w:t xml:space="preserve"> maintained within the Git</w:t>
-      </w:r>
-      <w:r>
-        <w:rPr>
-          <w:rFonts w:asciiTheme="minorHAnsi" w:hAnsiTheme="minorHAnsi"/>
-        </w:rPr>
-        <w:t>H</w:t>
-      </w:r>
-      <w:r>
-        <w:rPr>
-          <w:rFonts w:asciiTheme="minorHAnsi" w:hAnsiTheme="minorHAnsi"/>
-        </w:rPr>
-        <w:t>ub repo and</w:t>
-      </w:r>
-      <w:r>
-        <w:rPr>
-          <w:rFonts w:asciiTheme="minorHAnsi" w:hAnsiTheme="minorHAnsi"/>
-        </w:rPr>
-        <w:t xml:space="preserve"> designed to run in </w:t>
-      </w:r>
-      <w:r>
-        <w:rPr>
-          <w:rFonts w:asciiTheme="minorHAnsi" w:hAnsiTheme="minorHAnsi"/>
           <w:b/>
           <w:bCs/>
         </w:rPr>
+      </w:pPr>
+      <w:r>
+        <w:rPr>
+          <w:rFonts w:asciiTheme="minorHAnsi" w:hAnsiTheme="minorHAnsi"/>
+        </w:rPr>
+        <w:t>The download of the raw dataset and uploading to the GCS bucket can be reproduced using the related Jupyter notebook listed below which is</w:t>
+      </w:r>
+      <w:r>
+        <w:rPr>
+          <w:rFonts w:asciiTheme="minorHAnsi" w:hAnsiTheme="minorHAnsi"/>
+        </w:rPr>
+        <w:t xml:space="preserve"> maintained within the Git</w:t>
+      </w:r>
+      <w:r>
+        <w:rPr>
+          <w:rFonts w:asciiTheme="minorHAnsi" w:hAnsiTheme="minorHAnsi"/>
+        </w:rPr>
+        <w:t>H</w:t>
+      </w:r>
+      <w:r>
+        <w:rPr>
+          <w:rFonts w:asciiTheme="minorHAnsi" w:hAnsiTheme="minorHAnsi"/>
+        </w:rPr>
+        <w:t>ub repo and</w:t>
+      </w:r>
+      <w:r>
+        <w:rPr>
+          <w:rFonts w:asciiTheme="minorHAnsi" w:hAnsiTheme="minorHAnsi"/>
+        </w:rPr>
+        <w:t xml:space="preserve"> designed to run in </w:t>
+      </w:r>
+      <w:r>
+        <w:rPr>
+          <w:rFonts w:asciiTheme="minorHAnsi" w:hAnsiTheme="minorHAnsi"/>
+          <w:b/>
+          <w:bCs/>
+        </w:rPr>
         <w:t>Google Colab</w:t>
       </w:r>
+    </w:p>
+    <w:p>
+      <w:pPr>
+        <w:pStyle w:val="BodyText"/>
+        <w:rPr>
+          <w:lang w:val="en-US"/>
+        </w:rPr>
+      </w:pPr>
+      <w:r>
+        <w:rPr>
+          <w:lang w:val="en-US"/>
+        </w:rPr>
+        <w:t xml:space="preserve">Note: As most users will only have read access to the existing bucket </w:t>
+      </w:r>
+      <w:r>
+        <w:rPr>
+          <w:lang w:val="en-US"/>
+        </w:rPr>
+        <w:t xml:space="preserve">referenced </w:t>
+      </w:r>
+      <w:r>
+        <w:rPr>
+          <w:lang w:val="en-US"/>
+        </w:rPr>
+        <w:t xml:space="preserve">not all steps in the notebooks will work as expected. If you wish to run all </w:t>
+      </w:r>
+      <w:proofErr w:type="gramStart"/>
+      <w:r>
+        <w:rPr>
+          <w:lang w:val="en-US"/>
+        </w:rPr>
+        <w:t>steps</w:t>
+      </w:r>
+      <w:proofErr w:type="gramEnd"/>
+      <w:r>
+        <w:rPr>
+          <w:lang w:val="en-US"/>
+        </w:rPr>
+        <w:t xml:space="preserve"> please update the</w:t>
+      </w:r>
+      <w:r>
+        <w:rPr>
+          <w:lang w:val="en-US"/>
+        </w:rPr>
+        <w:t xml:space="preserve"> following configuration variables in Step 2 to one of your Google Cloud</w:t>
+      </w:r>
+      <w:r>
+        <w:rPr>
+          <w:lang w:val="en-US"/>
+        </w:rPr>
+        <w:t xml:space="preserve"> </w:t>
+      </w:r>
+      <w:r>
+        <w:rPr>
+          <w:lang w:val="en-US"/>
+        </w:rPr>
+        <w:t>projects instead</w:t>
+      </w:r>
+    </w:p>
+    <w:p>
+      <w:pPr>
+        <w:pStyle w:val="BodyText"/>
+        <w:numPr>
+          <w:ilvl w:val="0"/>
+          <w:numId w:val="19"/>
+        </w:numPr>
+        <w:rPr>
+          <w:rFonts w:asciiTheme="minorHAnsi" w:hAnsiTheme="minorHAnsi"/>
+          <w:lang w:val="en-US"/>
+        </w:rPr>
+      </w:pPr>
+      <w:r>
+        <w:rPr>
+          <w:rFonts w:asciiTheme="minorHAnsi" w:hAnsiTheme="minorHAnsi"/>
+          <w:lang w:val="en-US"/>
+        </w:rPr>
+        <w:t>PROJECT_ID</w:t>
+      </w:r>
+    </w:p>
+    <w:p>
+      <w:pPr>
+        <w:pStyle w:val="BodyText"/>
+        <w:numPr>
+          <w:ilvl w:val="0"/>
+          <w:numId w:val="19"/>
+        </w:numPr>
+        <w:rPr>
+          <w:rFonts w:asciiTheme="minorHAnsi" w:hAnsiTheme="minorHAnsi"/>
+          <w:lang w:val="en-US"/>
+        </w:rPr>
+      </w:pPr>
+      <w:r>
+        <w:rPr>
+          <w:rFonts w:asciiTheme="minorHAnsi" w:hAnsiTheme="minorHAnsi"/>
+          <w:lang w:val="en-US"/>
+        </w:rPr>
+        <w:t>BUCKET_NAME</w:t>
+      </w:r>
+    </w:p>
+    <w:p>
+      <w:pPr>
+        <w:pStyle w:val="BodyText"/>
+      </w:pPr>
     </w:p>
     <w:tbl>
       <w:tblPr>
@@ -2964,20 +3134,13 @@
     </w:p>
     <w:p>
       <w:pPr>
-        <w:rPr>
+        <w:pStyle w:val="Heading1"/>
+        <w:rPr>
+          <w:rFonts w:asciiTheme="minorHAnsi" w:hAnsiTheme="minorHAnsi"/>
           <w:lang w:val="en-US"/>
         </w:rPr>
       </w:pPr>
-    </w:p>
-    <w:p>
-      <w:pPr>
-        <w:pStyle w:val="Heading1"/>
-        <w:rPr>
-          <w:rFonts w:asciiTheme="minorHAnsi" w:hAnsiTheme="minorHAnsi"/>
-          <w:lang w:val="en-US"/>
-        </w:rPr>
-      </w:pPr>
-      <w:bookmarkStart w:id="5" w:name="_Toc242025024"/>
+      <w:bookmarkStart w:id="5" w:name="_Toc242036547"/>
       <w:r>
         <w:rPr>
           <w:rFonts w:asciiTheme="minorHAnsi" w:hAnsiTheme="minorHAnsi"/>
@@ -3010,17 +3173,18 @@
     </w:p>
     <w:p>
       <w:pPr>
-        <w:pStyle w:val="FirstParagraph"/>
-        <w:shd w:val="clear" w:color="auto" w:fill="FFF2CC"/>
-        <w:rPr>
-          <w:rFonts w:asciiTheme="minorHAnsi" w:hAnsiTheme="minorHAnsi"/>
-        </w:rPr>
-      </w:pPr>
-      <w:r>
+        <w:pStyle w:val="BodyText"/>
         <w:rPr>
           <w:rFonts w:asciiTheme="minorHAnsi" w:hAnsiTheme="minorHAnsi"/>
           <w:i/>
-          <w:color w:val="7F6000"/>
+          <w:iCs/>
+        </w:rPr>
+      </w:pPr>
+      <w:r>
+        <w:rPr>
+          <w:rFonts w:asciiTheme="minorHAnsi" w:hAnsiTheme="minorHAnsi"/>
+          <w:i/>
+          <w:iCs/>
         </w:rPr>
         <w:t>Goal</w:t>
       </w:r>
@@ -3028,7 +3192,7 @@
         <w:rPr>
           <w:rFonts w:asciiTheme="minorHAnsi" w:hAnsiTheme="minorHAnsi"/>
           <w:i/>
-          <w:color w:val="7F6000"/>
+          <w:iCs/>
         </w:rPr>
         <w:t xml:space="preserve"> - Clearly describes where processed data will be stored and specifies appropriate file formats for raw and/or processed data, with enough detail to understand the intended representation.</w:t>
       </w:r>
@@ -3175,6 +3339,7 @@
         <w:rPr>
           <w:rFonts w:asciiTheme="minorHAnsi" w:hAnsiTheme="minorHAnsi"/>
         </w:rPr>
+        <w:lastRenderedPageBreak/>
         <w:t>The processed dataset will be stored in the same Google Cloud Storage bucket as the raw data, but in a separate processed/ folder</w:t>
       </w:r>
       <w:r>
@@ -3212,7 +3377,6 @@
           <w:rFonts w:asciiTheme="minorHAnsi" w:hAnsiTheme="minorHAnsi"/>
           <w:color w:val="000000" w:themeColor="text1"/>
         </w:rPr>
-        <w:lastRenderedPageBreak/>
         <w:t>Storing the processed data separately ensures that the original raw source data remains unchanged. It also supports reproducibility as the processed data can be reproduced from the raw datasets using the associated notebook.</w:t>
       </w:r>
     </w:p>
@@ -3245,7 +3409,7 @@
           <w:lang w:val="en-US"/>
         </w:rPr>
       </w:pPr>
-      <w:bookmarkStart w:id="6" w:name="_Toc242025025"/>
+      <w:bookmarkStart w:id="6" w:name="_Toc242036548"/>
       <w:r>
         <w:rPr>
           <w:rFonts w:asciiTheme="minorHAnsi" w:hAnsiTheme="minorHAnsi"/>
@@ -3292,17 +3456,18 @@
     </w:p>
     <w:p>
       <w:pPr>
-        <w:pStyle w:val="FirstParagraph"/>
-        <w:shd w:val="clear" w:color="auto" w:fill="FFF2CC"/>
-        <w:rPr>
-          <w:rFonts w:asciiTheme="minorHAnsi" w:hAnsiTheme="minorHAnsi"/>
-        </w:rPr>
-      </w:pPr>
-      <w:r>
+        <w:pStyle w:val="BodyText"/>
         <w:rPr>
           <w:rFonts w:asciiTheme="minorHAnsi" w:hAnsiTheme="minorHAnsi"/>
           <w:i/>
-          <w:color w:val="7F6000"/>
+          <w:iCs/>
+        </w:rPr>
+      </w:pPr>
+      <w:r>
+        <w:rPr>
+          <w:rFonts w:asciiTheme="minorHAnsi" w:hAnsiTheme="minorHAnsi"/>
+          <w:i/>
+          <w:iCs/>
         </w:rPr>
         <w:t>Goal</w:t>
       </w:r>
@@ -3310,7 +3475,7 @@
         <w:rPr>
           <w:rFonts w:asciiTheme="minorHAnsi" w:hAnsiTheme="minorHAnsi"/>
           <w:i/>
-          <w:color w:val="7F6000"/>
+          <w:iCs/>
         </w:rPr>
         <w:t xml:space="preserve"> - Explicitly considers whether a database, object storage, file system, or other solution is needed. The choice is justified in relation to the project’s data and access requirements.</w:t>
       </w:r>
@@ -3579,7 +3744,7 @@
           <w:lang w:val="en-US"/>
         </w:rPr>
       </w:pPr>
-      <w:bookmarkStart w:id="7" w:name="_Toc242025026"/>
+      <w:bookmarkStart w:id="7" w:name="_Toc242036549"/>
       <w:r>
         <w:rPr>
           <w:rFonts w:asciiTheme="minorHAnsi" w:hAnsiTheme="minorHAnsi"/>
@@ -3606,17 +3771,18 @@
     </w:p>
     <w:p>
       <w:pPr>
-        <w:pStyle w:val="FirstParagraph"/>
-        <w:shd w:val="clear" w:color="auto" w:fill="FFF2CC"/>
-        <w:rPr>
-          <w:rFonts w:asciiTheme="minorHAnsi" w:hAnsiTheme="minorHAnsi"/>
-        </w:rPr>
-      </w:pPr>
-      <w:r>
+        <w:pStyle w:val="BodyText"/>
         <w:rPr>
           <w:rFonts w:asciiTheme="minorHAnsi" w:hAnsiTheme="minorHAnsi"/>
           <w:i/>
-          <w:color w:val="7F6000"/>
+          <w:iCs/>
+        </w:rPr>
+      </w:pPr>
+      <w:r>
+        <w:rPr>
+          <w:rFonts w:asciiTheme="minorHAnsi" w:hAnsiTheme="minorHAnsi"/>
+          <w:i/>
+          <w:iCs/>
         </w:rPr>
         <w:t>Goal</w:t>
       </w:r>
@@ -3624,7 +3790,7 @@
         <w:rPr>
           <w:rFonts w:asciiTheme="minorHAnsi" w:hAnsiTheme="minorHAnsi"/>
           <w:i/>
-          <w:color w:val="7F6000"/>
+          <w:iCs/>
         </w:rPr>
         <w:t xml:space="preserve"> - Explains how different versions of the data will be identified and tracked, including changes to datasets where relevant.</w:t>
       </w:r>
@@ -3791,7 +3957,7 @@
           <w:lang w:val="en-US"/>
         </w:rPr>
       </w:pPr>
-      <w:bookmarkStart w:id="8" w:name="_Toc242025027"/>
+      <w:bookmarkStart w:id="8" w:name="_Toc242036550"/>
       <w:r>
         <w:rPr>
           <w:rFonts w:asciiTheme="minorHAnsi" w:hAnsiTheme="minorHAnsi"/>
@@ -3817,17 +3983,18 @@
     </w:p>
     <w:p>
       <w:pPr>
-        <w:pStyle w:val="FirstParagraph"/>
-        <w:shd w:val="clear" w:color="auto" w:fill="FFF2CC"/>
-        <w:rPr>
-          <w:rFonts w:asciiTheme="minorHAnsi" w:hAnsiTheme="minorHAnsi"/>
-        </w:rPr>
-      </w:pPr>
-      <w:r>
+        <w:pStyle w:val="BodyText"/>
         <w:rPr>
           <w:rFonts w:asciiTheme="minorHAnsi" w:hAnsiTheme="minorHAnsi"/>
           <w:i/>
-          <w:color w:val="7F6000"/>
+          <w:iCs/>
+        </w:rPr>
+      </w:pPr>
+      <w:r>
+        <w:rPr>
+          <w:rFonts w:asciiTheme="minorHAnsi" w:hAnsiTheme="minorHAnsi"/>
+          <w:i/>
+          <w:iCs/>
         </w:rPr>
         <w:t>Goal</w:t>
       </w:r>
@@ -3835,7 +4002,7 @@
         <w:rPr>
           <w:rFonts w:asciiTheme="minorHAnsi" w:hAnsiTheme="minorHAnsi"/>
           <w:i/>
-          <w:color w:val="7F6000"/>
+          <w:iCs/>
         </w:rPr>
         <w:t xml:space="preserve"> - Clearly explains how the system/code will access the data, including relevant paths, APIs, credentials/access mechanisms, or other interfaces as appropriate.</w:t>
       </w:r>
@@ -4318,7 +4485,7 @@
           <w:lang w:val="en-US"/>
         </w:rPr>
       </w:pPr>
-      <w:bookmarkStart w:id="9" w:name="_Toc242025028"/>
+      <w:bookmarkStart w:id="9" w:name="_Toc242036551"/>
       <w:r>
         <w:rPr>
           <w:rFonts w:asciiTheme="minorHAnsi" w:hAnsiTheme="minorHAnsi"/>
@@ -4345,17 +4512,18 @@
     </w:p>
     <w:p>
       <w:pPr>
-        <w:pStyle w:val="FirstParagraph"/>
-        <w:shd w:val="clear" w:color="auto" w:fill="FFF2CC"/>
-        <w:rPr>
-          <w:rFonts w:asciiTheme="minorHAnsi" w:hAnsiTheme="minorHAnsi"/>
-        </w:rPr>
-      </w:pPr>
-      <w:r>
+        <w:pStyle w:val="BodyText"/>
         <w:rPr>
           <w:rFonts w:asciiTheme="minorHAnsi" w:hAnsiTheme="minorHAnsi"/>
           <w:i/>
-          <w:color w:val="7F6000"/>
+          <w:iCs/>
+        </w:rPr>
+      </w:pPr>
+      <w:r>
+        <w:rPr>
+          <w:rFonts w:asciiTheme="minorHAnsi" w:hAnsiTheme="minorHAnsi"/>
+          <w:i/>
+          <w:iCs/>
         </w:rPr>
         <w:t>Goal</w:t>
       </w:r>
@@ -4363,7 +4531,7 @@
         <w:rPr>
           <w:rFonts w:asciiTheme="minorHAnsi" w:hAnsiTheme="minorHAnsi"/>
           <w:i/>
-          <w:color w:val="7F6000"/>
+          <w:iCs/>
         </w:rPr>
         <w:t xml:space="preserve"> - Provides a clear and appropriate data-splitting strategy: either cross-validation or a train/dev/test split. The description specifies how the split/validation will be performed and avoids inappropriate data leakage.</w:t>
       </w:r>
@@ -4727,9 +4895,11 @@
       <w:pPr>
         <w:pStyle w:val="Heading2"/>
       </w:pPr>
+      <w:bookmarkStart w:id="10" w:name="_Toc242036552"/>
       <w:r>
         <w:t>Data Split / Validation Strategy Reproducibility - TBC</w:t>
       </w:r>
+      <w:bookmarkEnd w:id="10"/>
     </w:p>
     <w:p>
       <w:pPr>
@@ -5232,7 +5402,7 @@
           <w:lang w:val="en-US"/>
         </w:rPr>
       </w:pPr>
-      <w:bookmarkStart w:id="10" w:name="_Toc242025029"/>
+      <w:bookmarkStart w:id="11" w:name="_Toc242036553"/>
       <w:r>
         <w:rPr>
           <w:rFonts w:asciiTheme="minorHAnsi" w:hAnsiTheme="minorHAnsi"/>
@@ -5254,21 +5424,22 @@
         </w:rPr>
         <w:t>Feature Description</w:t>
       </w:r>
-      <w:bookmarkEnd w:id="10"/>
+      <w:bookmarkEnd w:id="11"/>
     </w:p>
     <w:p>
       <w:pPr>
-        <w:pStyle w:val="FirstParagraph"/>
-        <w:shd w:val="clear" w:color="auto" w:fill="FFF2CC"/>
-        <w:rPr>
-          <w:rFonts w:asciiTheme="minorHAnsi" w:hAnsiTheme="minorHAnsi"/>
-        </w:rPr>
-      </w:pPr>
-      <w:r>
+        <w:pStyle w:val="BodyText"/>
         <w:rPr>
           <w:rFonts w:asciiTheme="minorHAnsi" w:hAnsiTheme="minorHAnsi"/>
           <w:i/>
-          <w:color w:val="7F6000"/>
+          <w:iCs/>
+        </w:rPr>
+      </w:pPr>
+      <w:r>
+        <w:rPr>
+          <w:rFonts w:asciiTheme="minorHAnsi" w:hAnsiTheme="minorHAnsi"/>
+          <w:i/>
+          <w:iCs/>
         </w:rPr>
         <w:t>Goal</w:t>
       </w:r>
@@ -5276,7 +5447,7 @@
         <w:rPr>
           <w:rFonts w:asciiTheme="minorHAnsi" w:hAnsiTheme="minorHAnsi"/>
           <w:i/>
-          <w:color w:val="7F6000"/>
+          <w:iCs/>
         </w:rPr>
         <w:t xml:space="preserve"> - Features used by the AI system are clearly identified and described. It is possible to understand what each feature represents and how it is obtained or constructed.</w:t>
       </w:r>
@@ -6129,7 +6300,7 @@
           <w:lang w:val="en-US"/>
         </w:rPr>
       </w:pPr>
-      <w:bookmarkStart w:id="11" w:name="_Toc242025030"/>
+      <w:bookmarkStart w:id="12" w:name="_Toc242036554"/>
       <w:r>
         <w:rPr>
           <w:rFonts w:asciiTheme="minorHAnsi" w:hAnsiTheme="minorHAnsi"/>
@@ -6151,21 +6322,22 @@
         </w:rPr>
         <w:t>Data Types and Formats</w:t>
       </w:r>
-      <w:bookmarkEnd w:id="11"/>
+      <w:bookmarkEnd w:id="12"/>
     </w:p>
     <w:p>
       <w:pPr>
-        <w:pStyle w:val="FirstParagraph"/>
-        <w:shd w:val="clear" w:color="auto" w:fill="FFF2CC"/>
-        <w:rPr>
-          <w:rFonts w:asciiTheme="minorHAnsi" w:hAnsiTheme="minorHAnsi"/>
-        </w:rPr>
-      </w:pPr>
-      <w:r>
+        <w:pStyle w:val="BodyText"/>
         <w:rPr>
           <w:rFonts w:asciiTheme="minorHAnsi" w:hAnsiTheme="minorHAnsi"/>
           <w:i/>
-          <w:color w:val="7F6000"/>
+          <w:iCs/>
+        </w:rPr>
+      </w:pPr>
+      <w:r>
+        <w:rPr>
+          <w:rFonts w:asciiTheme="minorHAnsi" w:hAnsiTheme="minorHAnsi"/>
+          <w:i/>
+          <w:iCs/>
         </w:rPr>
         <w:t>Goal</w:t>
       </w:r>
@@ -6173,7 +6345,7 @@
         <w:rPr>
           <w:rFonts w:asciiTheme="minorHAnsi" w:hAnsiTheme="minorHAnsi"/>
           <w:i/>
-          <w:color w:val="7F6000"/>
+          <w:iCs/>
         </w:rPr>
         <w:t xml:space="preserve"> - Specifies relevant data types and formats (e.g., numerical, categorical, text, image; integer, float, string; CSV, JSON, Parquet, etc.) sufficiently to understand how the data will be handled.</w:t>
       </w:r>
@@ -8702,7 +8874,7 @@
           <w:lang w:val="en-US"/>
         </w:rPr>
       </w:pPr>
-      <w:bookmarkStart w:id="12" w:name="_Toc242025031"/>
+      <w:bookmarkStart w:id="13" w:name="_Toc242036555"/>
       <w:r>
         <w:rPr>
           <w:rFonts w:asciiTheme="minorHAnsi" w:hAnsiTheme="minorHAnsi"/>
@@ -8724,21 +8896,22 @@
         </w:rPr>
         <w:t>Reproducibility of Pre-Processing</w:t>
       </w:r>
-      <w:bookmarkEnd w:id="12"/>
+      <w:bookmarkEnd w:id="13"/>
     </w:p>
     <w:p>
       <w:pPr>
-        <w:pStyle w:val="FirstParagraph"/>
-        <w:shd w:val="clear" w:color="auto" w:fill="FFF2CC"/>
-        <w:rPr>
-          <w:rFonts w:asciiTheme="minorHAnsi" w:hAnsiTheme="minorHAnsi"/>
-        </w:rPr>
-      </w:pPr>
-      <w:r>
+        <w:pStyle w:val="BodyText"/>
         <w:rPr>
           <w:rFonts w:asciiTheme="minorHAnsi" w:hAnsiTheme="minorHAnsi"/>
           <w:i/>
-          <w:color w:val="7F6000"/>
+          <w:iCs/>
+        </w:rPr>
+      </w:pPr>
+      <w:r>
+        <w:rPr>
+          <w:rFonts w:asciiTheme="minorHAnsi" w:hAnsiTheme="minorHAnsi"/>
+          <w:i/>
+          <w:iCs/>
         </w:rPr>
         <w:t>Goal</w:t>
       </w:r>
@@ -8746,7 +8919,7 @@
         <w:rPr>
           <w:rFonts w:asciiTheme="minorHAnsi" w:hAnsiTheme="minorHAnsi"/>
           <w:i/>
-          <w:color w:val="7F6000"/>
+          <w:iCs/>
         </w:rPr>
         <w:t xml:space="preserve"> - Describes how the data collection process can be reproduced, including data sources, collection procedures, relevant parameters/settings, and/or code where appropriate.</w:t>
       </w:r>
@@ -9106,11 +9279,11 @@
       <w:pPr>
         <w:pStyle w:val="Heading2"/>
       </w:pPr>
-      <w:bookmarkStart w:id="13" w:name="_Toc242025032"/>
+      <w:bookmarkStart w:id="14" w:name="_Toc242036556"/>
       <w:r>
         <w:t>Profiling/Raw data Analysis</w:t>
       </w:r>
-      <w:bookmarkEnd w:id="13"/>
+      <w:bookmarkEnd w:id="14"/>
     </w:p>
     <w:p>
       <w:pPr>
@@ -9968,11 +10141,11 @@
       <w:pPr>
         <w:pStyle w:val="Heading2"/>
       </w:pPr>
-      <w:bookmarkStart w:id="14" w:name="_Toc242025033"/>
+      <w:bookmarkStart w:id="15" w:name="_Toc242036557"/>
       <w:r>
         <w:t>Identifying Groups/Statas for Sampling</w:t>
       </w:r>
-      <w:bookmarkEnd w:id="14"/>
+      <w:bookmarkEnd w:id="15"/>
     </w:p>
     <w:p>
       <w:pPr>
@@ -10684,93 +10857,183 @@
           <w:lang w:val="en-US"/>
         </w:rPr>
       </w:pPr>
-      <w:bookmarkStart w:id="15" w:name="_Toc242025034"/>
+      <w:bookmarkStart w:id="16" w:name="_Toc242036558"/>
       <w:r>
         <w:rPr>
           <w:rFonts w:asciiTheme="minorHAnsi" w:hAnsiTheme="minorHAnsi"/>
           <w:lang w:val="en-US"/>
         </w:rPr>
         <w:lastRenderedPageBreak/>
-        <w:t>Pre-Processing</w:t>
+        <w:t>Analysis and Sample set creation</w:t>
       </w:r>
       <w:r>
         <w:rPr>
           <w:rFonts w:asciiTheme="minorHAnsi" w:hAnsiTheme="minorHAnsi"/>
           <w:lang w:val="en-US"/>
         </w:rPr>
-        <w:t xml:space="preserve"> – Analysis and Sample set creation</w:t>
-      </w:r>
-      <w:bookmarkEnd w:id="15"/>
+        <w:t xml:space="preserve"> </w:t>
+      </w:r>
+      <w:r>
+        <w:rPr>
+          <w:rFonts w:asciiTheme="minorHAnsi" w:hAnsiTheme="minorHAnsi"/>
+          <w:lang w:val="en-US"/>
+        </w:rPr>
+        <w:t>Reproducibility</w:t>
+      </w:r>
+      <w:bookmarkEnd w:id="16"/>
     </w:p>
     <w:p>
       <w:pPr>
         <w:pStyle w:val="FirstParagraph"/>
         <w:rPr>
           <w:rFonts w:asciiTheme="minorHAnsi" w:hAnsiTheme="minorHAnsi"/>
-        </w:rPr>
-      </w:pPr>
-      <w:r>
-        <w:rPr>
-          <w:rFonts w:asciiTheme="minorHAnsi" w:hAnsiTheme="minorHAnsi"/>
-        </w:rPr>
-        <w:t xml:space="preserve">The </w:t>
-      </w:r>
-      <w:r>
-        <w:rPr>
-          <w:rFonts w:asciiTheme="minorHAnsi" w:hAnsiTheme="minorHAnsi"/>
-        </w:rPr>
-        <w:t xml:space="preserve">initial </w:t>
-      </w:r>
-      <w:r>
-        <w:rPr>
-          <w:rFonts w:asciiTheme="minorHAnsi" w:hAnsiTheme="minorHAnsi"/>
-        </w:rPr>
-        <w:t>analysis</w:t>
-      </w:r>
-      <w:r>
-        <w:rPr>
-          <w:rFonts w:asciiTheme="minorHAnsi" w:hAnsiTheme="minorHAnsi"/>
-        </w:rPr>
-        <w:t xml:space="preserve">, strata identification and sample set creation including </w:t>
-      </w:r>
-      <w:r>
-        <w:rPr>
-          <w:rFonts w:asciiTheme="minorHAnsi" w:hAnsiTheme="minorHAnsi"/>
-        </w:rPr>
-        <w:t>uploading</w:t>
-      </w:r>
-      <w:r>
-        <w:rPr>
-          <w:rFonts w:asciiTheme="minorHAnsi" w:hAnsiTheme="minorHAnsi"/>
-        </w:rPr>
-        <w:t xml:space="preserve"> the sample set</w:t>
-      </w:r>
-      <w:r>
-        <w:rPr>
-          <w:rFonts w:asciiTheme="minorHAnsi" w:hAnsiTheme="minorHAnsi"/>
-        </w:rPr>
-        <w:t xml:space="preserve"> to the GCS bucket can be reproduced using the related Jupyter notebook listed below which is maintained within the Git</w:t>
-      </w:r>
-      <w:r>
-        <w:rPr>
-          <w:rFonts w:asciiTheme="minorHAnsi" w:hAnsiTheme="minorHAnsi"/>
-        </w:rPr>
-        <w:t>H</w:t>
-      </w:r>
-      <w:r>
-        <w:rPr>
-          <w:rFonts w:asciiTheme="minorHAnsi" w:hAnsiTheme="minorHAnsi"/>
-        </w:rPr>
-        <w:t xml:space="preserve">ub repo and designed to run in </w:t>
-      </w:r>
-      <w:r>
-        <w:rPr>
-          <w:rFonts w:asciiTheme="minorHAnsi" w:hAnsiTheme="minorHAnsi"/>
           <w:b/>
           <w:bCs/>
         </w:rPr>
+      </w:pPr>
+      <w:r>
+        <w:rPr>
+          <w:rFonts w:asciiTheme="minorHAnsi" w:hAnsiTheme="minorHAnsi"/>
+        </w:rPr>
+        <w:t xml:space="preserve">The </w:t>
+      </w:r>
+      <w:r>
+        <w:rPr>
+          <w:rFonts w:asciiTheme="minorHAnsi" w:hAnsiTheme="minorHAnsi"/>
+        </w:rPr>
+        <w:t xml:space="preserve">initial </w:t>
+      </w:r>
+      <w:r>
+        <w:rPr>
+          <w:rFonts w:asciiTheme="minorHAnsi" w:hAnsiTheme="minorHAnsi"/>
+        </w:rPr>
+        <w:t>analysis</w:t>
+      </w:r>
+      <w:r>
+        <w:rPr>
+          <w:rFonts w:asciiTheme="minorHAnsi" w:hAnsiTheme="minorHAnsi"/>
+        </w:rPr>
+        <w:t xml:space="preserve">, strata identification and sample set creation including </w:t>
+      </w:r>
+      <w:r>
+        <w:rPr>
+          <w:rFonts w:asciiTheme="minorHAnsi" w:hAnsiTheme="minorHAnsi"/>
+        </w:rPr>
+        <w:t>uploading</w:t>
+      </w:r>
+      <w:r>
+        <w:rPr>
+          <w:rFonts w:asciiTheme="minorHAnsi" w:hAnsiTheme="minorHAnsi"/>
+        </w:rPr>
+        <w:t xml:space="preserve"> the sample set</w:t>
+      </w:r>
+      <w:r>
+        <w:rPr>
+          <w:rFonts w:asciiTheme="minorHAnsi" w:hAnsiTheme="minorHAnsi"/>
+        </w:rPr>
+        <w:t xml:space="preserve"> to the GCS bucket can be reproduced using the related Jupyter notebook listed below which is maintained within the Git</w:t>
+      </w:r>
+      <w:r>
+        <w:rPr>
+          <w:rFonts w:asciiTheme="minorHAnsi" w:hAnsiTheme="minorHAnsi"/>
+        </w:rPr>
+        <w:t>H</w:t>
+      </w:r>
+      <w:r>
+        <w:rPr>
+          <w:rFonts w:asciiTheme="minorHAnsi" w:hAnsiTheme="minorHAnsi"/>
+        </w:rPr>
+        <w:t xml:space="preserve">ub repo and designed to run in </w:t>
+      </w:r>
+      <w:r>
+        <w:rPr>
+          <w:rFonts w:asciiTheme="minorHAnsi" w:hAnsiTheme="minorHAnsi"/>
+          <w:b/>
+          <w:bCs/>
+        </w:rPr>
         <w:t>Google Colab</w:t>
       </w:r>
+    </w:p>
+    <w:p>
+      <w:pPr>
+        <w:pStyle w:val="BodyText"/>
+        <w:rPr>
+          <w:color w:val="000000" w:themeColor="text1"/>
+          <w:lang w:val="en-US"/>
+        </w:rPr>
+      </w:pPr>
+      <w:r>
+        <w:rPr>
+          <w:color w:val="000000" w:themeColor="text1"/>
+          <w:lang w:val="en-US"/>
+        </w:rPr>
+        <w:t xml:space="preserve">Note: As most users will only have read access to the existing bucket referenced not all steps in the notebooks will work as expected. If you wish to run all </w:t>
+      </w:r>
+      <w:proofErr w:type="gramStart"/>
+      <w:r>
+        <w:rPr>
+          <w:color w:val="000000" w:themeColor="text1"/>
+          <w:lang w:val="en-US"/>
+        </w:rPr>
+        <w:t>steps</w:t>
+      </w:r>
+      <w:proofErr w:type="gramEnd"/>
+      <w:r>
+        <w:rPr>
+          <w:color w:val="000000" w:themeColor="text1"/>
+          <w:lang w:val="en-US"/>
+        </w:rPr>
+        <w:t xml:space="preserve"> please update the following configuration variables in Step 2 to one of your Google Cloud projects instead</w:t>
+      </w:r>
+    </w:p>
+    <w:p>
+      <w:pPr>
+        <w:pStyle w:val="BodyText"/>
+        <w:numPr>
+          <w:ilvl w:val="0"/>
+          <w:numId w:val="19"/>
+        </w:numPr>
+        <w:rPr>
+          <w:rFonts w:asciiTheme="minorHAnsi" w:hAnsiTheme="minorHAnsi"/>
+          <w:color w:val="000000" w:themeColor="text1"/>
+          <w:lang w:val="en-US"/>
+        </w:rPr>
+      </w:pPr>
+      <w:r>
+        <w:rPr>
+          <w:rFonts w:asciiTheme="minorHAnsi" w:hAnsiTheme="minorHAnsi"/>
+          <w:color w:val="000000" w:themeColor="text1"/>
+          <w:lang w:val="en-US"/>
+        </w:rPr>
+        <w:t>PROJECT_ID</w:t>
+      </w:r>
+    </w:p>
+    <w:p>
+      <w:pPr>
+        <w:pStyle w:val="BodyText"/>
+        <w:numPr>
+          <w:ilvl w:val="0"/>
+          <w:numId w:val="19"/>
+        </w:numPr>
+        <w:rPr>
+          <w:rFonts w:asciiTheme="minorHAnsi" w:hAnsiTheme="minorHAnsi"/>
+          <w:color w:val="000000" w:themeColor="text1"/>
+          <w:lang w:val="en-US"/>
+        </w:rPr>
+      </w:pPr>
+      <w:r>
+        <w:rPr>
+          <w:rFonts w:asciiTheme="minorHAnsi" w:hAnsiTheme="minorHAnsi"/>
+          <w:color w:val="000000" w:themeColor="text1"/>
+          <w:lang w:val="en-US"/>
+        </w:rPr>
+        <w:t>BUCKET_NAME</w:t>
+      </w:r>
+    </w:p>
+    <w:p>
+      <w:pPr>
+        <w:pStyle w:val="BodyText"/>
+      </w:pPr>
     </w:p>
     <w:tbl>
       <w:tblPr>
@@ -11214,83 +11477,6 @@
         <w:pStyle w:val="BodyText"/>
         <w:rPr>
           <w:rFonts w:asciiTheme="minorHAnsi" w:hAnsiTheme="minorHAnsi"/>
-        </w:rPr>
-      </w:pPr>
-    </w:p>
-    <w:p/>
-    <w:p/>
-    <w:p>
-      <w:pPr>
-        <w:pStyle w:val="BodyText"/>
-      </w:pPr>
-    </w:p>
-    <w:p>
-      <w:pPr>
-        <w:rPr>
-          <w:lang w:val="en-US"/>
-        </w:rPr>
-      </w:pPr>
-    </w:p>
-    <w:p>
-      <w:pPr>
-        <w:rPr>
-          <w:lang w:val="en-US"/>
-        </w:rPr>
-      </w:pPr>
-    </w:p>
-    <w:p>
-      <w:pPr>
-        <w:rPr>
-          <w:lang w:val="en-US"/>
-        </w:rPr>
-      </w:pPr>
-    </w:p>
-    <w:p>
-      <w:pPr>
-        <w:rPr>
-          <w:lang w:val="en-US"/>
-        </w:rPr>
-      </w:pPr>
-    </w:p>
-    <w:p>
-      <w:pPr>
-        <w:rPr>
-          <w:lang w:val="en-US"/>
-        </w:rPr>
-      </w:pPr>
-    </w:p>
-    <w:p>
-      <w:pPr>
-        <w:rPr>
-          <w:lang w:val="en-US"/>
-        </w:rPr>
-      </w:pPr>
-    </w:p>
-    <w:p>
-      <w:pPr>
-        <w:rPr>
-          <w:lang w:val="en-US"/>
-        </w:rPr>
-      </w:pPr>
-    </w:p>
-    <w:p>
-      <w:pPr>
-        <w:rPr>
-          <w:lang w:val="en-US"/>
-        </w:rPr>
-      </w:pPr>
-    </w:p>
-    <w:p>
-      <w:pPr>
-        <w:rPr>
-          <w:lang w:val="en-US"/>
-        </w:rPr>
-      </w:pPr>
-    </w:p>
-    <w:p>
-      <w:pPr>
-        <w:rPr>
-          <w:lang w:val="en-US"/>
         </w:rPr>
       </w:pPr>
     </w:p>
@@ -13226,6 +13412,119 @@
     <w:nsid w:val="6706182C"/>
     <w:multiLevelType w:val="hybridMultilevel"/>
     <w:tmpl w:val="FBA82580"/>
+    <w:lvl w:ilvl="0" w:tplc="08090001">
+      <w:start w:val="1"/>
+      <w:numFmt w:val="bullet"/>
+      <w:lvlText w:val=""/>
+      <w:lvlJc w:val="left"/>
+      <w:pPr>
+        <w:ind w:left="720" w:hanging="360"/>
+      </w:pPr>
+      <w:rPr>
+        <w:rFonts w:ascii="Symbol" w:hAnsi="Symbol" w:hint="default"/>
+      </w:rPr>
+    </w:lvl>
+    <w:lvl w:ilvl="1" w:tplc="08090003" w:tentative="1">
+      <w:start w:val="1"/>
+      <w:numFmt w:val="bullet"/>
+      <w:lvlText w:val="o"/>
+      <w:lvlJc w:val="left"/>
+      <w:pPr>
+        <w:ind w:left="1440" w:hanging="360"/>
+      </w:pPr>
+      <w:rPr>
+        <w:rFonts w:ascii="Courier New" w:hAnsi="Courier New" w:cs="Courier New" w:hint="default"/>
+      </w:rPr>
+    </w:lvl>
+    <w:lvl w:ilvl="2" w:tplc="08090005" w:tentative="1">
+      <w:start w:val="1"/>
+      <w:numFmt w:val="bullet"/>
+      <w:lvlText w:val=""/>
+      <w:lvlJc w:val="left"/>
+      <w:pPr>
+        <w:ind w:left="2160" w:hanging="360"/>
+      </w:pPr>
+      <w:rPr>
+        <w:rFonts w:ascii="Wingdings" w:hAnsi="Wingdings" w:hint="default"/>
+      </w:rPr>
+    </w:lvl>
+    <w:lvl w:ilvl="3" w:tplc="08090001" w:tentative="1">
+      <w:start w:val="1"/>
+      <w:numFmt w:val="bullet"/>
+      <w:lvlText w:val=""/>
+      <w:lvlJc w:val="left"/>
+      <w:pPr>
+        <w:ind w:left="2880" w:hanging="360"/>
+      </w:pPr>
+      <w:rPr>
+        <w:rFonts w:ascii="Symbol" w:hAnsi="Symbol" w:hint="default"/>
+      </w:rPr>
+    </w:lvl>
+    <w:lvl w:ilvl="4" w:tplc="08090003" w:tentative="1">
+      <w:start w:val="1"/>
+      <w:numFmt w:val="bullet"/>
+      <w:lvlText w:val="o"/>
+      <w:lvlJc w:val="left"/>
+      <w:pPr>
+        <w:ind w:left="3600" w:hanging="360"/>
+      </w:pPr>
+      <w:rPr>
+        <w:rFonts w:ascii="Courier New" w:hAnsi="Courier New" w:cs="Courier New" w:hint="default"/>
+      </w:rPr>
+    </w:lvl>
+    <w:lvl w:ilvl="5" w:tplc="08090005" w:tentative="1">
+      <w:start w:val="1"/>
+      <w:numFmt w:val="bullet"/>
+      <w:lvlText w:val=""/>
+      <w:lvlJc w:val="left"/>
+      <w:pPr>
+        <w:ind w:left="4320" w:hanging="360"/>
+      </w:pPr>
+      <w:rPr>
+        <w:rFonts w:ascii="Wingdings" w:hAnsi="Wingdings" w:hint="default"/>
+      </w:rPr>
+    </w:lvl>
+    <w:lvl w:ilvl="6" w:tplc="08090001" w:tentative="1">
+      <w:start w:val="1"/>
+      <w:numFmt w:val="bullet"/>
+      <w:lvlText w:val=""/>
+      <w:lvlJc w:val="left"/>
+      <w:pPr>
+        <w:ind w:left="5040" w:hanging="360"/>
+      </w:pPr>
+      <w:rPr>
+        <w:rFonts w:ascii="Symbol" w:hAnsi="Symbol" w:hint="default"/>
+      </w:rPr>
+    </w:lvl>
+    <w:lvl w:ilvl="7" w:tplc="08090003" w:tentative="1">
+      <w:start w:val="1"/>
+      <w:numFmt w:val="bullet"/>
+      <w:lvlText w:val="o"/>
+      <w:lvlJc w:val="left"/>
+      <w:pPr>
+        <w:ind w:left="5760" w:hanging="360"/>
+      </w:pPr>
+      <w:rPr>
+        <w:rFonts w:ascii="Courier New" w:hAnsi="Courier New" w:cs="Courier New" w:hint="default"/>
+      </w:rPr>
+    </w:lvl>
+    <w:lvl w:ilvl="8" w:tplc="08090005" w:tentative="1">
+      <w:start w:val="1"/>
+      <w:numFmt w:val="bullet"/>
+      <w:lvlText w:val=""/>
+      <w:lvlJc w:val="left"/>
+      <w:pPr>
+        <w:ind w:left="6480" w:hanging="360"/>
+      </w:pPr>
+      <w:rPr>
+        <w:rFonts w:ascii="Wingdings" w:hAnsi="Wingdings" w:hint="default"/>
+      </w:rPr>
+    </w:lvl>
+  </w:abstractNum>
+  <w:abstractNum w:abstractNumId="18" w15:restartNumberingAfterBreak="0">
+    <w:nsid w:val="6C2765B2"/>
+    <w:multiLevelType w:val="hybridMultilevel"/>
+    <w:tmpl w:val="5E52F710"/>
     <w:lvl w:ilvl="0" w:tplc="08090001">
       <w:start w:val="1"/>
       <w:numFmt w:val="bullet"/>
@@ -13388,6 +13687,9 @@
   </w:num>
   <w:num w:numId="18" w16cid:durableId="338697569">
     <w:abstractNumId w:val="16"/>
+  </w:num>
+  <w:num w:numId="19" w16cid:durableId="1976258217">
+    <w:abstractNumId w:val="18"/>
   </w:num>
 </w:numbering>
 </file>
@@ -15508,7 +15810,7 @@
 </file>
 
 <file path=customXml/itemProps1.xml><?xml version="1.0" encoding="utf-8"?>
-<ds:datastoreItem xmlns:ds="http://schemas.openxmlformats.org/officeDocument/2006/customXml" ds:itemID="{A8D05D7E-7E5B-B749-B363-5F70549FC4BD}">
+<ds:datastoreItem xmlns:ds="http://schemas.openxmlformats.org/officeDocument/2006/customXml" ds:itemID="{01F46158-33FC-874D-B575-C154B5A38E6A}">
   <ds:schemaRefs>
     <ds:schemaRef ds:uri="http://schemas.openxmlformats.org/officeDocument/2006/bibliography"/>
   </ds:schemaRefs>

</xml_diff>

<commit_message>
Initial changes for splitting
</commit_message>
<xml_diff>
--- a/ProjectReport.docx
+++ b/ProjectReport.docx
@@ -29,7 +29,15 @@
     <w:sdt>
       <w:sdtPr>
         <w:rPr>
-          <w:rFonts w:asciiTheme="minorHAnsi" w:hAnsiTheme="minorHAnsi"/>
+          <w:rFonts w:asciiTheme="minorHAnsi" w:eastAsiaTheme="minorHAnsi" w:hAnsiTheme="minorHAnsi" w:cstheme="minorBidi"/>
+          <w:b w:val="0"/>
+          <w:bCs w:val="0"/>
+          <w:color w:val="auto"/>
+          <w:kern w:val="2"/>
+          <w:sz w:val="24"/>
+          <w:szCs w:val="24"/>
+          <w:lang w:val="en-IE"/>
+          <w14:ligatures w14:val="standardContextual"/>
         </w:rPr>
         <w:id w:val="852312238"/>
         <w:docPartObj>
@@ -39,14 +47,7 @@
       </w:sdtPr>
       <w:sdtEndPr>
         <w:rPr>
-          <w:rFonts w:eastAsiaTheme="minorHAnsi" w:cstheme="minorBidi"/>
           <w:noProof/>
-          <w:color w:val="auto"/>
-          <w:kern w:val="2"/>
-          <w:sz w:val="24"/>
-          <w:szCs w:val="24"/>
-          <w:lang w:val="en-IE"/>
-          <w14:ligatures w14:val="standardContextual"/>
         </w:rPr>
       </w:sdtEndPr>
       <w:sdtContent>
@@ -852,21 +853,7 @@
                 <w:rStyle w:val="Hyperlink"/>
                 <w:noProof/>
               </w:rPr>
-              <w:t>Data Split / Validation Strategy Repro</w:t>
-            </w:r>
-            <w:r>
-              <w:rPr>
-                <w:rStyle w:val="Hyperlink"/>
-                <w:noProof/>
-              </w:rPr>
-              <w:t>d</w:t>
-            </w:r>
-            <w:r>
-              <w:rPr>
-                <w:rStyle w:val="Hyperlink"/>
-                <w:noProof/>
-              </w:rPr>
-              <w:t>ucibility - TBC</w:t>
+              <w:t>Data Split / Validation Strategy Reproducibility - TBC</w:t>
             </w:r>
             <w:r>
               <w:rPr>
@@ -1432,19 +1419,7 @@
         <w:rPr>
           <w:rFonts w:asciiTheme="minorHAnsi" w:hAnsiTheme="minorHAnsi"/>
         </w:rPr>
-        <w:t>I plan to use the European Flight Delays 2023-2025 dataset from Hugging Face</w:t>
-      </w:r>
-      <w:r>
-        <w:rPr>
-          <w:rFonts w:asciiTheme="minorHAnsi" w:hAnsiTheme="minorHAnsi"/>
-        </w:rPr>
-        <w:t xml:space="preserve"> </w:t>
-      </w:r>
-      <w:r>
-        <w:rPr>
-          <w:rFonts w:asciiTheme="minorHAnsi" w:hAnsiTheme="minorHAnsi"/>
-        </w:rPr>
-        <w:t>be to build a classification system that will predict whether a flight is likely to be delayed by at least 15 minutes based on the departure and destination airports, operator, aircraft type and date etc.</w:t>
+        <w:t>I plan to use the European Flight Delays 2023-2025 dataset from Hugging Face be to build a classification system that will predict whether a flight is likely to be delayed by at least 15 minutes based on the departure and destination airports, operator, aircraft type and date etc.</w:t>
       </w:r>
     </w:p>
     <w:p>
@@ -1466,19 +1441,7 @@
         <w:rPr>
           <w:rFonts w:asciiTheme="minorHAnsi" w:hAnsiTheme="minorHAnsi"/>
         </w:rPr>
-        <w:t xml:space="preserve">This dataset contains </w:t>
-      </w:r>
-      <w:r>
-        <w:rPr>
-          <w:rFonts w:asciiTheme="minorHAnsi" w:hAnsiTheme="minorHAnsi"/>
-        </w:rPr>
-        <w:t xml:space="preserve">around 15 million </w:t>
-      </w:r>
-      <w:r>
-        <w:rPr>
-          <w:rFonts w:asciiTheme="minorHAnsi" w:hAnsiTheme="minorHAnsi"/>
-        </w:rPr>
-        <w:t>per</w:t>
+        <w:t>This dataset contains around 15 million per</w:t>
       </w:r>
       <w:r>
         <w:rPr>
@@ -1524,21 +1487,7 @@
             <w:rStyle w:val="Hyperlink"/>
             <w:rFonts w:asciiTheme="minorHAnsi" w:hAnsiTheme="minorHAnsi"/>
           </w:rPr>
-          <w:t>https://huggingface.co/datasets/345rf4gt56t4r3e3</w:t>
-        </w:r>
-        <w:r>
-          <w:rPr>
-            <w:rStyle w:val="Hyperlink"/>
-            <w:rFonts w:asciiTheme="minorHAnsi" w:hAnsiTheme="minorHAnsi"/>
-          </w:rPr>
-          <w:t>/</w:t>
-        </w:r>
-        <w:r>
-          <w:rPr>
-            <w:rStyle w:val="Hyperlink"/>
-            <w:rFonts w:asciiTheme="minorHAnsi" w:hAnsiTheme="minorHAnsi"/>
-          </w:rPr>
-          <w:t>flight-delays-europe-2023-2025</w:t>
+          <w:t>https://huggingface.co/datasets/345rf4gt56t4r3e3/flight-delays-europe-2023-2025</w:t>
         </w:r>
       </w:hyperlink>
     </w:p>
@@ -2072,7 +2021,6 @@
           <w:numId w:val="4"/>
         </w:numPr>
         <w:spacing w:after="60"/>
-        <w:cnfStyle w:val="100000000000" w:firstRow="1" w:lastRow="0" w:firstColumn="0" w:lastColumn="0" w:oddVBand="0" w:evenVBand="0" w:oddHBand="0" w:evenHBand="0" w:firstRowFirstColumn="0" w:firstRowLastColumn="0" w:lastRowFirstColumn="0" w:lastRowLastColumn="0"/>
         <w:rPr>
           <w:rStyle w:val="BodyTextChar"/>
           <w:rFonts w:asciiTheme="minorHAnsi" w:hAnsiTheme="minorHAnsi"/>
@@ -2103,7 +2051,6 @@
           <w:numId w:val="4"/>
         </w:numPr>
         <w:spacing w:after="60"/>
-        <w:cnfStyle w:val="100000000000" w:firstRow="1" w:lastRow="0" w:firstColumn="0" w:lastColumn="0" w:oddVBand="0" w:evenVBand="0" w:oddHBand="0" w:evenHBand="0" w:firstRowFirstColumn="0" w:firstRowLastColumn="0" w:lastRowFirstColumn="0" w:lastRowLastColumn="0"/>
         <w:rPr>
           <w:rFonts w:asciiTheme="minorHAnsi" w:hAnsiTheme="minorHAnsi"/>
         </w:rPr>
@@ -2125,22 +2072,15 @@
     <w:p>
       <w:pPr>
         <w:pStyle w:val="BodyText"/>
-        <w:cnfStyle w:val="100000000000" w:firstRow="1" w:lastRow="0" w:firstColumn="0" w:lastColumn="0" w:oddVBand="0" w:evenVBand="0" w:oddHBand="0" w:evenHBand="0" w:firstRowFirstColumn="0" w:firstRowLastColumn="0" w:lastRowFirstColumn="0" w:lastRowLastColumn="0"/>
-        <w:rPr>
-          <w:rFonts w:asciiTheme="minorHAnsi" w:hAnsiTheme="minorHAnsi"/>
-        </w:rPr>
-      </w:pPr>
-      <w:r>
-        <w:rPr>
-          <w:rFonts w:asciiTheme="minorHAnsi" w:hAnsiTheme="minorHAnsi"/>
-        </w:rPr>
-        <w:t xml:space="preserve">The raw dataset contains approximately 15 million flight records compressed into a single 787MB Apache Parquet file. </w:t>
-      </w:r>
-      <w:r>
-        <w:rPr>
-          <w:rFonts w:asciiTheme="minorHAnsi" w:hAnsiTheme="minorHAnsi"/>
-        </w:rPr>
-        <w:t xml:space="preserve">The raw data will be retained this format because it is well suited to these type of large analytical datasets as its stores the data efficiently and allows selected columns to be read </w:t>
+        <w:rPr>
+          <w:rFonts w:asciiTheme="minorHAnsi" w:hAnsiTheme="minorHAnsi"/>
+        </w:rPr>
+      </w:pPr>
+      <w:r>
+        <w:rPr>
+          <w:rFonts w:asciiTheme="minorHAnsi" w:hAnsiTheme="minorHAnsi"/>
+        </w:rPr>
+        <w:t xml:space="preserve">The raw dataset contains approximately 15 million flight records compressed into a single 787MB Apache Parquet file. The raw data will be retained this format because it is well suited to these type of large analytical datasets as its stores the data efficiently and allows selected columns to be read </w:t>
       </w:r>
       <w:r>
         <w:rPr>
@@ -2153,7 +2093,6 @@
     <w:p>
       <w:pPr>
         <w:pStyle w:val="BodyText"/>
-        <w:cnfStyle w:val="100000000000" w:firstRow="1" w:lastRow="0" w:firstColumn="0" w:lastColumn="0" w:oddVBand="0" w:evenVBand="0" w:oddHBand="0" w:evenHBand="0" w:firstRowFirstColumn="0" w:firstRowLastColumn="0" w:lastRowFirstColumn="0" w:lastRowLastColumn="0"/>
         <w:rPr>
           <w:rFonts w:asciiTheme="minorHAnsi" w:hAnsiTheme="minorHAnsi"/>
         </w:rPr>
@@ -2180,7 +2119,6 @@
     <w:p>
       <w:pPr>
         <w:pStyle w:val="BodyText"/>
-        <w:cnfStyle w:val="100000000000" w:firstRow="1" w:lastRow="0" w:firstColumn="0" w:lastColumn="0" w:oddVBand="0" w:evenVBand="0" w:oddHBand="0" w:evenHBand="0" w:firstRowFirstColumn="0" w:firstRowLastColumn="0" w:lastRowFirstColumn="0" w:lastRowLastColumn="0"/>
         <w:rPr>
           <w:rFonts w:asciiTheme="minorHAnsi" w:hAnsiTheme="minorHAnsi"/>
         </w:rPr>
@@ -2225,7 +2163,6 @@
     <w:p>
       <w:pPr>
         <w:pStyle w:val="BodyText"/>
-        <w:cnfStyle w:val="100000000000" w:firstRow="1" w:lastRow="0" w:firstColumn="0" w:lastColumn="0" w:oddVBand="0" w:evenVBand="0" w:oddHBand="0" w:evenHBand="0" w:firstRowFirstColumn="0" w:firstRowLastColumn="0" w:lastRowFirstColumn="0" w:lastRowLastColumn="0"/>
         <w:rPr>
           <w:rFonts w:asciiTheme="minorHAnsi" w:hAnsiTheme="minorHAnsi"/>
         </w:rPr>
@@ -2407,7 +2344,6 @@
       <w:pPr>
         <w:pStyle w:val="Compact"/>
         <w:spacing w:after="60"/>
-        <w:cnfStyle w:val="100000000000" w:firstRow="1" w:lastRow="0" w:firstColumn="0" w:lastColumn="0" w:oddVBand="0" w:evenVBand="0" w:oddHBand="0" w:evenHBand="0" w:firstRowFirstColumn="0" w:firstRowLastColumn="0" w:lastRowFirstColumn="0" w:lastRowLastColumn="0"/>
         <w:rPr>
           <w:rFonts w:asciiTheme="minorHAnsi" w:hAnsiTheme="minorHAnsi"/>
         </w:rPr>
@@ -2431,7 +2367,6 @@
       <w:pPr>
         <w:pStyle w:val="Compact"/>
         <w:spacing w:after="60"/>
-        <w:cnfStyle w:val="100000000000" w:firstRow="1" w:lastRow="0" w:firstColumn="0" w:lastColumn="0" w:oddVBand="0" w:evenVBand="0" w:oddHBand="0" w:evenHBand="0" w:firstRowFirstColumn="0" w:firstRowLastColumn="0" w:lastRowFirstColumn="0" w:lastRowLastColumn="0"/>
         <w:rPr>
           <w:rFonts w:asciiTheme="minorHAnsi" w:hAnsiTheme="minorHAnsi"/>
         </w:rPr>
@@ -2577,51 +2512,7 @@
         <w:rPr>
           <w:lang w:val="en-US"/>
         </w:rPr>
-        <w:t xml:space="preserve">Note: As most users will only have read access to the existing bucket </w:t>
-      </w:r>
-      <w:r>
-        <w:rPr>
-          <w:lang w:val="en-US"/>
-        </w:rPr>
-        <w:t xml:space="preserve">referenced </w:t>
-      </w:r>
-      <w:r>
-        <w:rPr>
-          <w:lang w:val="en-US"/>
-        </w:rPr>
-        <w:t xml:space="preserve">not all steps in the notebooks will work as expected. If you wish to run all </w:t>
-      </w:r>
-      <w:proofErr w:type="gramStart"/>
-      <w:r>
-        <w:rPr>
-          <w:lang w:val="en-US"/>
-        </w:rPr>
-        <w:t>steps</w:t>
-      </w:r>
-      <w:proofErr w:type="gramEnd"/>
-      <w:r>
-        <w:rPr>
-          <w:lang w:val="en-US"/>
-        </w:rPr>
-        <w:t xml:space="preserve"> please update the</w:t>
-      </w:r>
-      <w:r>
-        <w:rPr>
-          <w:lang w:val="en-US"/>
-        </w:rPr>
-        <w:t xml:space="preserve"> following configuration variables in Step 2 to one of your Google Cloud</w:t>
-      </w:r>
-      <w:r>
-        <w:rPr>
-          <w:lang w:val="en-US"/>
-        </w:rPr>
-        <w:t xml:space="preserve"> </w:t>
-      </w:r>
-      <w:r>
-        <w:rPr>
-          <w:lang w:val="en-US"/>
-        </w:rPr>
-        <w:t>projects instead</w:t>
+        <w:t>Note: As most users will only have read access to the existing bucket referenced not all steps in the notebooks will work as expected. If you wish to run all steps please update the following configuration variables in Step 2 to one of your Google Cloud projects instead</w:t>
       </w:r>
     </w:p>
     <w:p>
@@ -2874,43 +2765,7 @@
                   <w:color w:val="auto"/>
                   <w:u w:val="none"/>
                 </w:rPr>
-                <w:t>https://storage.googleapis.com/european-flight-delay-prediction/raw/merged_flights_wit</w:t>
-              </w:r>
-              <w:r>
-                <w:rPr>
-                  <w:rStyle w:val="Hyperlink"/>
-                  <w:rFonts w:asciiTheme="minorHAnsi" w:hAnsiTheme="minorHAnsi"/>
-                  <w:color w:val="auto"/>
-                  <w:u w:val="none"/>
-                </w:rPr>
-                <w:t>h</w:t>
-              </w:r>
-              <w:r>
-                <w:rPr>
-                  <w:rStyle w:val="Hyperlink"/>
-                  <w:rFonts w:asciiTheme="minorHAnsi" w:hAnsiTheme="minorHAnsi"/>
-                  <w:color w:val="auto"/>
-                  <w:u w:val="none"/>
-                </w:rPr>
-                <w:t>_delay_2023_202</w:t>
-              </w:r>
-              <w:r>
-                <w:rPr>
-                  <w:rStyle w:val="Hyperlink"/>
-                  <w:rFonts w:asciiTheme="minorHAnsi" w:hAnsiTheme="minorHAnsi"/>
-                  <w:color w:val="auto"/>
-                  <w:u w:val="none"/>
-                </w:rPr>
-                <w:t>5</w:t>
-              </w:r>
-              <w:r>
-                <w:rPr>
-                  <w:rStyle w:val="Hyperlink"/>
-                  <w:rFonts w:asciiTheme="minorHAnsi" w:hAnsiTheme="minorHAnsi"/>
-                  <w:color w:val="auto"/>
-                  <w:u w:val="none"/>
-                </w:rPr>
-                <w:t>.parquet</w:t>
+                <w:t>https://storage.googleapis.com/european-flight-delay-prediction/raw/merged_flights_with_delay_2023_2025.parquet</w:t>
               </w:r>
             </w:hyperlink>
           </w:p>
@@ -3146,21 +3001,7 @@
           <w:rFonts w:asciiTheme="minorHAnsi" w:hAnsiTheme="minorHAnsi"/>
           <w:lang w:val="en-US"/>
         </w:rPr>
-        <w:t>2</w:t>
-      </w:r>
-      <w:r>
-        <w:rPr>
-          <w:rFonts w:asciiTheme="minorHAnsi" w:hAnsiTheme="minorHAnsi"/>
-          <w:lang w:val="en-US"/>
-        </w:rPr>
-        <w:t xml:space="preserve">. </w:t>
-      </w:r>
-      <w:r>
-        <w:rPr>
-          <w:rFonts w:asciiTheme="minorHAnsi" w:hAnsiTheme="minorHAnsi"/>
-          <w:lang w:val="en-US"/>
-        </w:rPr>
-        <w:t xml:space="preserve">Processed Data Storage &amp; File </w:t>
+        <w:t xml:space="preserve">2. Processed Data Storage &amp; File </w:t>
       </w:r>
       <w:r>
         <w:rPr>
@@ -3208,37 +3049,7 @@
         <w:rPr>
           <w:rFonts w:asciiTheme="minorHAnsi" w:hAnsiTheme="minorHAnsi"/>
         </w:rPr>
-        <w:t>As the</w:t>
-      </w:r>
-      <w:r>
-        <w:rPr>
-          <w:rFonts w:asciiTheme="minorHAnsi" w:hAnsiTheme="minorHAnsi"/>
-        </w:rPr>
-        <w:t xml:space="preserve"> raw dataset </w:t>
-      </w:r>
-      <w:r>
-        <w:rPr>
-          <w:rFonts w:asciiTheme="minorHAnsi" w:hAnsiTheme="minorHAnsi"/>
-        </w:rPr>
-        <w:t>is very large with</w:t>
-      </w:r>
-      <w:r>
-        <w:rPr>
-          <w:rFonts w:asciiTheme="minorHAnsi" w:hAnsiTheme="minorHAnsi"/>
-        </w:rPr>
-        <w:t xml:space="preserve"> approximately 15 million records</w:t>
-      </w:r>
-      <w:r>
-        <w:rPr>
-          <w:rFonts w:asciiTheme="minorHAnsi" w:hAnsiTheme="minorHAnsi"/>
-        </w:rPr>
-        <w:t xml:space="preserve"> a</w:t>
-      </w:r>
-      <w:r>
-        <w:rPr>
-          <w:rFonts w:asciiTheme="minorHAnsi" w:hAnsiTheme="minorHAnsi"/>
-        </w:rPr>
-        <w:t xml:space="preserve"> smaller representative </w:t>
+        <w:t xml:space="preserve">As the raw dataset is very large with approximately 15 million records a smaller representative </w:t>
       </w:r>
       <w:r>
         <w:rPr>
@@ -3262,19 +3073,7 @@
         <w:rPr>
           <w:rFonts w:asciiTheme="minorHAnsi" w:hAnsiTheme="minorHAnsi"/>
         </w:rPr>
-        <w:t xml:space="preserve">will </w:t>
-      </w:r>
-      <w:r>
-        <w:rPr>
-          <w:rFonts w:asciiTheme="minorHAnsi" w:hAnsiTheme="minorHAnsi"/>
-        </w:rPr>
-        <w:t xml:space="preserve">be </w:t>
-      </w:r>
-      <w:r>
-        <w:rPr>
-          <w:rFonts w:asciiTheme="minorHAnsi" w:hAnsiTheme="minorHAnsi"/>
-        </w:rPr>
-        <w:t>created</w:t>
+        <w:t>will be created</w:t>
       </w:r>
       <w:r>
         <w:rPr>
@@ -3354,14 +3153,7 @@
           <w:rFonts w:asciiTheme="minorHAnsi" w:hAnsiTheme="minorHAnsi"/>
           <w:color w:val="000000" w:themeColor="text1"/>
         </w:rPr>
-        <w:t xml:space="preserve">- </w:t>
-      </w:r>
-      <w:r>
-        <w:rPr>
-          <w:rFonts w:asciiTheme="minorHAnsi" w:hAnsiTheme="minorHAnsi"/>
-          <w:color w:val="000000" w:themeColor="text1"/>
-        </w:rPr>
-        <w:t>gs://european-flight-delay-prediction/processed/flights_downsampled_100k.parquet</w:t>
+        <w:t>- gs://european-flight-delay-prediction/processed/flights_downsampled_100k.parquet</w:t>
       </w:r>
     </w:p>
     <w:p>
@@ -3415,21 +3207,7 @@
           <w:rFonts w:asciiTheme="minorHAnsi" w:hAnsiTheme="minorHAnsi"/>
           <w:lang w:val="en-US"/>
         </w:rPr>
-        <w:t>3</w:t>
-      </w:r>
-      <w:r>
-        <w:rPr>
-          <w:rFonts w:asciiTheme="minorHAnsi" w:hAnsiTheme="minorHAnsi"/>
-          <w:lang w:val="en-US"/>
-        </w:rPr>
-        <w:t xml:space="preserve">. </w:t>
-      </w:r>
-      <w:r>
-        <w:rPr>
-          <w:rFonts w:asciiTheme="minorHAnsi" w:hAnsiTheme="minorHAnsi"/>
-          <w:lang w:val="en-US"/>
-        </w:rPr>
-        <w:t>Database / Object Storage Decision</w:t>
+        <w:t>3. Database / Object Storage Decision</w:t>
       </w:r>
       <w:r>
         <w:rPr>
@@ -3751,21 +3529,7 @@
           <w:lang w:val="en-US"/>
         </w:rPr>
         <w:lastRenderedPageBreak/>
-        <w:t>4</w:t>
-      </w:r>
-      <w:r>
-        <w:rPr>
-          <w:rFonts w:asciiTheme="minorHAnsi" w:hAnsiTheme="minorHAnsi"/>
-          <w:lang w:val="en-US"/>
-        </w:rPr>
-        <w:t>.</w:t>
-      </w:r>
-      <w:r>
-        <w:rPr>
-          <w:rFonts w:asciiTheme="minorHAnsi" w:hAnsiTheme="minorHAnsi"/>
-          <w:lang w:val="en-US"/>
-        </w:rPr>
-        <w:t xml:space="preserve"> Data Versioning</w:t>
+        <w:t>4. Data Versioning</w:t>
       </w:r>
       <w:bookmarkEnd w:id="7"/>
     </w:p>
@@ -3897,6 +3661,7 @@
       </w:pPr>
       <w:r>
         <w:rPr>
+          <w:noProof/>
           <w:lang w:val="en-US"/>
         </w:rPr>
         <w:drawing>
@@ -3963,21 +3728,7 @@
           <w:rFonts w:asciiTheme="minorHAnsi" w:hAnsiTheme="minorHAnsi"/>
           <w:lang w:val="en-US"/>
         </w:rPr>
-        <w:t>5</w:t>
-      </w:r>
-      <w:r>
-        <w:rPr>
-          <w:rFonts w:asciiTheme="minorHAnsi" w:hAnsiTheme="minorHAnsi"/>
-          <w:lang w:val="en-US"/>
-        </w:rPr>
-        <w:t xml:space="preserve">. </w:t>
-      </w:r>
-      <w:r>
-        <w:rPr>
-          <w:rFonts w:asciiTheme="minorHAnsi" w:hAnsiTheme="minorHAnsi"/>
-          <w:lang w:val="en-US"/>
-        </w:rPr>
-        <w:t>Data Access</w:t>
+        <w:t>5. Data Access</w:t>
       </w:r>
       <w:bookmarkEnd w:id="8"/>
     </w:p>
@@ -4444,19 +4195,7 @@
               <w:rPr>
                 <w:rFonts w:asciiTheme="minorHAnsi" w:hAnsiTheme="minorHAnsi"/>
               </w:rPr>
-              <w:t xml:space="preserve"> downsampling notebook and stored back </w:t>
-            </w:r>
-            <w:r>
-              <w:rPr>
-                <w:rFonts w:asciiTheme="minorHAnsi" w:hAnsiTheme="minorHAnsi"/>
-              </w:rPr>
-              <w:t>in</w:t>
-            </w:r>
-            <w:r>
-              <w:rPr>
-                <w:rFonts w:asciiTheme="minorHAnsi" w:hAnsiTheme="minorHAnsi"/>
-              </w:rPr>
-              <w:t xml:space="preserve"> GCS</w:t>
+              <w:t xml:space="preserve"> downsampling notebook and stored back in GCS</w:t>
             </w:r>
           </w:p>
           <w:p>
@@ -4492,21 +4231,7 @@
           <w:lang w:val="en-US"/>
         </w:rPr>
         <w:lastRenderedPageBreak/>
-        <w:t>6</w:t>
-      </w:r>
-      <w:r>
-        <w:rPr>
-          <w:rFonts w:asciiTheme="minorHAnsi" w:hAnsiTheme="minorHAnsi"/>
-          <w:lang w:val="en-US"/>
-        </w:rPr>
-        <w:t xml:space="preserve">. </w:t>
-      </w:r>
-      <w:r>
-        <w:rPr>
-          <w:rFonts w:asciiTheme="minorHAnsi" w:hAnsiTheme="minorHAnsi"/>
-          <w:lang w:val="en-US"/>
-        </w:rPr>
-        <w:t>Data Split / Validation Strategy</w:t>
+        <w:t>6. Data Split / Validation Strategy</w:t>
       </w:r>
       <w:bookmarkEnd w:id="9"/>
     </w:p>
@@ -5408,21 +5133,7 @@
           <w:rFonts w:asciiTheme="minorHAnsi" w:hAnsiTheme="minorHAnsi"/>
           <w:lang w:val="en-US"/>
         </w:rPr>
-        <w:t>7</w:t>
-      </w:r>
-      <w:r>
-        <w:rPr>
-          <w:rFonts w:asciiTheme="minorHAnsi" w:hAnsiTheme="minorHAnsi"/>
-          <w:lang w:val="en-US"/>
-        </w:rPr>
-        <w:t xml:space="preserve">. </w:t>
-      </w:r>
-      <w:r>
-        <w:rPr>
-          <w:rFonts w:asciiTheme="minorHAnsi" w:hAnsiTheme="minorHAnsi"/>
-          <w:lang w:val="en-US"/>
-        </w:rPr>
-        <w:t>Feature Description</w:t>
+        <w:t>7. Feature Description</w:t>
       </w:r>
       <w:bookmarkEnd w:id="11"/>
     </w:p>
@@ -5891,19 +5602,7 @@
               <w:rPr>
                 <w:rFonts w:asciiTheme="minorHAnsi" w:hAnsiTheme="minorHAnsi"/>
               </w:rPr>
-              <w:t xml:space="preserve">Some </w:t>
-            </w:r>
-            <w:r>
-              <w:rPr>
-                <w:rFonts w:asciiTheme="minorHAnsi" w:hAnsiTheme="minorHAnsi"/>
-              </w:rPr>
-              <w:t>airports</w:t>
-            </w:r>
-            <w:r>
-              <w:rPr>
-                <w:rFonts w:asciiTheme="minorHAnsi" w:hAnsiTheme="minorHAnsi"/>
-              </w:rPr>
-              <w:t xml:space="preserve"> may have higher or lower delay patterns</w:t>
+              <w:t>Some airports may have higher or lower delay patterns</w:t>
             </w:r>
           </w:p>
         </w:tc>
@@ -6306,21 +6005,7 @@
           <w:rFonts w:asciiTheme="minorHAnsi" w:hAnsiTheme="minorHAnsi"/>
           <w:lang w:val="en-US"/>
         </w:rPr>
-        <w:t>8</w:t>
-      </w:r>
-      <w:r>
-        <w:rPr>
-          <w:rFonts w:asciiTheme="minorHAnsi" w:hAnsiTheme="minorHAnsi"/>
-          <w:lang w:val="en-US"/>
-        </w:rPr>
-        <w:t xml:space="preserve">. </w:t>
-      </w:r>
-      <w:r>
-        <w:rPr>
-          <w:rFonts w:asciiTheme="minorHAnsi" w:hAnsiTheme="minorHAnsi"/>
-          <w:lang w:val="en-US"/>
-        </w:rPr>
-        <w:t>Data Types and Formats</w:t>
+        <w:t>8. Data Types and Formats</w:t>
       </w:r>
       <w:bookmarkEnd w:id="12"/>
     </w:p>
@@ -6529,19 +6214,7 @@
         <w:rPr>
           <w:rFonts w:asciiTheme="minorHAnsi" w:hAnsiTheme="minorHAnsi"/>
         </w:rPr>
-        <w:t>The following table identifies the main fields currently expected to be used for identification, sampling, analysis, feature engineering, or modelling.</w:t>
-      </w:r>
-      <w:r>
-        <w:rPr>
-          <w:rFonts w:asciiTheme="minorHAnsi" w:hAnsiTheme="minorHAnsi"/>
-        </w:rPr>
-        <w:t xml:space="preserve"> </w:t>
-      </w:r>
-      <w:r>
-        <w:rPr>
-          <w:rFonts w:asciiTheme="minorHAnsi" w:hAnsiTheme="minorHAnsi"/>
-        </w:rPr>
-        <w:t>Some fields are marked as candidate predictors because they may be useful for predicting whether a flight is delayed</w:t>
+        <w:t>The following table identifies the main fields currently expected to be used for identification, sampling, analysis, feature engineering, or modelling. Some fields are marked as candidate predictors because they may be useful for predicting whether a flight is delayed</w:t>
       </w:r>
     </w:p>
     <w:tbl>
@@ -6756,7 +6429,6 @@
             <w:pPr>
               <w:pStyle w:val="BodyText"/>
               <w:rPr>
-                <w:rStyle w:val="TOC2"/>
                 <w:rFonts w:asciiTheme="minorHAnsi" w:hAnsiTheme="minorHAnsi"/>
               </w:rPr>
             </w:pPr>
@@ -6839,7 +6511,6 @@
             <w:pPr>
               <w:pStyle w:val="BodyText"/>
               <w:rPr>
-                <w:rStyle w:val="TOC2"/>
                 <w:rFonts w:asciiTheme="minorHAnsi" w:hAnsiTheme="minorHAnsi"/>
               </w:rPr>
             </w:pPr>
@@ -6922,7 +6593,6 @@
             <w:pPr>
               <w:pStyle w:val="BodyText"/>
               <w:rPr>
-                <w:rStyle w:val="TOC2"/>
                 <w:rFonts w:asciiTheme="minorHAnsi" w:hAnsiTheme="minorHAnsi"/>
               </w:rPr>
             </w:pPr>
@@ -7005,7 +6675,6 @@
             <w:pPr>
               <w:pStyle w:val="BodyText"/>
               <w:rPr>
-                <w:rStyle w:val="TOC2"/>
                 <w:rFonts w:asciiTheme="minorHAnsi" w:hAnsiTheme="minorHAnsi"/>
               </w:rPr>
             </w:pPr>
@@ -7088,7 +6757,6 @@
             <w:pPr>
               <w:pStyle w:val="BodyText"/>
               <w:rPr>
-                <w:rStyle w:val="TOC2"/>
                 <w:rFonts w:asciiTheme="minorHAnsi" w:hAnsiTheme="minorHAnsi"/>
               </w:rPr>
             </w:pPr>
@@ -7171,7 +6839,6 @@
             <w:pPr>
               <w:pStyle w:val="BodyText"/>
               <w:rPr>
-                <w:rStyle w:val="TOC2"/>
                 <w:rFonts w:asciiTheme="minorHAnsi" w:hAnsiTheme="minorHAnsi"/>
               </w:rPr>
             </w:pPr>
@@ -7254,7 +6921,6 @@
             <w:pPr>
               <w:pStyle w:val="BodyText"/>
               <w:rPr>
-                <w:rStyle w:val="TOC2"/>
                 <w:rFonts w:asciiTheme="minorHAnsi" w:hAnsiTheme="minorHAnsi"/>
               </w:rPr>
             </w:pPr>
@@ -7337,7 +7003,6 @@
             <w:pPr>
               <w:pStyle w:val="BodyText"/>
               <w:rPr>
-                <w:rStyle w:val="TOC2"/>
                 <w:rFonts w:asciiTheme="minorHAnsi" w:hAnsiTheme="minorHAnsi"/>
               </w:rPr>
             </w:pPr>
@@ -7420,7 +7085,6 @@
             <w:pPr>
               <w:pStyle w:val="BodyText"/>
               <w:rPr>
-                <w:rStyle w:val="TOC2"/>
                 <w:rFonts w:asciiTheme="minorHAnsi" w:hAnsiTheme="minorHAnsi"/>
               </w:rPr>
             </w:pPr>
@@ -7503,7 +7167,6 @@
             <w:pPr>
               <w:pStyle w:val="BodyText"/>
               <w:rPr>
-                <w:rStyle w:val="TOC2"/>
                 <w:rFonts w:asciiTheme="minorHAnsi" w:hAnsiTheme="minorHAnsi"/>
               </w:rPr>
             </w:pPr>
@@ -7586,7 +7249,6 @@
             <w:pPr>
               <w:pStyle w:val="BodyText"/>
               <w:rPr>
-                <w:rStyle w:val="TOC2"/>
                 <w:rFonts w:asciiTheme="minorHAnsi" w:hAnsiTheme="minorHAnsi"/>
               </w:rPr>
             </w:pPr>
@@ -7822,7 +7484,6 @@
             <w:pPr>
               <w:pStyle w:val="BodyText"/>
               <w:rPr>
-                <w:rStyle w:val="TOC2"/>
                 <w:rFonts w:asciiTheme="minorHAnsi" w:hAnsiTheme="minorHAnsi"/>
               </w:rPr>
             </w:pPr>
@@ -7975,13 +7636,7 @@
               <w:rPr>
                 <w:rFonts w:asciiTheme="minorHAnsi" w:hAnsiTheme="minorHAnsi"/>
               </w:rPr>
-              <w:t>38.97%</w:t>
-            </w:r>
-            <w:r>
-              <w:rPr>
-                <w:rFonts w:asciiTheme="minorHAnsi" w:hAnsiTheme="minorHAnsi"/>
-              </w:rPr>
-              <w:t xml:space="preserve"> rows have missing data for this field</w:t>
+              <w:t>38.97% rows have missing data for this field</w:t>
             </w:r>
           </w:p>
         </w:tc>
@@ -8065,19 +7720,7 @@
               <w:rPr>
                 <w:rFonts w:asciiTheme="minorHAnsi" w:hAnsiTheme="minorHAnsi"/>
               </w:rPr>
-              <w:t>3</w:t>
-            </w:r>
-            <w:r>
-              <w:rPr>
-                <w:rFonts w:asciiTheme="minorHAnsi" w:hAnsiTheme="minorHAnsi"/>
-              </w:rPr>
-              <w:t>0.3</w:t>
-            </w:r>
-            <w:r>
-              <w:rPr>
-                <w:rFonts w:asciiTheme="minorHAnsi" w:hAnsiTheme="minorHAnsi"/>
-              </w:rPr>
-              <w:t>% rows have missing data for this field</w:t>
+              <w:t>30.3% rows have missing data for this field</w:t>
             </w:r>
           </w:p>
         </w:tc>
@@ -8161,13 +7804,7 @@
               <w:rPr>
                 <w:rFonts w:asciiTheme="minorHAnsi" w:hAnsiTheme="minorHAnsi"/>
               </w:rPr>
-              <w:t>14.77</w:t>
-            </w:r>
-            <w:r>
-              <w:rPr>
-                <w:rFonts w:asciiTheme="minorHAnsi" w:hAnsiTheme="minorHAnsi"/>
-              </w:rPr>
-              <w:t>% rows have missing data for this field</w:t>
+              <w:t>14.77% rows have missing data for this field</w:t>
             </w:r>
           </w:p>
         </w:tc>
@@ -8182,7 +7819,6 @@
             <w:pPr>
               <w:pStyle w:val="BodyText"/>
               <w:rPr>
-                <w:rStyle w:val="TOC2"/>
                 <w:rFonts w:asciiTheme="minorHAnsi" w:hAnsiTheme="minorHAnsi"/>
               </w:rPr>
             </w:pPr>
@@ -8265,7 +7901,6 @@
             <w:pPr>
               <w:pStyle w:val="BodyText"/>
               <w:rPr>
-                <w:rStyle w:val="TOC2"/>
                 <w:rFonts w:asciiTheme="minorHAnsi" w:hAnsiTheme="minorHAnsi"/>
               </w:rPr>
             </w:pPr>
@@ -8348,7 +7983,6 @@
             <w:pPr>
               <w:pStyle w:val="BodyText"/>
               <w:rPr>
-                <w:rStyle w:val="TOC2"/>
                 <w:rFonts w:asciiTheme="minorHAnsi" w:hAnsiTheme="minorHAnsi"/>
               </w:rPr>
             </w:pPr>
@@ -8431,7 +8065,6 @@
             <w:pPr>
               <w:pStyle w:val="BodyText"/>
               <w:rPr>
-                <w:rStyle w:val="TOC2"/>
                 <w:rFonts w:asciiTheme="minorHAnsi" w:hAnsiTheme="minorHAnsi"/>
               </w:rPr>
             </w:pPr>
@@ -8514,7 +8147,6 @@
             <w:pPr>
               <w:pStyle w:val="BodyText"/>
               <w:rPr>
-                <w:rStyle w:val="TOC2"/>
                 <w:rFonts w:asciiTheme="minorHAnsi" w:hAnsiTheme="minorHAnsi"/>
               </w:rPr>
             </w:pPr>
@@ -8597,7 +8229,6 @@
             <w:pPr>
               <w:pStyle w:val="BodyText"/>
               <w:rPr>
-                <w:rStyle w:val="TOC2"/>
                 <w:rFonts w:asciiTheme="minorHAnsi" w:hAnsiTheme="minorHAnsi"/>
               </w:rPr>
             </w:pPr>
@@ -8680,7 +8311,6 @@
             <w:pPr>
               <w:pStyle w:val="BodyText"/>
               <w:rPr>
-                <w:rStyle w:val="TOC2"/>
                 <w:rFonts w:asciiTheme="minorHAnsi" w:hAnsiTheme="minorHAnsi"/>
               </w:rPr>
             </w:pPr>
@@ -8763,7 +8393,6 @@
             <w:pPr>
               <w:pStyle w:val="BodyText"/>
               <w:rPr>
-                <w:rStyle w:val="TOC2"/>
                 <w:rFonts w:asciiTheme="minorHAnsi" w:hAnsiTheme="minorHAnsi"/>
               </w:rPr>
             </w:pPr>
@@ -8880,21 +8509,7 @@
           <w:rFonts w:asciiTheme="minorHAnsi" w:hAnsiTheme="minorHAnsi"/>
           <w:lang w:val="en-US"/>
         </w:rPr>
-        <w:t>9</w:t>
-      </w:r>
-      <w:r>
-        <w:rPr>
-          <w:rFonts w:asciiTheme="minorHAnsi" w:hAnsiTheme="minorHAnsi"/>
-          <w:lang w:val="en-US"/>
-        </w:rPr>
-        <w:t xml:space="preserve">. </w:t>
-      </w:r>
-      <w:r>
-        <w:rPr>
-          <w:rFonts w:asciiTheme="minorHAnsi" w:hAnsiTheme="minorHAnsi"/>
-          <w:lang w:val="en-US"/>
-        </w:rPr>
-        <w:t>Reproducibility of Pre-Processing</w:t>
+        <w:t>9. Reproducibility of Pre-Processing</w:t>
       </w:r>
       <w:bookmarkEnd w:id="13"/>
     </w:p>
@@ -9243,13 +8858,7 @@
         <w:rPr>
           <w:rFonts w:asciiTheme="minorHAnsi" w:hAnsiTheme="minorHAnsi"/>
         </w:rPr>
-        <w:t>more detail o</w:t>
-      </w:r>
-      <w:r>
-        <w:rPr>
-          <w:rFonts w:asciiTheme="minorHAnsi" w:hAnsiTheme="minorHAnsi"/>
-        </w:rPr>
-        <w:t>n the</w:t>
+        <w:t>more detail on the</w:t>
       </w:r>
       <w:r>
         <w:rPr>
@@ -9261,13 +8870,7 @@
         <w:rPr>
           <w:rFonts w:asciiTheme="minorHAnsi" w:hAnsiTheme="minorHAnsi"/>
         </w:rPr>
-        <w:t xml:space="preserve"> analysis and strata identification </w:t>
-      </w:r>
-      <w:r>
-        <w:rPr>
-          <w:rFonts w:asciiTheme="minorHAnsi" w:hAnsiTheme="minorHAnsi"/>
-        </w:rPr>
-        <w:t>in the sections below and the reproducibility section which has the notebook details that can be used to reproduce all of this.</w:t>
+        <w:t xml:space="preserve"> analysis and strata identification in the sections below and the reproducibility section which has the notebook details that can be used to reproduce all of this.</w:t>
       </w:r>
     </w:p>
     <w:p>
@@ -9767,13 +9370,7 @@
               <w:rPr>
                 <w:rFonts w:asciiTheme="minorHAnsi" w:hAnsiTheme="minorHAnsi"/>
               </w:rPr>
-              <w:t>N</w:t>
-            </w:r>
-            <w:r>
-              <w:rPr>
-                <w:rFonts w:asciiTheme="minorHAnsi" w:hAnsiTheme="minorHAnsi"/>
-              </w:rPr>
-              <w:t>ote the class imbalance here, only 8.36% of flights are delayed by at least 15 minutes</w:t>
+              <w:t>Note the class imbalance here, only 8.36% of flights are delayed by at least 15 minutes</w:t>
             </w:r>
           </w:p>
           <w:p>
@@ -10871,14 +10468,7 @@
           <w:rFonts w:asciiTheme="minorHAnsi" w:hAnsiTheme="minorHAnsi"/>
           <w:lang w:val="en-US"/>
         </w:rPr>
-        <w:t xml:space="preserve"> </w:t>
-      </w:r>
-      <w:r>
-        <w:rPr>
-          <w:rFonts w:asciiTheme="minorHAnsi" w:hAnsiTheme="minorHAnsi"/>
-          <w:lang w:val="en-US"/>
-        </w:rPr>
-        <w:t>Reproducibility</w:t>
+        <w:t xml:space="preserve"> Reproducibility</w:t>
       </w:r>
       <w:bookmarkEnd w:id="16"/>
     </w:p>
@@ -10967,23 +10557,7 @@
           <w:color w:val="000000" w:themeColor="text1"/>
           <w:lang w:val="en-US"/>
         </w:rPr>
-        <w:t xml:space="preserve">Note: As most users will only have read access to the existing bucket referenced not all steps in the notebooks will work as expected. If you wish to run all </w:t>
-      </w:r>
-      <w:proofErr w:type="gramStart"/>
-      <w:r>
-        <w:rPr>
-          <w:color w:val="000000" w:themeColor="text1"/>
-          <w:lang w:val="en-US"/>
-        </w:rPr>
-        <w:t>steps</w:t>
-      </w:r>
-      <w:proofErr w:type="gramEnd"/>
-      <w:r>
-        <w:rPr>
-          <w:color w:val="000000" w:themeColor="text1"/>
-          <w:lang w:val="en-US"/>
-        </w:rPr>
-        <w:t xml:space="preserve"> please update the following configuration variables in Step 2 to one of your Google Cloud projects instead</w:t>
+        <w:t>Note: As most users will only have read access to the existing bucket referenced not all steps in the notebooks will work as expected. If you wish to run all steps please update the following configuration variables in Step 2 to one of your Google Cloud projects instead</w:t>
       </w:r>
     </w:p>
     <w:p>
@@ -11276,13 +10850,7 @@
               <w:rPr>
                 <w:rFonts w:asciiTheme="minorHAnsi" w:hAnsiTheme="minorHAnsi"/>
               </w:rPr>
-              <w:t xml:space="preserve">Cloud Storage URI - </w:t>
-            </w:r>
-            <w:r>
-              <w:rPr>
-                <w:rFonts w:asciiTheme="minorHAnsi" w:hAnsiTheme="minorHAnsi"/>
-              </w:rPr>
-              <w:t>gs://european-flight-delay-prediction/processed/flights_downsampled_100k.parquet</w:t>
+              <w:t>Cloud Storage URI - gs://european-flight-delay-prediction/processed/flights_downsampled_100k.parquet</w:t>
             </w:r>
           </w:p>
         </w:tc>
@@ -14295,6 +13863,7 @@
   <w:style w:type="character" w:default="1" w:styleId="DefaultParagraphFont">
     <w:name w:val="Default Paragraph Font"/>
     <w:uiPriority w:val="1"/>
+    <w:semiHidden/>
     <w:unhideWhenUsed/>
   </w:style>
   <w:style w:type="table" w:default="1" w:styleId="TableNormal">
@@ -15457,7 +15026,9 @@
     </w:pPr>
     <w:rPr>
       <w:kern w:val="0"/>
-      <w:lang w:val="en-US"/>
+      <w:sz w:val="20"/>
+      <w:szCs w:val="20"/>
+      <w:lang w:val="en-US" w:eastAsia="en-GB"/>
       <w14:ligatures w14:val="none"/>
     </w:rPr>
     <w:tblPr>

</xml_diff>